<commit_message>
Justify Plotly, correct data source description and refresh report
- TECHNOLOGY.md: add Plotly with the alternatives considered
- README: Open-Meteo is ERA5/ERA5-Land up to 2016 and ECMWF IFS from 2017
- CHANGELOG: describe the web UI in 0.1.0
- Report: update Table 2 and the statements made stale by the UI rework
</commit_message>
<xml_diff>
--- a/docs/report/Assignment3_Report.docx
+++ b/docs/report/Assignment3_Report.docx
@@ -1,6 +1,6 @@
 
 <file path=word/document.xml><?xml version="1.0" encoding="utf-8"?>
-<w:document xmlns:wpc="http://schemas.microsoft.com/office/word/2010/wordprocessingCanvas" xmlns:cx="http://schemas.microsoft.com/office/drawing/2014/chartex" xmlns:cx1="http://schemas.microsoft.com/office/drawing/2015/9/8/chartex" xmlns:cx2="http://schemas.microsoft.com/office/drawing/2015/10/21/chartex" xmlns:cx3="http://schemas.microsoft.com/office/drawing/2016/5/9/chartex" xmlns:cx4="http://schemas.microsoft.com/office/drawing/2016/5/10/chartex" xmlns:cx5="http://schemas.microsoft.com/office/drawing/2016/5/11/chartex" xmlns:cx6="http://schemas.microsoft.com/office/drawing/2016/5/12/chartex" xmlns:cx7="http://schemas.microsoft.com/office/drawing/2016/5/13/chartex" xmlns:cx8="http://schemas.microsoft.com/office/drawing/2016/5/14/chartex" xmlns:mc="http://schemas.openxmlformats.org/markup-compatibility/2006" xmlns:aink="http://schemas.microsoft.com/office/drawing/2016/ink" xmlns:am3d="http://schemas.microsoft.com/office/drawing/2017/model3d" xmlns:o="urn:schemas-microsoft-com:office:office" xmlns:r="http://schemas.openxmlformats.org/officeDocument/2006/relationships" xmlns:m="http://schemas.openxmlformats.org/officeDocument/2006/math" xmlns:v="urn:schemas-microsoft-com:vml" xmlns:wp14="http://schemas.microsoft.com/office/word/2010/wordprocessingDrawing" xmlns:wp="http://schemas.openxmlformats.org/drawingml/2006/wordprocessingDrawing" xmlns:w10="urn:schemas-microsoft-com:office:word" xmlns:w="http://schemas.openxmlformats.org/wordprocessingml/2006/main" xmlns:w14="http://schemas.microsoft.com/office/word/2010/wordml" xmlns:w15="http://schemas.microsoft.com/office/word/2012/wordml" xmlns:w16cex="http://schemas.microsoft.com/office/word/2018/wordml/cex" xmlns:w16cid="http://schemas.microsoft.com/office/word/2016/wordml/cid" xmlns:w16="http://schemas.microsoft.com/office/word/2018/wordml" xmlns:w16sdtdh="http://schemas.microsoft.com/office/word/2020/wordml/sdtdatahash" xmlns:w16se="http://schemas.microsoft.com/office/word/2015/wordml/symex" xmlns:wpg="http://schemas.microsoft.com/office/word/2010/wordprocessingGroup" xmlns:wpi="http://schemas.microsoft.com/office/word/2010/wordprocessingInk" xmlns:wne="http://schemas.microsoft.com/office/word/2006/wordml" xmlns:wps="http://schemas.microsoft.com/office/word/2010/wordprocessingShape" mc:Ignorable="w14 w15 w16se w16cid w16 w16cex w16sdtdh wp14">
+<w:document xmlns:wpc="http://schemas.microsoft.com/office/word/2010/wordprocessingCanvas" xmlns:cx="http://schemas.microsoft.com/office/drawing/2014/chartex" xmlns:cx1="http://schemas.microsoft.com/office/drawing/2015/9/8/chartex" xmlns:cx2="http://schemas.microsoft.com/office/drawing/2015/10/21/chartex" xmlns:cx3="http://schemas.microsoft.com/office/drawing/2016/5/9/chartex" xmlns:cx4="http://schemas.microsoft.com/office/drawing/2016/5/10/chartex" xmlns:cx5="http://schemas.microsoft.com/office/drawing/2016/5/11/chartex" xmlns:cx6="http://schemas.microsoft.com/office/drawing/2016/5/12/chartex" xmlns:cx7="http://schemas.microsoft.com/office/drawing/2016/5/13/chartex" xmlns:cx8="http://schemas.microsoft.com/office/drawing/2016/5/14/chartex" xmlns:mc="http://schemas.openxmlformats.org/markup-compatibility/2006" xmlns:aink="http://schemas.microsoft.com/office/drawing/2016/ink" xmlns:am3d="http://schemas.microsoft.com/office/drawing/2017/model3d" xmlns:o="urn:schemas-microsoft-com:office:office" xmlns:oel="http://schemas.microsoft.com/office/2019/extlst" xmlns:r="http://schemas.openxmlformats.org/officeDocument/2006/relationships" xmlns:m="http://schemas.openxmlformats.org/officeDocument/2006/math" xmlns:v="urn:schemas-microsoft-com:vml" xmlns:wp14="http://schemas.microsoft.com/office/word/2010/wordprocessingDrawing" xmlns:wp="http://schemas.openxmlformats.org/drawingml/2006/wordprocessingDrawing" xmlns:w10="urn:schemas-microsoft-com:office:word" xmlns:w="http://schemas.openxmlformats.org/wordprocessingml/2006/main" xmlns:w14="http://schemas.microsoft.com/office/word/2010/wordml" xmlns:w15="http://schemas.microsoft.com/office/word/2012/wordml" xmlns:w16cex="http://schemas.microsoft.com/office/word/2018/wordml/cex" xmlns:w16cid="http://schemas.microsoft.com/office/word/2016/wordml/cid" xmlns:w16="http://schemas.microsoft.com/office/word/2018/wordml" xmlns:w16du="http://schemas.microsoft.com/office/word/2023/wordml/word16du" xmlns:w16sdtdh="http://schemas.microsoft.com/office/word/2020/wordml/sdtdatahash" xmlns:w16sdtfl="http://schemas.microsoft.com/office/word/2024/wordml/sdtformatlock" xmlns:w16se="http://schemas.microsoft.com/office/word/2015/wordml/symex" xmlns:wpg="http://schemas.microsoft.com/office/word/2010/wordprocessingGroup" xmlns:wpi="http://schemas.microsoft.com/office/word/2010/wordprocessingInk" xmlns:wne="http://schemas.microsoft.com/office/word/2006/wordml" xmlns:wps="http://schemas.microsoft.com/office/word/2010/wordprocessingShape" mc:Ignorable="w14 w15 w16se w16cid w16 w16cex w16sdtdh w16sdtfl w16du wp14">
   <w:body>
     <w:p>
       <w:pPr>
@@ -115,7 +115,7 @@
     </w:p>
     <w:p>
       <w:pPr>
-        <w:pStyle w:val="14"/>
+        <w:pStyle w:val="TOC1"/>
         <w:tabs>
           <w:tab w:val="right" w:leader="dot" w:pos="9629"/>
         </w:tabs>
@@ -135,7 +135,7 @@
       <w:hyperlink w:anchor="_Toc242181031" w:history="1">
         <w:r>
           <w:rPr>
-            <w:rStyle w:val="aff8"/>
+            <w:rStyle w:val="Hyperlink"/>
             <w:rFonts w:eastAsiaTheme="majorEastAsia"/>
             <w:noProof/>
           </w:rPr>
@@ -193,7 +193,7 @@
     </w:p>
     <w:p>
       <w:pPr>
-        <w:pStyle w:val="14"/>
+        <w:pStyle w:val="TOC1"/>
         <w:tabs>
           <w:tab w:val="right" w:leader="dot" w:pos="9629"/>
         </w:tabs>
@@ -204,7 +204,7 @@
       <w:hyperlink w:anchor="_Toc242181032" w:history="1">
         <w:r>
           <w:rPr>
-            <w:rStyle w:val="aff8"/>
+            <w:rStyle w:val="Hyperlink"/>
             <w:rFonts w:eastAsiaTheme="majorEastAsia"/>
             <w:noProof/>
           </w:rPr>
@@ -262,7 +262,7 @@
     </w:p>
     <w:p>
       <w:pPr>
-        <w:pStyle w:val="14"/>
+        <w:pStyle w:val="TOC1"/>
         <w:tabs>
           <w:tab w:val="right" w:leader="dot" w:pos="9629"/>
         </w:tabs>
@@ -273,7 +273,7 @@
       <w:hyperlink w:anchor="_Toc242181033" w:history="1">
         <w:r>
           <w:rPr>
-            <w:rStyle w:val="aff8"/>
+            <w:rStyle w:val="Hyperlink"/>
             <w:rFonts w:eastAsiaTheme="majorEastAsia"/>
             <w:noProof/>
           </w:rPr>
@@ -331,7 +331,7 @@
     </w:p>
     <w:p>
       <w:pPr>
-        <w:pStyle w:val="14"/>
+        <w:pStyle w:val="TOC1"/>
         <w:tabs>
           <w:tab w:val="right" w:leader="dot" w:pos="9629"/>
         </w:tabs>
@@ -342,7 +342,7 @@
       <w:hyperlink w:anchor="_Toc242181034" w:history="1">
         <w:r>
           <w:rPr>
-            <w:rStyle w:val="aff8"/>
+            <w:rStyle w:val="Hyperlink"/>
             <w:rFonts w:eastAsiaTheme="majorEastAsia"/>
             <w:noProof/>
           </w:rPr>
@@ -400,7 +400,7 @@
     </w:p>
     <w:p>
       <w:pPr>
-        <w:pStyle w:val="14"/>
+        <w:pStyle w:val="TOC1"/>
         <w:tabs>
           <w:tab w:val="right" w:leader="dot" w:pos="9629"/>
         </w:tabs>
@@ -411,7 +411,7 @@
       <w:hyperlink w:anchor="_Toc242181035" w:history="1">
         <w:r>
           <w:rPr>
-            <w:rStyle w:val="aff8"/>
+            <w:rStyle w:val="Hyperlink"/>
             <w:rFonts w:eastAsiaTheme="majorEastAsia"/>
             <w:noProof/>
           </w:rPr>
@@ -469,7 +469,7 @@
     </w:p>
     <w:p>
       <w:pPr>
-        <w:pStyle w:val="14"/>
+        <w:pStyle w:val="TOC1"/>
         <w:tabs>
           <w:tab w:val="right" w:leader="dot" w:pos="9629"/>
         </w:tabs>
@@ -480,7 +480,7 @@
       <w:hyperlink w:anchor="_Toc242181036" w:history="1">
         <w:r>
           <w:rPr>
-            <w:rStyle w:val="aff8"/>
+            <w:rStyle w:val="Hyperlink"/>
             <w:rFonts w:eastAsiaTheme="majorEastAsia"/>
             <w:noProof/>
           </w:rPr>
@@ -538,7 +538,7 @@
     </w:p>
     <w:p>
       <w:pPr>
-        <w:pStyle w:val="2c"/>
+        <w:pStyle w:val="TOC2"/>
         <w:tabs>
           <w:tab w:val="right" w:leader="dot" w:pos="9629"/>
         </w:tabs>
@@ -549,7 +549,7 @@
       <w:hyperlink w:anchor="_Toc242181037" w:history="1">
         <w:r>
           <w:rPr>
-            <w:rStyle w:val="aff8"/>
+            <w:rStyle w:val="Hyperlink"/>
             <w:rFonts w:eastAsiaTheme="majorEastAsia"/>
             <w:noProof/>
           </w:rPr>
@@ -607,7 +607,7 @@
     </w:p>
     <w:p>
       <w:pPr>
-        <w:pStyle w:val="14"/>
+        <w:pStyle w:val="TOC1"/>
         <w:tabs>
           <w:tab w:val="right" w:leader="dot" w:pos="9629"/>
         </w:tabs>
@@ -618,7 +618,7 @@
       <w:hyperlink w:anchor="_Toc242181038" w:history="1">
         <w:r>
           <w:rPr>
-            <w:rStyle w:val="aff8"/>
+            <w:rStyle w:val="Hyperlink"/>
             <w:rFonts w:eastAsiaTheme="majorEastAsia"/>
             <w:noProof/>
           </w:rPr>
@@ -676,7 +676,7 @@
     </w:p>
     <w:p>
       <w:pPr>
-        <w:pStyle w:val="14"/>
+        <w:pStyle w:val="TOC1"/>
         <w:tabs>
           <w:tab w:val="right" w:leader="dot" w:pos="9629"/>
         </w:tabs>
@@ -687,7 +687,7 @@
       <w:hyperlink w:anchor="_Toc242181039" w:history="1">
         <w:r>
           <w:rPr>
-            <w:rStyle w:val="aff8"/>
+            <w:rStyle w:val="Hyperlink"/>
             <w:rFonts w:eastAsiaTheme="majorEastAsia"/>
             <w:noProof/>
           </w:rPr>
@@ -745,7 +745,7 @@
     </w:p>
     <w:p>
       <w:pPr>
-        <w:pStyle w:val="14"/>
+        <w:pStyle w:val="TOC1"/>
         <w:tabs>
           <w:tab w:val="right" w:leader="dot" w:pos="9629"/>
         </w:tabs>
@@ -756,7 +756,7 @@
       <w:hyperlink w:anchor="_Toc242181040" w:history="1">
         <w:r>
           <w:rPr>
-            <w:rStyle w:val="aff8"/>
+            <w:rStyle w:val="Hyperlink"/>
             <w:rFonts w:eastAsiaTheme="majorEastAsia"/>
             <w:noProof/>
           </w:rPr>
@@ -822,7 +822,7 @@
     </w:p>
     <w:p>
       <w:pPr>
-        <w:pStyle w:val="1"/>
+        <w:pStyle w:val="Heading1"/>
       </w:pPr>
       <w:bookmarkStart w:id="0" w:name="_Toc242181031"/>
       <w:r>
@@ -832,10 +832,7 @@
     </w:p>
     <w:p>
       <w:r>
-        <w:t>The purpose of this assignment is to take a small piece of scientific software through its comple</w:t>
-      </w:r>
-      <w:r>
-        <w:t xml:space="preserve">te cycle, from design to automated testing and delivery, and to justify the technologies chosen. The practical result is </w:t>
+        <w:t xml:space="preserve">The purpose of this assignment is to take a small piece of scientific software through its complete cycle, from design to automated testing and delivery, and to justify the technologies chosen. The practical result is </w:t>
       </w:r>
       <w:r>
         <w:rPr>
@@ -844,26 +841,23 @@
         <w:t>climate-analyzer</w:t>
       </w:r>
       <w:r>
-        <w:t>, an open-source Python package published on GitHub [1]. It loads daily weather records, removes defective values, esti</w:t>
-      </w:r>
-      <w:r>
-        <w:t>mates long-term trends, anomalies and extremes, and forecasts the coming months. The case study is Astana, whose sharply continental climate (about −14 °C in January and +21 °C in July) makes both the seasonal cycle and the data-quality problems easy to se</w:t>
-      </w:r>
-      <w:r>
-        <w:t>e.</w:t>
+        <w:t>, an open-source Python package published on GitHub [1]. It loads daily weather records, removes defective values, estimates long-term trends, anomalies and extremes, and forecasts the coming months. The case study is Astana, whose sharply continental climate (about −14 °C in January and +21 °C in July) makes both the seasonal cycle and the data-quality problems easy to see.</w:t>
       </w:r>
     </w:p>
     <w:p>
       <w:r>
-        <w:t>The tool works as a command line program (climate-analyzer fetch and analyze), a minimal Streamlit web interface (app.py) and a Python library. The repository also holds a README, an MIT licence, issue and pull request templates, a changelog, 84 automat</w:t>
-      </w:r>
-      <w:r>
-        <w:t>ed tests and three GitHub Actions workflows. Unless stated otherwise, the numerical results below were obtained by running the tool on real data for Astana.</w:t>
+        <w:t xml:space="preserve">The tool works as a command line program (climate-analyzer fetch and analyze), </w:t>
+      </w:r>
+      <w:r>
+        <w:t>an interactive Streamlit web interface</w:t>
+      </w:r>
+      <w:r>
+        <w:t xml:space="preserve"> (app.py) and a Python library. The repository also holds a README, an MIT licence, issue and pull request templates, a changelog, 84 automated tests and three GitHub Actions workflows. Unless stated otherwise, the numerical results below were obtained by running the tool on real data for Astana.</w:t>
       </w:r>
     </w:p>
     <w:p>
       <w:pPr>
-        <w:pStyle w:val="1"/>
+        <w:pStyle w:val="Heading1"/>
       </w:pPr>
       <w:bookmarkStart w:id="1" w:name="_Toc242181032"/>
       <w:r>
@@ -873,10 +867,7 @@
     </w:p>
     <w:p>
       <w:r>
-        <w:t>Software engineering describes the creation of a progr</w:t>
-      </w:r>
-      <w:r>
-        <w:t xml:space="preserve">am as a life cycle of stages: requirements analysis, design, implementation, testing, deployment and maintenance [2]. Life-cycle models differ in how the stages are ordered. In the classical </w:t>
+        <w:t xml:space="preserve">Software engineering describes the creation of a program as a life cycle of stages: requirements analysis, design, implementation, testing, deployment and maintenance [2]. Life-cycle models differ in how the stages are ordered. In the classical </w:t>
       </w:r>
       <w:r>
         <w:rPr>
@@ -885,10 +876,7 @@
         <w:t>waterfall</w:t>
       </w:r>
       <w:r>
-        <w:t xml:space="preserve"> model each stage is finished before the next begins, wh</w:t>
-      </w:r>
-      <w:r>
-        <w:t xml:space="preserve">ich is easy to plan but makes late changes expensive. </w:t>
+        <w:t xml:space="preserve"> model each stage is finished before the next begins, which is easy to plan but makes late changes expensive. </w:t>
       </w:r>
       <w:r>
         <w:rPr>
@@ -910,13 +898,13 @@
       </w:r>
       <w:r>
         <w:lastRenderedPageBreak/>
-        <w:t>models repeat the stages in short cycles, so a working version exists from the start and feedback arrives early. Scientific software is usually developed iteratively, because the req</w:t>
-      </w:r>
-      <w:r>
-        <w:t>uirements are refined as the researcher learns more about the data [6]. The repository history is organised the same way: nine commits, each adding one layer, from the project skeleton and the sample data through the analysis modules, the forecast model an</w:t>
-      </w:r>
-      <w:r>
-        <w:t>d the interfaces to the tests, the CI/CD workflows and the documentation.</w:t>
+        <w:t xml:space="preserve">models repeat the stages in short cycles, so a working version exists from the start and feedback arrives early. Scientific software is usually developed iteratively, because the requirements are refined as the researcher learns more about the data [6]. The repository history is organised the same way: </w:t>
+      </w:r>
+      <w:r>
+        <w:t>a series of small commits, each adding</w:t>
+      </w:r>
+      <w:r>
+        <w:t xml:space="preserve"> one layer, from the project skeleton and the sample data through the analysis modules, the forecast model and the interfaces to the tests, the CI/CD workflows and the documentation.</w:t>
       </w:r>
     </w:p>
     <w:p>
@@ -927,10 +915,7 @@
         <w:t>Requirements.</w:t>
       </w:r>
       <w:r>
-        <w:t xml:space="preserve"> The functional requirements follow from the task: read a CSV file of daily observations, clean it, compute trends, anomalies and extremes, forecast future months and wr</w:t>
-      </w:r>
-      <w:r>
-        <w:t>ite a report. The non-functional ones mattered as much: reproducible results, no need for a display or internet access on a CI server, and installation with one command on Linux, Windows and macOS.</w:t>
+        <w:t xml:space="preserve"> The functional requirements follow from the task: read a CSV file of daily observations, clean it, compute trends, anomalies and extremes, forecast future months and write a report. The non-functional ones mattered as much: reproducible results, no need for a display or internet access on a CI server, and installation with one command on Linux, Windows and macOS.</w:t>
       </w:r>
     </w:p>
     <w:p>
@@ -941,13 +926,7 @@
         <w:t>Design and implementation.</w:t>
       </w:r>
       <w:r>
-        <w:t xml:space="preserve"> The package consists of small m</w:t>
-      </w:r>
-      <w:r>
-        <w:t>odules with one responsibility each — io, sources, cleaning, analysis, forecast, plotting — joined by a pipeline module. The command line and web interfaces are thin layers over that pipeline, so both always give identical numbers. Network access is isolat</w:t>
-      </w:r>
-      <w:r>
-        <w:t>ed in one function that receives its opener as a parameter and can therefore be tested offline. The code is typed Python in the standard src/ layout; Ruff enforces style and mypy checks types.</w:t>
+        <w:t xml:space="preserve"> The package consists of small modules with one responsibility each — io, sources, cleaning, analysis, forecast, plotting — joined by a pipeline module. The command line and web interfaces are thin layers over that pipeline, so both always give identical numbers. Network access is isolated in one function that receives its opener as a parameter and can therefore be tested offline. The code is typed Python in the standard src/ layout; Ruff enforces style and mypy checks types.</w:t>
       </w:r>
     </w:p>
     <w:p>
@@ -958,13 +937,7 @@
         <w:t>Testing.</w:t>
       </w:r>
       <w:r>
-        <w:t xml:space="preserve"> The pytest suite has 84 tests covering 99 % of the sta</w:t>
-      </w:r>
-      <w:r>
-        <w:t>tements: unit tests for every module, integration tests of the pipeline and the command line program, and tests of the web interface through Streamlit's AppTest. The central idea is testing against a known answer: the bundled synthetic dataset is generated</w:t>
-      </w:r>
-      <w:r>
-        <w:t xml:space="preserve"> with a warming of +0.35 °C per decade, and the tests check that the analysis recovers it.</w:t>
+        <w:t xml:space="preserve"> The pytest suite has 84 tests covering 99 % of the statements: unit tests for every module, integration tests of the pipeline and the command line program, and tests of the web interface through Streamlit's AppTest. The central idea is testing against a known answer: the bundled synthetic dataset is generated with a warming of +0.35 °C per decade, and the tests check that the analysis recovers it.</w:t>
       </w:r>
     </w:p>
     <w:p>
@@ -975,10 +948,7 @@
         <w:t>Deployment and maintenance.</w:t>
       </w:r>
       <w:r>
-        <w:t xml:space="preserve"> A version tag starts a workflow that tests the code, builds the package and publishes a GitHub Release. Maintenance relies on the issue t</w:t>
-      </w:r>
-      <w:r>
-        <w:t>racker, the changelog, semantic versioning and Dependabot. Table 1 maps each stage to the repository.</w:t>
+        <w:t xml:space="preserve"> A version tag starts a workflow that tests the code, builds the package and publishes a GitHub Release. Maintenance relies on the issue tracker, the changelog, semantic versioning and Dependabot. Table 1 maps each stage to the repository.</w:t>
       </w:r>
     </w:p>
     <w:p>
@@ -994,7 +964,7 @@
     </w:p>
     <w:tbl>
       <w:tblPr>
-        <w:tblStyle w:val="aff0"/>
+        <w:tblStyle w:val="TableGrid"/>
         <w:tblW w:w="0" w:type="auto"/>
         <w:jc w:val="center"/>
         <w:tblLayout w:type="fixed"/>
@@ -1370,10 +1340,7 @@
               <w:jc w:val="left"/>
             </w:pPr>
             <w:r>
-              <w:t xml:space="preserve">Scheduled forecast, dependency updates, </w:t>
-            </w:r>
-            <w:r>
-              <w:t>changelog</w:t>
+              <w:t>Scheduled forecast, dependency updates, changelog</w:t>
             </w:r>
           </w:p>
         </w:tc>
@@ -1402,7 +1369,7 @@
     </w:p>
     <w:p>
       <w:pPr>
-        <w:pStyle w:val="1"/>
+        <w:pStyle w:val="Heading1"/>
       </w:pPr>
       <w:bookmarkStart w:id="2" w:name="_Toc242181033"/>
       <w:r>
@@ -1412,10 +1379,7 @@
     </w:p>
     <w:p>
       <w:r>
-        <w:t>Every dependency is a long-term obligation, so the stack was selected by explicit criteria rather than by habit. They are documented in the repository togeth</w:t>
-      </w:r>
-      <w:r>
-        <w:t>er with the rejected alternatives (docs/TECHNOLOGY.md):</w:t>
+        <w:t>Every dependency is a long-term obligation, so the stack was selected by explicit criteria rather than by habit. They are documented in the repository together with the rejected alternatives (docs/TECHNOLOGY.md):</w:t>
       </w:r>
     </w:p>
     <w:p>
@@ -1471,7 +1435,10 @@
         <w:t>low barrier to entry</w:t>
       </w:r>
       <w:r>
-        <w:t xml:space="preserve"> — free and open source, cross-platform, installed with one command;</w:t>
+        <w:t xml:space="preserve"> — free and open source, </w:t>
+      </w:r>
+      <w:r>
+        <w:t>cross-platform, easy to install;</w:t>
       </w:r>
     </w:p>
     <w:p>
@@ -1496,10 +1463,7 @@
         <w:t>Python</w:t>
       </w:r>
       <w:r>
-        <w:t xml:space="preserve"> meets all five. R is equally strong in statistics but weaker as a general-purpose language for command line tools, packaging and web interfaces; MATLAB needs a</w:t>
-      </w:r>
-      <w:r>
-        <w:t xml:space="preserve"> commercial licence; Julia is fast but its ecosystem and CI tooling are less mature. Table 2 lists the main components and the reason for each choice.</w:t>
+        <w:t xml:space="preserve"> meets all five. R is equally strong in statistics but weaker as a general-purpose language for command line tools, packaging and web interfaces; MATLAB needs a commercial licence; Julia is fast but its ecosystem and CI tooling are less mature. Table 2 lists the main components and the reason for each choice.</w:t>
       </w:r>
     </w:p>
     <w:p>
@@ -1515,7 +1479,7 @@
     </w:p>
     <w:tbl>
       <w:tblPr>
-        <w:tblStyle w:val="aff0"/>
+        <w:tblStyle w:val="TableGrid"/>
         <w:tblW w:w="0" w:type="auto"/>
         <w:jc w:val="center"/>
         <w:tblLayout w:type="fixed"/>
@@ -1582,13 +1546,7 @@
               <w:rPr>
                 <w:b/>
               </w:rPr>
-              <w:t>Reason; rejected altern</w:t>
-            </w:r>
-            <w:r>
-              <w:rPr>
-                <w:b/>
-              </w:rPr>
-              <w:t>atives</w:t>
+              <w:t>Reason; rejected alternatives</w:t>
             </w:r>
           </w:p>
         </w:tc>
@@ -1690,10 +1648,7 @@
               <w:jc w:val="left"/>
             </w:pPr>
             <w:r>
-              <w:t xml:space="preserve">Reviewed implementations of regression, Kendall's tau and the Theil–Sen slope; hand-written versions would risk </w:t>
-            </w:r>
-            <w:r>
-              <w:t>errors.</w:t>
+              <w:t>Reviewed implementations of regression, Kendall's tau and the Theil–Sen slope; hand-written versions would risk errors.</w:t>
             </w:r>
           </w:p>
         </w:tc>
@@ -1795,7 +1750,58 @@
               <w:jc w:val="left"/>
             </w:pPr>
             <w:r>
-              <w:t>An interactive application in about 160 lines of Python; Dash or Flask need far more code.</w:t>
+              <w:t>An interactive application in one Python script; Dash or Flask need far more code.</w:t>
+            </w:r>
+          </w:p>
+        </w:tc>
+      </w:tr>
+      <w:tr>
+        <w:trPr>
+          <w:cantSplit/>
+          <w:jc w:val="center"/>
+        </w:trPr>
+        <w:tc>
+          <w:tcPr>
+            <w:tcW w:w="1928" w:type="dxa"/>
+          </w:tcPr>
+          <w:p>
+            <w:pPr>
+              <w:spacing w:before="40" w:after="40" w:line="240" w:lineRule="auto"/>
+              <w:ind w:firstLine="0"/>
+              <w:jc w:val="left"/>
+            </w:pPr>
+            <w:r>
+              <w:t>Plotly</w:t>
+            </w:r>
+          </w:p>
+        </w:tc>
+        <w:tc>
+          <w:tcPr>
+            <w:tcW w:w="1757" w:type="dxa"/>
+          </w:tcPr>
+          <w:p>
+            <w:pPr>
+              <w:spacing w:before="40" w:after="40" w:line="240" w:lineRule="auto"/>
+              <w:ind w:firstLine="0"/>
+              <w:jc w:val="left"/>
+            </w:pPr>
+            <w:r>
+              <w:t>Web charts</w:t>
+            </w:r>
+          </w:p>
+        </w:tc>
+        <w:tc>
+          <w:tcPr>
+            <w:tcW w:w="5669" w:type="dxa"/>
+          </w:tcPr>
+          <w:p>
+            <w:pPr>
+              <w:spacing w:before="40" w:after="40" w:line="240" w:lineRule="auto"/>
+              <w:ind w:firstLine="0"/>
+              <w:jc w:val="left"/>
+            </w:pPr>
+            <w:r>
+              <w:t>Hover, zoom and legend toggling without extra code.</w:t>
             </w:r>
           </w:p>
         </w:tc>
@@ -1846,10 +1852,7 @@
               <w:jc w:val="left"/>
             </w:pPr>
             <w:r>
-              <w:t>Free, no API key, any coordinates</w:t>
-            </w:r>
-            <w:r>
-              <w:t>, no gaps; station archives (GHCN, Meteostat) have gaps and heavier formats.</w:t>
+              <w:t>Free, no API key, any coordinates, no gaps; station archives (GHCN, Meteostat) have gaps and heavier formats.</w:t>
             </w:r>
           </w:p>
         </w:tc>
@@ -1951,10 +1954,7 @@
               <w:jc w:val="left"/>
             </w:pPr>
             <w:r>
-              <w:t xml:space="preserve">Built into </w:t>
-            </w:r>
-            <w:r>
-              <w:t>GitHub, free for public repositories, three operating systems; Jenkins needs its own server.</w:t>
+              <w:t>Built into GitHub, free for public repositories, three operating systems; Jenkins needs its own server.</w:t>
             </w:r>
           </w:p>
         </w:tc>
@@ -1968,6 +1968,7 @@
     </w:p>
     <w:p>
       <w:r>
+        <w:lastRenderedPageBreak/>
         <w:t xml:space="preserve">Decisions </w:t>
       </w:r>
       <w:r>
@@ -1977,22 +1978,12 @@
         <w:t>not</w:t>
       </w:r>
       <w:r>
-        <w:t xml:space="preserve"> to use a technology followed the same criteria. The statsmodels library offers seasonal decomposition and ARIMA, but it is a heavy dependency, whil</w:t>
-      </w:r>
-      <w:r>
-        <w:t xml:space="preserve">e the decomposition and the </w:t>
-      </w:r>
-      <w:r>
-        <w:lastRenderedPageBreak/>
-        <w:t>forecast model take fewer than 200 transparent, fully tested lines here. Deep learning was rejected for a scientific reason: 32 years of monthly data give only 384 points, far too few for a neural network, whereas an interpretab</w:t>
-      </w:r>
-      <w:r>
-        <w:t>le statistical model can be validated honestly against a simple baseline.</w:t>
+        <w:t xml:space="preserve"> to use a technology followed the same criteria. The statsmodels library offers seasonal decomposition and ARIMA, but it is a heavy dependency, while the decomposition and the forecast model take fewer than 200 transparent, fully tested lines here. Deep learning was rejected for a scientific reason: 32 years of monthly data give only 384 points, far too few for a neural network, whereas an interpretable statistical model can be validated honestly against a simple baseline.</w:t>
       </w:r>
     </w:p>
     <w:p>
       <w:pPr>
-        <w:pStyle w:val="1"/>
+        <w:pStyle w:val="Heading1"/>
       </w:pPr>
       <w:bookmarkStart w:id="3" w:name="_Toc242181034"/>
       <w:r>
@@ -2002,10 +1993,7 @@
     </w:p>
     <w:p>
       <w:r>
-        <w:t xml:space="preserve">A version control system (VCS) records every change of the source code with its author, date and explanation. It </w:t>
-      </w:r>
-      <w:r>
-        <w:t>allows a return to any earlier state, parallel work on several ideas and the merging of contributions. For scientific software it also documents exactly which version of the code produced a published result.</w:t>
+        <w:t>A version control system (VCS) records every change of the source code with its author, date and explanation. It allows a return to any earlier state, parallel work on several ideas and the merging of contributions. For scientific software it also documents exactly which version of the code produced a published result.</w:t>
       </w:r>
     </w:p>
     <w:p>
@@ -2016,13 +2004,7 @@
         <w:rPr>
           <w:i/>
         </w:rPr>
-        <w:t>centralise</w:t>
-      </w:r>
-      <w:r>
-        <w:rPr>
-          <w:i/>
-        </w:rPr>
-        <w:t>d</w:t>
+        <w:t>centralised</w:t>
       </w:r>
       <w:r>
         <w:t xml:space="preserve"> systems such as Subversion (SVN) the history is stored on one server and developers hold only a working copy, so most operations need a network connection and the server is a single point of failure. In </w:t>
@@ -2034,10 +2016,7 @@
         <w:t>distributed</w:t>
       </w:r>
       <w:r>
-        <w:t xml:space="preserve"> systems such as Git and Mercurial every</w:t>
-      </w:r>
-      <w:r>
-        <w:t xml:space="preserve"> clone contains the complete history; commits, branches and comparisons are local and fast, and any clone can restore the project [3]. Table 3 compares the three best-known open-source systems.</w:t>
+        <w:t xml:space="preserve"> systems such as Git and Mercurial every clone contains the complete history; commits, branches and comparisons are local and fast, and any clone can restore the project [3]. Table 3 compares the three best-known open-source systems.</w:t>
       </w:r>
     </w:p>
     <w:p>
@@ -2053,7 +2032,7 @@
     </w:p>
     <w:tbl>
       <w:tblPr>
-        <w:tblStyle w:val="aff0"/>
+        <w:tblStyle w:val="TableGrid"/>
         <w:tblW w:w="0" w:type="auto"/>
         <w:jc w:val="center"/>
         <w:tblLayout w:type="fixed"/>
@@ -2615,17 +2594,11 @@
     </w:p>
     <w:p>
       <w:r>
-        <w:t xml:space="preserve">Git was chosen for three reasons. Cheap local branches make it natural to isolate every change and </w:t>
-      </w:r>
-      <w:r>
-        <w:t>verify it before it reaches the main branch. Content hashing guarantees that a commit identifier refers to exactly one state of the code, which matters for reproducibility. And Git is the standard of both industry and open science, so most users and review</w:t>
-      </w:r>
-      <w:r>
-        <w:t xml:space="preserve">ers already know it. Its </w:t>
+        <w:t xml:space="preserve">Git was chosen for three reasons. Cheap local branches make it natural to isolate every change and verify it before it reaches the main branch. Content hashing guarantees that a commit identifier refers to exactly one state of the code, which matters for reproducibility. And Git is the </w:t>
       </w:r>
       <w:r>
         <w:lastRenderedPageBreak/>
-        <w:t>weaknesses are not significant here: the repository holds only source code and a few small data and image files.</w:t>
+        <w:t>standard of both industry and open science, so most users and reviewers already know it. Its weaknesses are not significant here: the repository holds only source code and a few small data and image files.</w:t>
       </w:r>
     </w:p>
     <w:p>
@@ -2639,18 +2612,12 @@
         <w:t>GitHub</w:t>
       </w:r>
       <w:r>
-        <w:t xml:space="preserve"> provides the public repository, the issue tracker with templates, pull requests, releases with downloadable packages, Dependabot and the CI/CD service. Of the alternatives, GitLab offers a comparable built-in CI/CD system and can be self-hosted, whi</w:t>
-      </w:r>
-      <w:r>
-        <w:t xml:space="preserve">ch suits closed institutional projects, and Bitbucket integrates with Jira and the other Atlassian tools and is aimed at company teams. GitHub was preferred because it hosts the largest open-source and scientific community, its Actions service is free for </w:t>
-      </w:r>
-      <w:r>
-        <w:t>public repositories, and a repository can be archived with a citable DOI through Zenodo.</w:t>
+        <w:t xml:space="preserve"> provides the public repository, the issue tracker with templates, pull requests, releases with downloadable packages, Dependabot and the CI/CD service. Of the alternatives, GitLab offers a comparable built-in CI/CD system and can be self-hosted, which suits closed institutional projects, and Bitbucket integrates with Jira and the other Atlassian tools and is aimed at company teams. GitHub was preferred because it hosts the largest open-source and scientific community, its Actions service is free for public repositories, and a repository can be archived with a citable DOI through Zenodo.</w:t>
       </w:r>
     </w:p>
     <w:p>
       <w:pPr>
-        <w:pStyle w:val="1"/>
+        <w:pStyle w:val="Heading1"/>
       </w:pPr>
       <w:bookmarkStart w:id="4" w:name="_Toc242181035"/>
       <w:r>
@@ -2666,10 +2633,7 @@
         <w:t>Continuous integration (CI)</w:t>
       </w:r>
       <w:r>
-        <w:t xml:space="preserve"> is the practice of merging changes into the main branch frequently and verifying each one automat</w:t>
-      </w:r>
-      <w:r>
-        <w:t xml:space="preserve">ically by building the project and running its tests [4], so that errors are found within minutes. </w:t>
+        <w:t xml:space="preserve"> is the practice of merging changes into the main branch frequently and verifying each one automatically by building the project and running its tests [4], so that errors are found within minutes. </w:t>
       </w:r>
       <w:r>
         <w:rPr>
@@ -2678,10 +2642,7 @@
         <w:t>Continuous delivery (CD)</w:t>
       </w:r>
       <w:r>
-        <w:t xml:space="preserve"> extends the idea: after successful verification the software is automatically prepared for release, so publishing a version becomes </w:t>
-      </w:r>
-      <w:r>
-        <w:t xml:space="preserve">a routine, repeatable action; in </w:t>
+        <w:t xml:space="preserve"> extends the idea: after successful verification the software is automatically prepared for release, so publishing a version becomes a routine, repeatable action; in </w:t>
       </w:r>
       <w:r>
         <w:rPr>
@@ -2719,13 +2680,7 @@
         <w:rPr>
           <w:i/>
         </w:rPr>
-        <w:t>wo</w:t>
-      </w:r>
-      <w:r>
-        <w:rPr>
-          <w:i/>
-        </w:rPr>
-        <w:t>rkflow</w:t>
+        <w:t>workflow</w:t>
       </w:r>
       <w:r>
         <w:t xml:space="preserve"> is started by an </w:t>
@@ -2755,10 +2710,7 @@
         <w:t>runners</w:t>
       </w:r>
       <w:r>
-        <w:t>. Because the configuration lives in the repository, the pipeline is versioned and reviewed to</w:t>
-      </w:r>
-      <w:r>
-        <w:t>gether with the code. The project has three workflows (Table 4).</w:t>
+        <w:t>. Because the configuration lives in the repository, the pipeline is versioned and reviewed together with the code. The project has three workflows (Table 4).</w:t>
       </w:r>
     </w:p>
     <w:p>
@@ -2774,7 +2726,7 @@
     </w:p>
     <w:tbl>
       <w:tblPr>
-        <w:tblStyle w:val="aff0"/>
+        <w:tblStyle w:val="TableGrid"/>
         <w:tblW w:w="0" w:type="auto"/>
         <w:jc w:val="center"/>
         <w:tblLayout w:type="fixed"/>
@@ -2892,10 +2844,7 @@
               <w:jc w:val="left"/>
             </w:pPr>
             <w:r>
-              <w:t xml:space="preserve">Ruff and mypy checks; tests on Ubuntu (Python </w:t>
-            </w:r>
-            <w:r>
-              <w:t>3.10–3.13), Windows and macOS; end-to-end analysis of the sample; package build and install check.</w:t>
+              <w:t>Ruff and mypy checks; tests on Ubuntu (Python 3.10–3.13), Windows and macOS; end-to-end analysis of the sample; package build and install check.</w:t>
             </w:r>
           </w:p>
         </w:tc>
@@ -2946,10 +2895,7 @@
               <w:jc w:val="left"/>
             </w:pPr>
             <w:r>
-              <w:t xml:space="preserve">Downloads real Astana data, analyses temperature and precipitation, publishes the reports as a job </w:t>
-            </w:r>
-            <w:r>
-              <w:t>summary and an artefact.</w:t>
+              <w:t>Downloads real Astana data, analyses temperature and precipitation, publishes the reports as a job summary and an artefact.</w:t>
             </w:r>
           </w:p>
         </w:tc>
@@ -3014,6 +2960,7 @@
     </w:p>
     <w:p>
       <w:r>
+        <w:lastRenderedPageBreak/>
         <w:t xml:space="preserve">The CI workflow uses several standard techniques. A </w:t>
       </w:r>
       <w:r>
@@ -3023,14 +2970,7 @@
         <w:t>build matrix</w:t>
       </w:r>
       <w:r>
-        <w:t xml:space="preserve"> repeats the tests in six envir</w:t>
-      </w:r>
-      <w:r>
-        <w:t xml:space="preserve">onments — four Python versions on Ubuntu plus Windows and macOS — and so catches </w:t>
-      </w:r>
-      <w:r>
-        <w:lastRenderedPageBreak/>
-        <w:t xml:space="preserve">errors that appear on one platform only. </w:t>
+        <w:t xml:space="preserve"> repeats the tests in six environments — four Python versions on Ubuntu plus Windows and macOS — and so catches errors that appear on one platform only. </w:t>
       </w:r>
       <w:r>
         <w:rPr>
@@ -3045,13 +2985,7 @@
         <w:rPr>
           <w:b/>
         </w:rPr>
-        <w:t>quality ga</w:t>
-      </w:r>
-      <w:r>
-        <w:rPr>
-          <w:b/>
-        </w:rPr>
-        <w:t>te</w:t>
+        <w:t>quality gate</w:t>
       </w:r>
       <w:r>
         <w:t xml:space="preserve"> fails the run if coverage drops below 90 %. </w:t>
@@ -3072,10 +3006,7 @@
         <w:t>least-privilege permissions</w:t>
       </w:r>
       <w:r>
-        <w:t xml:space="preserve"> give the CI token read-only access. Figure 1 shows run #11 on the main branch (commit dcbbb30): all nine</w:t>
-      </w:r>
-      <w:r>
-        <w:t xml:space="preserve"> jobs finished successfully in 2 minutes 57 seconds.</w:t>
+        <w:t xml:space="preserve"> give the CI token read-only access. Figure 1 shows run #11 on the main branch (commit dcbbb30): all nine jobs finished successfully in 2 minutes 57 seconds.</w:t>
       </w:r>
     </w:p>
     <w:p>
@@ -3138,23 +3069,17 @@
     </w:p>
     <w:p>
       <w:r>
-        <w:t>The second workflow uses the CI infrastructure for a scientific task rather than for checking code: every month, or on demand through</w:t>
-      </w:r>
-      <w:r>
-        <w:t xml:space="preserve"> workflow_dispatch, it repeats the whole study on fresh data on an independent machine.</w:t>
+        <w:t>The second workflow uses the CI infrastructure for a scientific task rather than for checking code: every month, or on demand through workflow_dispatch, it repeats the whole study on fresh data on an independent machine.</w:t>
       </w:r>
     </w:p>
     <w:p>
       <w:r>
-        <w:t>The third workflow implements continuous delivery. When a version tag is pushed, it checks that the tag matches the package version, repeats the tests, builds the wheel</w:t>
-      </w:r>
-      <w:r>
-        <w:t xml:space="preserve"> and the source archive and publishes them as a GitHub Release. The workflow therefore cannot publish code that fails its tests.</w:t>
+        <w:t>The third workflow implements continuous delivery. When a version tag is pushed, it checks that the tag matches the package version, repeats the tests, builds the wheel and the source archive and publishes them as a GitHub Release. The workflow therefore cannot publish code that fails its tests.</w:t>
       </w:r>
     </w:p>
     <w:p>
       <w:pPr>
-        <w:pStyle w:val="1"/>
+        <w:pStyle w:val="Heading1"/>
       </w:pPr>
       <w:bookmarkStart w:id="5" w:name="_Toc242181036"/>
       <w:r>
@@ -3164,13 +3089,7 @@
     </w:p>
     <w:p>
       <w:r>
-        <w:t>Scientific software differs from ordinary applications in what counts as a defect</w:t>
-      </w:r>
-      <w:r>
-        <w:t>. A business application that crashes is obviously broken; a scientific program that silently returns a plausible but wrong number is far more dangerous, because the error passes into publications. Research software engineering therefore stresses a specifi</w:t>
-      </w:r>
-      <w:r>
-        <w:t>c set of practices [6, 7], each of which was applied here.</w:t>
+        <w:t>Scientific software differs from ordinary applications in what counts as a defect. A business application that crashes is obviously broken; a scientific program that silently returns a plausible but wrong number is far more dangerous, because the error passes into publications. Research software engineering therefore stresses a specific set of practices [6, 7], each of which was applied here.</w:t>
       </w:r>
     </w:p>
     <w:p>
@@ -3190,10 +3109,11 @@
         <w:t>oracle problem</w:t>
       </w:r>
       <w:r>
-        <w:t xml:space="preserve"> with a synthetic dataset that imitates Astana's climate, has a known warming and contains deliberate defects (gaps, sensor spik</w:t>
-      </w:r>
-      <w:r>
-        <w:t>es, -999 codes). The tests require the tool to remove the defects and recover the known trend.</w:t>
+        <w:t xml:space="preserve"> with a synthetic dataset </w:t>
+      </w:r>
+      <w:r>
+        <w:lastRenderedPageBreak/>
+        <w:t>that imitates Astana's climate, has a known warming and contains deliberate defects (gaps, sensor spikes, -999 codes). The tests require the tool to remove the defects and recover the known trend.</w:t>
       </w:r>
     </w:p>
     <w:p>
@@ -3201,14 +3121,10 @@
         <w:rPr>
           <w:b/>
         </w:rPr>
-        <w:lastRenderedPageBreak/>
         <w:t>Reproducibility.</w:t>
       </w:r>
       <w:r>
-        <w:t xml:space="preserve"> The sample is generated with a fixed random seed, figures are rendered without a display, tests never use the network, and the test suite turns </w:t>
-      </w:r>
-      <w:r>
-        <w:t>every FutureWarning — the category pandas and NumPy use to announce coming changes of behaviour — into an error, so that a library update cannot alter the results unnoticed.</w:t>
+        <w:t xml:space="preserve"> The sample is generated with a fixed random seed, figures are rendered without a display, tests never use the network, and the test suite turns every FutureWarning — the category pandas and NumPy use to announce coming changes of behaviour — into an error, so that a library update cannot alter the results unnoticed.</w:t>
       </w:r>
     </w:p>
     <w:p>
@@ -3219,13 +3135,7 @@
         <w:t>Domain-aware data quality.</w:t>
       </w:r>
       <w:r>
-        <w:t xml:space="preserve"> Generic rules fail on climate data: a global outlier th</w:t>
-      </w:r>
-      <w:r>
-        <w:t>reshold would mark every Astana winter day as an anomaly, so outliers are judged against the same calendar month. Gaps of up to three days are interpolated, longer ones are left empty so that weather is not invented, and a month or year with less than 80 %</w:t>
-      </w:r>
-      <w:r>
-        <w:t xml:space="preserve"> of its days is excluded.</w:t>
+        <w:t xml:space="preserve"> Generic rules fail on climate data: a global outlier threshold would mark every Astana winter day as an anomaly, so outliers are judged against the same calendar month. Gaps of up to three days are interpolated, longer ones are left empty so that weather is not invented, and a month or year with less than 80 % of its days is excluded.</w:t>
       </w:r>
     </w:p>
     <w:p>
@@ -3236,15 +3146,12 @@
         <w:t>Honest treatment of uncertainty.</w:t>
       </w:r>
       <w:r>
-        <w:t xml:space="preserve"> The trend is estimated twice, by ordinary least squares and by the non-parametric Mann–Kendall test with Sen's slope [8, 9], the standard robust method in climatology. The forecast has a 95 % predi</w:t>
-      </w:r>
-      <w:r>
-        <w:t>ction interval and is scored on data the model has not seen, against the naive climatology forecast (“an average January”).</w:t>
+        <w:t xml:space="preserve"> The trend is estimated twice, by ordinary least squares and by the non-parametric Mann–Kendall test with Sen's slope [8, 9], the standard robust method in climatology. The forecast has a 95 % prediction interval and is scored on data the model has not seen, against the naive climatology forecast (“an average January”).</w:t>
       </w:r>
     </w:p>
     <w:p>
       <w:pPr>
-        <w:pStyle w:val="21"/>
+        <w:pStyle w:val="Heading2"/>
       </w:pPr>
       <w:bookmarkStart w:id="6" w:name="_Toc242181037"/>
       <w:r>
@@ -3254,13 +3161,7 @@
     </w:p>
     <w:p>
       <w:r>
-        <w:t>The tool was run on 11 688 daily values for 1 January 1994 – 31 December 2025, downloaded withou</w:t>
-      </w:r>
-      <w:r>
-        <w:t>t gaps from the Open-Meteo archive [10]. By default the archive combines the ERA5 and ERA5-Land reanalyses [11] (used here up to 2016) with the operational ECMWF IFS model (from 2017), and it describes a model grid cell near 51.1° N, 71.4° E rather than on</w:t>
-      </w:r>
-      <w:r>
-        <w:t>e weather station. The whole-record means — −14.4 °C in January, +20.6 °C in July — agree with the published 1991–2020 station normals of −14.5 and +20.6 °C [13]. Table 5 gives the main results.</w:t>
+        <w:t>The tool was run on 11 688 daily values for 1 January 1994 – 31 December 2025, downloaded without gaps from the Open-Meteo archive [10]. By default the archive combines the ERA5 and ERA5-Land reanalyses [11] (used here up to 2016) with the operational ECMWF IFS model (from 2017), and it describes a model grid cell near 51.1° N, 71.4° E rather than one weather station. The whole-record means — −14.4 °C in January, +20.6 °C in July — agree with the published 1991–2020 station normals of −14.5 and +20.6 °C [13]. Table 5 gives the main results.</w:t>
       </w:r>
     </w:p>
     <w:p>
@@ -3276,7 +3177,7 @@
     </w:p>
     <w:tbl>
       <w:tblPr>
-        <w:tblStyle w:val="aff0"/>
+        <w:tblStyle w:val="TableGrid"/>
         <w:tblW w:w="0" w:type="auto"/>
         <w:jc w:val="center"/>
         <w:tblLayout w:type="fixed"/>
@@ -3306,13 +3207,7 @@
               <w:rPr>
                 <w:b/>
               </w:rPr>
-              <w:t>Indic</w:t>
-            </w:r>
-            <w:r>
-              <w:rPr>
-                <w:b/>
-              </w:rPr>
-              <w:t>ator</w:t>
+              <w:t>Indicator</w:t>
             </w:r>
           </w:p>
         </w:tc>
@@ -3668,17 +3563,7 @@
     </w:p>
     <w:p>
       <w:r>
-        <w:t xml:space="preserve">The annual mean temperature rose by +0.35 °C per decade (Figure 2). This is of the same order as the 0.33 °C per decade that Kazhydromet reports for the Akmola region over the longer </w:t>
-      </w:r>
-      <w:r>
-        <w:lastRenderedPageBreak/>
-        <w:t>period 1976–2023 [14] (the equal value built into the synthetic sample is</w:t>
-      </w:r>
-      <w:r>
-        <w:t xml:space="preserve"> a coincidence). The result shows why two tests are reported. Least squares gives p = 0.040, formally below 0.05, but the more cautious Mann–Kendall test gives p = 0.089: the least-squares slope is pulled up by the very cold 1996 at the start of the record</w:t>
-      </w:r>
-      <w:r>
-        <w:t xml:space="preserve">, and without that single year it falls to +0.23 °C per decade (p = 0.14). The tool therefore reports the trend as </w:t>
+        <w:t xml:space="preserve">The annual mean temperature rose by +0.35 °C per decade (Figure 2). This is of the same order as the 0.33 °C per decade that Kazhydromet reports for the Akmola region over the longer period 1976–2023 [14] (the equal value built into the synthetic sample is a coincidence). The result shows why two tests are reported. Least squares gives p = 0.040, formally below 0.05, but the more cautious Mann–Kendall test gives p = 0.089: the least-squares slope is pulled up by the very cold 1996 at the start of the record, and without that single year it falls to +0.23 °C per decade (p = 0.14). The tool therefore reports the trend as </w:t>
       </w:r>
       <w:r>
         <w:rPr>
@@ -3687,30 +3572,12 @@
         <w:t>not statistically significant</w:t>
       </w:r>
       <w:r>
-        <w:t xml:space="preserve"> at the 5 % level; a program that printed only the first p-value would have overstated the evidence. The number </w:t>
-      </w:r>
-      <w:r>
-        <w:t xml:space="preserve">of cold days per year (days below the 10th percentile of the same calendar month in the baseline) fell from 37 in 1994–2009 to 31 in 2010–2025, while warm days (above the 90th percentile) hardly changed (36 and 38), so the warming appears mainly as a loss </w:t>
-      </w:r>
-      <w:r>
-        <w:t>of cold extremes.</w:t>
+        <w:t xml:space="preserve"> at the 5 % level; a program that printed only the first p-value would have overstated the evidence. The number of cold days per year (days below the 10th percentile of the same calendar month in the baseline) fell from 37 in 1994–2009 to 31 in 2010–2025, while warm days (above the 90th percentile) hardly changed (36 and 38), so the warming appears mainly as a loss of cold extremes.</w:t>
       </w:r>
     </w:p>
     <w:p>
       <w:r>
-        <w:t>The forecast model — a linear trend, two annual harmonics and first-order autoregressive residuals — explains 96 % of the variance of monthly temperature. In the backtest it was fitted on data up to December 2022 and compared with the nex</w:t>
-      </w:r>
-      <w:r>
-        <w:t>t 36 months: its mean absolute error was 1.80 °C against 1.91 °C for climatology, and 97 % of the observations fell inside the 95 % interval (Figure 3). The gain of 6 % is modest, and the README states the reason: a statistical model cannot predict individ</w:t>
-      </w:r>
-      <w:r>
-        <w:t>ual weather events months ahead. An out-of-sample check is already possible: against Open-Meteo values for January–September 2026, retrieved separately on 6 October 2026, all nine months fell inside the forecast interval, with a mean absolute error of 2.05</w:t>
-      </w:r>
-      <w:r>
-        <w:t> °C against 2.28 °C for climatology. For precipitation the same model explains only 25 % of the variance. The apparent increase of annual totals is not significant (Mann–Kendall p = 0.19) and is inflated by the 2017 change of the underlying model, so it is</w:t>
-      </w:r>
-      <w:r>
-        <w:t xml:space="preserve"> not interpreted as a climate signal. For temperature the change matters little: ERA5-Land alone gives +0.34 °C per decade (Mann–Kendall p = 0.10), so the cautious verdict does not depend on it.</w:t>
+        <w:t>The forecast model — a linear trend, two annual harmonics and first-order autoregressive residuals — explains 96 % of the variance of monthly temperature. In the backtest it was fitted on data up to December 2022 and compared with the next 36 months: its mean absolute error was 1.80 °C against 1.91 °C for climatology, and 97 % of the observations fell inside the 95 % interval (Figure 3). The gain of 6 % is modest, and the README states the reason: a statistical model cannot predict individual weather events months ahead. An out-of-sample check is already possible: against Open-Meteo values for January–September 2026, retrieved separately on 6 October 2026, all nine months fell inside the forecast interval, with a mean absolute error of 2.05 °C against 2.28 °C for climatology. For precipitation the same model explains only 25 % of the variance. The apparent increase of annual totals is not significant (Mann–Kendall p = 0.19) and is inflated by the 2017 change of the underlying model, so it is not interpreted as a climate signal. For temperature the change matters little: ERA5-Land alone gives +0.34 °C per decade (Mann–Kendall p = 0.10), so the cautious verdict does not depend on it.</w:t>
       </w:r>
     </w:p>
     <w:p>
@@ -3768,22 +3635,12 @@
         <w:jc w:val="center"/>
       </w:pPr>
       <w:r>
-        <w:t>Figure 2 – Daily temperature of Astana and the trend of ann</w:t>
-      </w:r>
-      <w:r>
-        <w:t>ual means (real data, 1994–2025)</w:t>
+        <w:t>Figure 2 – Daily temperature of Astana and the trend of annual means (real data, 1994–2025)</w:t>
       </w:r>
     </w:p>
     <w:p>
       <w:r>
-        <w:t xml:space="preserve">Real data also exposed a weakness that the synthetic tests could not. The only value that the outlier filter removed, −33.4 °C on 28 November 1998, was a genuine cold wave confirmed by </w:t>
-      </w:r>
-      <w:r>
-        <w:lastRenderedPageBreak/>
-        <w:t>station records, not an error. The eff</w:t>
-      </w:r>
-      <w:r>
-        <w:t>ect on the trend is negligible, but a rule designed for sensor faults should not be applied blindly to reanalysis data.</w:t>
+        <w:t>Real data also exposed a weakness that the synthetic tests could not. The only value that the outlier filter removed, −33.4 °C on 28 November 1998, was a genuine cold wave confirmed by station records, not an error. The effect on the trend is negligible, but a rule designed for sensor faults should not be applied blindly to reanalysis data.</w:t>
       </w:r>
     </w:p>
     <w:p>
@@ -3846,14 +3703,11 @@
     </w:p>
     <w:p>
       <w:pPr>
-        <w:pStyle w:val="1"/>
+        <w:pStyle w:val="Heading1"/>
       </w:pPr>
       <w:bookmarkStart w:id="7" w:name="_Toc242181038"/>
       <w:r>
-        <w:t xml:space="preserve">6 Links to the repository and </w:t>
-      </w:r>
-      <w:r>
-        <w:t>CI/CD configuration</w:t>
+        <w:t>6 Links to the repository and CI/CD configuration</w:t>
       </w:r>
       <w:bookmarkEnd w:id="7"/>
     </w:p>
@@ -3875,7 +3729,7 @@
     </w:p>
     <w:tbl>
       <w:tblPr>
-        <w:tblStyle w:val="aff0"/>
+        <w:tblStyle w:val="TableGrid"/>
         <w:tblW w:w="0" w:type="auto"/>
         <w:jc w:val="center"/>
         <w:tblLayout w:type="fixed"/>
@@ -4100,14 +3954,7 @@
                   <w:color w:val="0563C1"/>
                   <w:u w:val="single"/>
                 </w:rPr>
-                <w:t>.github</w:t>
-              </w:r>
-              <w:r>
-                <w:rPr>
-                  <w:color w:val="0563C1"/>
-                  <w:u w:val="single"/>
-                </w:rPr>
-                <w:t>/workflows/astana-forecast.yml</w:t>
+                <w:t>.github/workflows/astana-forecast.yml</w:t>
               </w:r>
             </w:hyperlink>
           </w:p>
@@ -4252,7 +4099,7 @@
     </w:p>
     <w:p>
       <w:pPr>
-        <w:pStyle w:val="1"/>
+        <w:pStyle w:val="Heading1"/>
       </w:pPr>
       <w:bookmarkStart w:id="8" w:name="_Toc242181039"/>
       <w:r>
@@ -4262,16 +4109,7 @@
     </w:p>
     <w:p>
       <w:r>
-        <w:t xml:space="preserve">A small scientific tool was taken through every stage of </w:t>
-      </w:r>
-      <w:r>
-        <w:t xml:space="preserve">the software development process. The result is a documented, licensed open-source package with 84 automated tests and a CI/CD pipeline that checks every change on three operating systems, repeats the analysis on fresh data and publishes releases. Applied </w:t>
-      </w:r>
-      <w:r>
-        <w:t xml:space="preserve">to real data for Astana for 1994–2025, the tool estimated a warming of +0.35 °C per decade and reported, by the more cautious Mann–Kendall test, that this trend is not statistically significant at the 5 % level. It also produced a forecast whose skill and </w:t>
-      </w:r>
-      <w:r>
-        <w:t>uncertainty were measured rather than assumed.</w:t>
+        <w:t>A small scientific tool was taken through every stage of the software development process. The result is a documented, licensed open-source package with 84 automated tests and a CI/CD pipeline that checks every change on three operating systems, repeats the analysis on fresh data and publishes releases. Applied to real data for Astana for 1994–2025, the tool estimated a warming of +0.35 °C per decade and reported, by the more cautious Mann–Kendall test, that this trend is not statistically significant at the 5 % level. It also produced a forecast whose skill and uncertainty were measured rather than assumed.</w:t>
       </w:r>
     </w:p>
     <w:p>
@@ -4279,7 +4117,6 @@
         <w:keepNext/>
       </w:pPr>
       <w:r>
-        <w:lastRenderedPageBreak/>
         <w:t>The main challenges encountered during the work were the following.</w:t>
       </w:r>
     </w:p>
@@ -4294,10 +4131,7 @@
         <w:t>No access to the data source during development.</w:t>
       </w:r>
       <w:r>
-        <w:t xml:space="preserve"> The environment in which the code was first written could not reach the Open-Meteo API. Th</w:t>
-      </w:r>
-      <w:r>
-        <w:t>e downloader was therefore designed with an injectable opener and tested on prepared responses, and a synthetic dataset was created. The real download, made later, matched the API response exactly.</w:t>
+        <w:t xml:space="preserve"> The environment in which the code was first written could not reach the Open-Meteo API. The downloader was therefore designed with an injectable opener and tested on prepared responses, and a synthetic dataset was created. The real download, made later, matched the API response exactly.</w:t>
       </w:r>
     </w:p>
     <w:p>
@@ -4311,10 +4145,13 @@
         <w:t>Real data behaves differently from test data.</w:t>
       </w:r>
       <w:r>
-        <w:t xml:space="preserve"> Besides th</w:t>
-      </w:r>
-      <w:r>
-        <w:t>e outlier case above, the first real run showed that the archive changes its underlying model in 2017; the README, written earlier, still describes the source simply as ERA5. Tests on synthetic data could reveal neither problem.</w:t>
+        <w:t xml:space="preserve"> Besides the outlier case above, the first real run showed that the archive changes its underlying model in 2017; the README, written earlier, </w:t>
+      </w:r>
+      <w:r>
+        <w:t>described the source simply as ERA5 and had to be corrected</w:t>
+      </w:r>
+      <w:r>
+        <w:t>. Tests on synthetic data could reveal neither problem.</w:t>
       </w:r>
     </w:p>
     <w:p>
@@ -4325,22 +4162,10 @@
         <w:rPr>
           <w:b/>
         </w:rPr>
-        <w:t>Machine-specific failures</w:t>
-      </w:r>
-      <w:r>
-        <w:rPr>
-          <w:b/>
-        </w:rPr>
-        <w:t>.</w:t>
-      </w:r>
-      <w:r>
-        <w:t xml:space="preserve"> On the Windows development machine the download failed with a TLS error although the server certificate was valid: the system store held an expired intermediate certificate that Python preferred to the valid chain. On that machine the download was run wi</w:t>
-      </w:r>
-      <w:r>
-        <w:t>th the truststore package, which delegates verification to the operating system, instead of switching the check off; the published code was left unchanged. A security policy also blocked the launcher programs that pip generates, so the tools were started a</w:t>
-      </w:r>
-      <w:r>
-        <w:t>s python -m.</w:t>
+        <w:t>Machine-specific failures.</w:t>
+      </w:r>
+      <w:r>
+        <w:t xml:space="preserve"> On the Windows development machine the download failed with a TLS error although the server certificate was valid: the system store held an expired intermediate certificate that Python preferred to the valid chain. On that machine the download was run with the truststore package, which delegates verification to the operating system, instead of switching the check off; the published code was left unchanged. A security policy also blocked the launcher programs that pip generates, so the tools were started as python -m.</w:t>
       </w:r>
     </w:p>
     <w:p>
@@ -4365,32 +4190,26 @@
         <w:rPr>
           <w:b/>
         </w:rPr>
-        <w:t xml:space="preserve">The pipeline needs </w:t>
-      </w:r>
-      <w:r>
-        <w:rPr>
-          <w:b/>
-        </w:rPr>
-        <w:t>maintenance too.</w:t>
-      </w:r>
-      <w:r>
-        <w:t xml:space="preserve"> Within two minutes of the first push Dependabot opened eight update pull requests. They have not been merged yet, so the upgrade of actions/upload-artifact, which would remove GitHub's warning about a deprecated Node.js version, remains th</w:t>
-      </w:r>
-      <w:r>
-        <w:t>e first maintenance task.</w:t>
+        <w:t>The pipeline needs maintenance too.</w:t>
+      </w:r>
+      <w:r>
+        <w:t xml:space="preserve"> Within two minutes of the first push Dependabot opened eight update pull requests. </w:t>
+      </w:r>
+      <w:r>
+        <w:t>They were closed without merging for now</w:t>
+      </w:r>
+      <w:r>
+        <w:t>, so the upgrade of actions/upload-artifact, which would remove GitHub's warning about a deprecated Node.js version, remains the first maintenance task.</w:t>
       </w:r>
     </w:p>
     <w:p>
       <w:r>
-        <w:t xml:space="preserve">The main lesson is that version control, automated testing and continuous integration and delivery are not an addition to scientific work but a condition of its reliability: a result recomputed automatically on an </w:t>
-      </w:r>
-      <w:r>
-        <w:t>independent machine, with tests that know the right answer, can be trusted and reproduced by others.</w:t>
+        <w:t>The main lesson is that version control, automated testing and continuous integration and delivery are not an addition to scientific work but a condition of its reliability: a result recomputed automatically on an independent machine, with tests that know the right answer, can be trusted and reproduced by others.</w:t>
       </w:r>
     </w:p>
     <w:p>
       <w:pPr>
-        <w:pStyle w:val="1"/>
+        <w:pStyle w:val="Heading1"/>
       </w:pPr>
       <w:bookmarkStart w:id="9" w:name="_Toc242181040"/>
       <w:r>
@@ -4412,14 +4231,7 @@
             <w:color w:val="0563C1"/>
             <w:u w:val="single"/>
           </w:rPr>
-          <w:t>https</w:t>
-        </w:r>
-        <w:r>
-          <w:rPr>
-            <w:color w:val="0563C1"/>
-            <w:u w:val="single"/>
-          </w:rPr>
-          <w:t>://github.com/a169n/applied_software_3</w:t>
+          <w:t>https://github.com/a169n/applied_software_3</w:t>
         </w:r>
       </w:hyperlink>
     </w:p>
@@ -4456,10 +4268,7 @@
         <w:jc w:val="left"/>
       </w:pPr>
       <w:r>
-        <w:t>4. Fowler M. Cont</w:t>
-      </w:r>
-      <w:r>
-        <w:t xml:space="preserve">inuous Integration. 2000 (rewritten 2006, revised 2024). URL: </w:t>
+        <w:t xml:space="preserve">4. Fowler M. Continuous Integration. 2000 (rewritten 2006, revised 2024). URL: </w:t>
       </w:r>
       <w:hyperlink r:id="rId21">
         <w:r>
@@ -4477,11 +4286,7 @@
         <w:jc w:val="left"/>
       </w:pPr>
       <w:r>
-        <w:lastRenderedPageBreak/>
-        <w:t>5. Humble J., Farley D. Continuous Delivery: Reliable</w:t>
-      </w:r>
-      <w:r>
-        <w:t xml:space="preserve"> Software Releases through Build, Test, and Deployment Automation. Addison-Wesley, 2010. 512 p.</w:t>
+        <w:t>5. Humble J., Farley D. Continuous Delivery: Reliable Software Releases through Build, Test, and Deployment Automation. Addison-Wesley, 2010. 512 p.</w:t>
       </w:r>
     </w:p>
     <w:p>
@@ -4499,10 +4304,7 @@
         <w:jc w:val="left"/>
       </w:pPr>
       <w:r>
-        <w:t>7. Wilson G. et al. Good Enough Practices in Scient</w:t>
-      </w:r>
-      <w:r>
-        <w:t>ific Computing // PLoS Computational Biology. 2017. Vol. 13, No. 6. e1005510.</w:t>
+        <w:t>7. Wilson G. et al. Good Enough Practices in Scientific Computing // PLoS Computational Biology. 2017. Vol. 13, No. 6. e1005510.</w:t>
       </w:r>
     </w:p>
     <w:p>
@@ -4520,10 +4322,7 @@
         <w:jc w:val="left"/>
       </w:pPr>
       <w:r>
-        <w:t xml:space="preserve">9. Sen P. K. Estimates of the Regression Coefficient Based on Kendall's Tau // </w:t>
-      </w:r>
-      <w:r>
-        <w:t>Journal of the American Statistical Association. 1968. Vol. 63, No. 324. P. 1379–1389.</w:t>
+        <w:t>9. Sen P. K. Estimates of the Regression Coefficient Based on Kendall's Tau // Journal of the American Statistical Association. 1968. Vol. 63, No. 324. P. 1379–1389.</w:t>
       </w:r>
     </w:p>
     <w:p>
@@ -4559,10 +4358,7 @@
         <w:jc w:val="left"/>
       </w:pPr>
       <w:r>
-        <w:t>12. GitHub Act</w:t>
-      </w:r>
-      <w:r>
-        <w:t xml:space="preserve">ions documentation. GitHub Docs. URL: </w:t>
+        <w:t xml:space="preserve">12. GitHub Actions documentation. GitHub Docs. URL: </w:t>
       </w:r>
       <w:hyperlink r:id="rId23">
         <w:r>
@@ -4623,7 +4419,7 @@
 </file>
 
 <file path=word/endnotes.xml><?xml version="1.0" encoding="utf-8"?>
-<w:endnotes xmlns:wpc="http://schemas.microsoft.com/office/word/2010/wordprocessingCanvas" xmlns:cx="http://schemas.microsoft.com/office/drawing/2014/chartex" xmlns:cx1="http://schemas.microsoft.com/office/drawing/2015/9/8/chartex" xmlns:cx2="http://schemas.microsoft.com/office/drawing/2015/10/21/chartex" xmlns:cx3="http://schemas.microsoft.com/office/drawing/2016/5/9/chartex" xmlns:cx4="http://schemas.microsoft.com/office/drawing/2016/5/10/chartex" xmlns:cx5="http://schemas.microsoft.com/office/drawing/2016/5/11/chartex" xmlns:cx6="http://schemas.microsoft.com/office/drawing/2016/5/12/chartex" xmlns:cx7="http://schemas.microsoft.com/office/drawing/2016/5/13/chartex" xmlns:cx8="http://schemas.microsoft.com/office/drawing/2016/5/14/chartex" xmlns:mc="http://schemas.openxmlformats.org/markup-compatibility/2006" xmlns:aink="http://schemas.microsoft.com/office/drawing/2016/ink" xmlns:am3d="http://schemas.microsoft.com/office/drawing/2017/model3d" xmlns:o="urn:schemas-microsoft-com:office:office" xmlns:r="http://schemas.openxmlformats.org/officeDocument/2006/relationships" xmlns:m="http://schemas.openxmlformats.org/officeDocument/2006/math" xmlns:v="urn:schemas-microsoft-com:vml" xmlns:wp14="http://schemas.microsoft.com/office/word/2010/wordprocessingDrawing" xmlns:wp="http://schemas.openxmlformats.org/drawingml/2006/wordprocessingDrawing" xmlns:w10="urn:schemas-microsoft-com:office:word" xmlns:w="http://schemas.openxmlformats.org/wordprocessingml/2006/main" xmlns:w14="http://schemas.microsoft.com/office/word/2010/wordml" xmlns:w15="http://schemas.microsoft.com/office/word/2012/wordml" xmlns:w16cex="http://schemas.microsoft.com/office/word/2018/wordml/cex" xmlns:w16cid="http://schemas.microsoft.com/office/word/2016/wordml/cid" xmlns:w16="http://schemas.microsoft.com/office/word/2018/wordml" xmlns:w16sdtdh="http://schemas.microsoft.com/office/word/2020/wordml/sdtdatahash" xmlns:w16se="http://schemas.microsoft.com/office/word/2015/wordml/symex" xmlns:wpg="http://schemas.microsoft.com/office/word/2010/wordprocessingGroup" xmlns:wpi="http://schemas.microsoft.com/office/word/2010/wordprocessingInk" xmlns:wne="http://schemas.microsoft.com/office/word/2006/wordml" xmlns:wps="http://schemas.microsoft.com/office/word/2010/wordprocessingShape" mc:Ignorable="w14 w15 w16se w16cid w16 w16cex w16sdtdh wp14">
+<w:endnotes xmlns:wpc="http://schemas.microsoft.com/office/word/2010/wordprocessingCanvas" xmlns:cx="http://schemas.microsoft.com/office/drawing/2014/chartex" xmlns:cx1="http://schemas.microsoft.com/office/drawing/2015/9/8/chartex" xmlns:cx2="http://schemas.microsoft.com/office/drawing/2015/10/21/chartex" xmlns:cx3="http://schemas.microsoft.com/office/drawing/2016/5/9/chartex" xmlns:cx4="http://schemas.microsoft.com/office/drawing/2016/5/10/chartex" xmlns:cx5="http://schemas.microsoft.com/office/drawing/2016/5/11/chartex" xmlns:cx6="http://schemas.microsoft.com/office/drawing/2016/5/12/chartex" xmlns:cx7="http://schemas.microsoft.com/office/drawing/2016/5/13/chartex" xmlns:cx8="http://schemas.microsoft.com/office/drawing/2016/5/14/chartex" xmlns:mc="http://schemas.openxmlformats.org/markup-compatibility/2006" xmlns:aink="http://schemas.microsoft.com/office/drawing/2016/ink" xmlns:am3d="http://schemas.microsoft.com/office/drawing/2017/model3d" xmlns:o="urn:schemas-microsoft-com:office:office" xmlns:oel="http://schemas.microsoft.com/office/2019/extlst" xmlns:r="http://schemas.openxmlformats.org/officeDocument/2006/relationships" xmlns:m="http://schemas.openxmlformats.org/officeDocument/2006/math" xmlns:v="urn:schemas-microsoft-com:vml" xmlns:wp14="http://schemas.microsoft.com/office/word/2010/wordprocessingDrawing" xmlns:wp="http://schemas.openxmlformats.org/drawingml/2006/wordprocessingDrawing" xmlns:w10="urn:schemas-microsoft-com:office:word" xmlns:w="http://schemas.openxmlformats.org/wordprocessingml/2006/main" xmlns:w14="http://schemas.microsoft.com/office/word/2010/wordml" xmlns:w15="http://schemas.microsoft.com/office/word/2012/wordml" xmlns:w16cex="http://schemas.microsoft.com/office/word/2018/wordml/cex" xmlns:w16cid="http://schemas.microsoft.com/office/word/2016/wordml/cid" xmlns:w16="http://schemas.microsoft.com/office/word/2018/wordml" xmlns:w16du="http://schemas.microsoft.com/office/word/2023/wordml/word16du" xmlns:w16sdtdh="http://schemas.microsoft.com/office/word/2020/wordml/sdtdatahash" xmlns:w16sdtfl="http://schemas.microsoft.com/office/word/2024/wordml/sdtformatlock" xmlns:w16se="http://schemas.microsoft.com/office/word/2015/wordml/symex" xmlns:wpg="http://schemas.microsoft.com/office/word/2010/wordprocessingGroup" xmlns:wpi="http://schemas.microsoft.com/office/word/2010/wordprocessingInk" xmlns:wne="http://schemas.microsoft.com/office/word/2006/wordml" xmlns:wps="http://schemas.microsoft.com/office/word/2010/wordprocessingShape" mc:Ignorable="w14 w15 w16se w16cid w16 w16cex w16sdtdh w16sdtfl w16du wp14">
   <w:endnote w:type="separator" w:id="-1">
     <w:p>
       <w:pPr>
@@ -4648,10 +4444,10 @@
 </file>
 
 <file path=word/footer1.xml><?xml version="1.0" encoding="utf-8"?>
-<w:ftr xmlns:wpc="http://schemas.microsoft.com/office/word/2010/wordprocessingCanvas" xmlns:cx="http://schemas.microsoft.com/office/drawing/2014/chartex" xmlns:cx1="http://schemas.microsoft.com/office/drawing/2015/9/8/chartex" xmlns:cx2="http://schemas.microsoft.com/office/drawing/2015/10/21/chartex" xmlns:cx3="http://schemas.microsoft.com/office/drawing/2016/5/9/chartex" xmlns:cx4="http://schemas.microsoft.com/office/drawing/2016/5/10/chartex" xmlns:cx5="http://schemas.microsoft.com/office/drawing/2016/5/11/chartex" xmlns:cx6="http://schemas.microsoft.com/office/drawing/2016/5/12/chartex" xmlns:cx7="http://schemas.microsoft.com/office/drawing/2016/5/13/chartex" xmlns:cx8="http://schemas.microsoft.com/office/drawing/2016/5/14/chartex" xmlns:mc="http://schemas.openxmlformats.org/markup-compatibility/2006" xmlns:aink="http://schemas.microsoft.com/office/drawing/2016/ink" xmlns:am3d="http://schemas.microsoft.com/office/drawing/2017/model3d" xmlns:o="urn:schemas-microsoft-com:office:office" xmlns:r="http://schemas.openxmlformats.org/officeDocument/2006/relationships" xmlns:m="http://schemas.openxmlformats.org/officeDocument/2006/math" xmlns:v="urn:schemas-microsoft-com:vml" xmlns:wp14="http://schemas.microsoft.com/office/word/2010/wordprocessingDrawing" xmlns:wp="http://schemas.openxmlformats.org/drawingml/2006/wordprocessingDrawing" xmlns:w10="urn:schemas-microsoft-com:office:word" xmlns:w="http://schemas.openxmlformats.org/wordprocessingml/2006/main" xmlns:w14="http://schemas.microsoft.com/office/word/2010/wordml" xmlns:w15="http://schemas.microsoft.com/office/word/2012/wordml" xmlns:w16cex="http://schemas.microsoft.com/office/word/2018/wordml/cex" xmlns:w16cid="http://schemas.microsoft.com/office/word/2016/wordml/cid" xmlns:w16="http://schemas.microsoft.com/office/word/2018/wordml" xmlns:w16sdtdh="http://schemas.microsoft.com/office/word/2020/wordml/sdtdatahash" xmlns:w16se="http://schemas.microsoft.com/office/word/2015/wordml/symex" xmlns:wpg="http://schemas.microsoft.com/office/word/2010/wordprocessingGroup" xmlns:wpi="http://schemas.microsoft.com/office/word/2010/wordprocessingInk" xmlns:wne="http://schemas.microsoft.com/office/word/2006/wordml" xmlns:wps="http://schemas.microsoft.com/office/word/2010/wordprocessingShape" mc:Ignorable="w14 w15 w16se w16cid w16 w16cex w16sdtdh wp14">
+<w:ftr xmlns:wpc="http://schemas.microsoft.com/office/word/2010/wordprocessingCanvas" xmlns:cx="http://schemas.microsoft.com/office/drawing/2014/chartex" xmlns:cx1="http://schemas.microsoft.com/office/drawing/2015/9/8/chartex" xmlns:cx2="http://schemas.microsoft.com/office/drawing/2015/10/21/chartex" xmlns:cx3="http://schemas.microsoft.com/office/drawing/2016/5/9/chartex" xmlns:cx4="http://schemas.microsoft.com/office/drawing/2016/5/10/chartex" xmlns:cx5="http://schemas.microsoft.com/office/drawing/2016/5/11/chartex" xmlns:cx6="http://schemas.microsoft.com/office/drawing/2016/5/12/chartex" xmlns:cx7="http://schemas.microsoft.com/office/drawing/2016/5/13/chartex" xmlns:cx8="http://schemas.microsoft.com/office/drawing/2016/5/14/chartex" xmlns:mc="http://schemas.openxmlformats.org/markup-compatibility/2006" xmlns:aink="http://schemas.microsoft.com/office/drawing/2016/ink" xmlns:am3d="http://schemas.microsoft.com/office/drawing/2017/model3d" xmlns:o="urn:schemas-microsoft-com:office:office" xmlns:oel="http://schemas.microsoft.com/office/2019/extlst" xmlns:r="http://schemas.openxmlformats.org/officeDocument/2006/relationships" xmlns:m="http://schemas.openxmlformats.org/officeDocument/2006/math" xmlns:v="urn:schemas-microsoft-com:vml" xmlns:wp14="http://schemas.microsoft.com/office/word/2010/wordprocessingDrawing" xmlns:wp="http://schemas.openxmlformats.org/drawingml/2006/wordprocessingDrawing" xmlns:w10="urn:schemas-microsoft-com:office:word" xmlns:w="http://schemas.openxmlformats.org/wordprocessingml/2006/main" xmlns:w14="http://schemas.microsoft.com/office/word/2010/wordml" xmlns:w15="http://schemas.microsoft.com/office/word/2012/wordml" xmlns:w16cex="http://schemas.microsoft.com/office/word/2018/wordml/cex" xmlns:w16cid="http://schemas.microsoft.com/office/word/2016/wordml/cid" xmlns:w16="http://schemas.microsoft.com/office/word/2018/wordml" xmlns:w16du="http://schemas.microsoft.com/office/word/2023/wordml/word16du" xmlns:w16sdtdh="http://schemas.microsoft.com/office/word/2020/wordml/sdtdatahash" xmlns:w16sdtfl="http://schemas.microsoft.com/office/word/2024/wordml/sdtformatlock" xmlns:w16se="http://schemas.microsoft.com/office/word/2015/wordml/symex" xmlns:wpg="http://schemas.microsoft.com/office/word/2010/wordprocessingGroup" xmlns:wpi="http://schemas.microsoft.com/office/word/2010/wordprocessingInk" xmlns:wne="http://schemas.microsoft.com/office/word/2006/wordml" xmlns:wps="http://schemas.microsoft.com/office/word/2010/wordprocessingShape" mc:Ignorable="w14 w15 w16se w16cid w16 w16cex w16sdtdh w16sdtfl w16du wp14">
   <w:p>
     <w:pPr>
-      <w:pStyle w:val="a7"/>
+      <w:pStyle w:val="Footer"/>
       <w:ind w:firstLine="0"/>
       <w:jc w:val="center"/>
     </w:pPr>
@@ -4678,7 +4474,7 @@
 </file>
 
 <file path=word/footnotes.xml><?xml version="1.0" encoding="utf-8"?>
-<w:footnotes xmlns:wpc="http://schemas.microsoft.com/office/word/2010/wordprocessingCanvas" xmlns:cx="http://schemas.microsoft.com/office/drawing/2014/chartex" xmlns:cx1="http://schemas.microsoft.com/office/drawing/2015/9/8/chartex" xmlns:cx2="http://schemas.microsoft.com/office/drawing/2015/10/21/chartex" xmlns:cx3="http://schemas.microsoft.com/office/drawing/2016/5/9/chartex" xmlns:cx4="http://schemas.microsoft.com/office/drawing/2016/5/10/chartex" xmlns:cx5="http://schemas.microsoft.com/office/drawing/2016/5/11/chartex" xmlns:cx6="http://schemas.microsoft.com/office/drawing/2016/5/12/chartex" xmlns:cx7="http://schemas.microsoft.com/office/drawing/2016/5/13/chartex" xmlns:cx8="http://schemas.microsoft.com/office/drawing/2016/5/14/chartex" xmlns:mc="http://schemas.openxmlformats.org/markup-compatibility/2006" xmlns:aink="http://schemas.microsoft.com/office/drawing/2016/ink" xmlns:am3d="http://schemas.microsoft.com/office/drawing/2017/model3d" xmlns:o="urn:schemas-microsoft-com:office:office" xmlns:r="http://schemas.openxmlformats.org/officeDocument/2006/relationships" xmlns:m="http://schemas.openxmlformats.org/officeDocument/2006/math" xmlns:v="urn:schemas-microsoft-com:vml" xmlns:wp14="http://schemas.microsoft.com/office/word/2010/wordprocessingDrawing" xmlns:wp="http://schemas.openxmlformats.org/drawingml/2006/wordprocessingDrawing" xmlns:w10="urn:schemas-microsoft-com:office:word" xmlns:w="http://schemas.openxmlformats.org/wordprocessingml/2006/main" xmlns:w14="http://schemas.microsoft.com/office/word/2010/wordml" xmlns:w15="http://schemas.microsoft.com/office/word/2012/wordml" xmlns:w16cex="http://schemas.microsoft.com/office/word/2018/wordml/cex" xmlns:w16cid="http://schemas.microsoft.com/office/word/2016/wordml/cid" xmlns:w16="http://schemas.microsoft.com/office/word/2018/wordml" xmlns:w16sdtdh="http://schemas.microsoft.com/office/word/2020/wordml/sdtdatahash" xmlns:w16se="http://schemas.microsoft.com/office/word/2015/wordml/symex" xmlns:wpg="http://schemas.microsoft.com/office/word/2010/wordprocessingGroup" xmlns:wpi="http://schemas.microsoft.com/office/word/2010/wordprocessingInk" xmlns:wne="http://schemas.microsoft.com/office/word/2006/wordml" xmlns:wps="http://schemas.microsoft.com/office/word/2010/wordprocessingShape" mc:Ignorable="w14 w15 w16se w16cid w16 w16cex w16sdtdh wp14">
+<w:footnotes xmlns:wpc="http://schemas.microsoft.com/office/word/2010/wordprocessingCanvas" xmlns:cx="http://schemas.microsoft.com/office/drawing/2014/chartex" xmlns:cx1="http://schemas.microsoft.com/office/drawing/2015/9/8/chartex" xmlns:cx2="http://schemas.microsoft.com/office/drawing/2015/10/21/chartex" xmlns:cx3="http://schemas.microsoft.com/office/drawing/2016/5/9/chartex" xmlns:cx4="http://schemas.microsoft.com/office/drawing/2016/5/10/chartex" xmlns:cx5="http://schemas.microsoft.com/office/drawing/2016/5/11/chartex" xmlns:cx6="http://schemas.microsoft.com/office/drawing/2016/5/12/chartex" xmlns:cx7="http://schemas.microsoft.com/office/drawing/2016/5/13/chartex" xmlns:cx8="http://schemas.microsoft.com/office/drawing/2016/5/14/chartex" xmlns:mc="http://schemas.openxmlformats.org/markup-compatibility/2006" xmlns:aink="http://schemas.microsoft.com/office/drawing/2016/ink" xmlns:am3d="http://schemas.microsoft.com/office/drawing/2017/model3d" xmlns:o="urn:schemas-microsoft-com:office:office" xmlns:oel="http://schemas.microsoft.com/office/2019/extlst" xmlns:r="http://schemas.openxmlformats.org/officeDocument/2006/relationships" xmlns:m="http://schemas.openxmlformats.org/officeDocument/2006/math" xmlns:v="urn:schemas-microsoft-com:vml" xmlns:wp14="http://schemas.microsoft.com/office/word/2010/wordprocessingDrawing" xmlns:wp="http://schemas.openxmlformats.org/drawingml/2006/wordprocessingDrawing" xmlns:w10="urn:schemas-microsoft-com:office:word" xmlns:w="http://schemas.openxmlformats.org/wordprocessingml/2006/main" xmlns:w14="http://schemas.microsoft.com/office/word/2010/wordml" xmlns:w15="http://schemas.microsoft.com/office/word/2012/wordml" xmlns:w16cex="http://schemas.microsoft.com/office/word/2018/wordml/cex" xmlns:w16cid="http://schemas.microsoft.com/office/word/2016/wordml/cid" xmlns:w16="http://schemas.microsoft.com/office/word/2018/wordml" xmlns:w16du="http://schemas.microsoft.com/office/word/2023/wordml/word16du" xmlns:w16sdtdh="http://schemas.microsoft.com/office/word/2020/wordml/sdtdatahash" xmlns:w16sdtfl="http://schemas.microsoft.com/office/word/2024/wordml/sdtformatlock" xmlns:w16se="http://schemas.microsoft.com/office/word/2015/wordml/symex" xmlns:wpg="http://schemas.microsoft.com/office/word/2010/wordprocessingGroup" xmlns:wpi="http://schemas.microsoft.com/office/word/2010/wordprocessingInk" xmlns:wne="http://schemas.microsoft.com/office/word/2006/wordml" xmlns:wps="http://schemas.microsoft.com/office/word/2010/wordprocessingShape" mc:Ignorable="w14 w15 w16se w16cid w16 w16cex w16sdtdh w16sdtfl w16du wp14">
   <w:footnote w:type="separator" w:id="-1">
     <w:p>
       <w:pPr>
@@ -4703,7 +4499,7 @@
 </file>
 
 <file path=word/numbering.xml><?xml version="1.0" encoding="utf-8"?>
-<w:numbering xmlns:wpc="http://schemas.microsoft.com/office/word/2010/wordprocessingCanvas" xmlns:cx="http://schemas.microsoft.com/office/drawing/2014/chartex" xmlns:cx1="http://schemas.microsoft.com/office/drawing/2015/9/8/chartex" xmlns:cx2="http://schemas.microsoft.com/office/drawing/2015/10/21/chartex" xmlns:cx3="http://schemas.microsoft.com/office/drawing/2016/5/9/chartex" xmlns:cx4="http://schemas.microsoft.com/office/drawing/2016/5/10/chartex" xmlns:cx5="http://schemas.microsoft.com/office/drawing/2016/5/11/chartex" xmlns:cx6="http://schemas.microsoft.com/office/drawing/2016/5/12/chartex" xmlns:cx7="http://schemas.microsoft.com/office/drawing/2016/5/13/chartex" xmlns:cx8="http://schemas.microsoft.com/office/drawing/2016/5/14/chartex" xmlns:mc="http://schemas.openxmlformats.org/markup-compatibility/2006" xmlns:aink="http://schemas.microsoft.com/office/drawing/2016/ink" xmlns:am3d="http://schemas.microsoft.com/office/drawing/2017/model3d" xmlns:o="urn:schemas-microsoft-com:office:office" xmlns:r="http://schemas.openxmlformats.org/officeDocument/2006/relationships" xmlns:m="http://schemas.openxmlformats.org/officeDocument/2006/math" xmlns:v="urn:schemas-microsoft-com:vml" xmlns:wp14="http://schemas.microsoft.com/office/word/2010/wordprocessingDrawing" xmlns:wp="http://schemas.openxmlformats.org/drawingml/2006/wordprocessingDrawing" xmlns:w10="urn:schemas-microsoft-com:office:word" xmlns:w="http://schemas.openxmlformats.org/wordprocessingml/2006/main" xmlns:w14="http://schemas.microsoft.com/office/word/2010/wordml" xmlns:w15="http://schemas.microsoft.com/office/word/2012/wordml" xmlns:w16cex="http://schemas.microsoft.com/office/word/2018/wordml/cex" xmlns:w16cid="http://schemas.microsoft.com/office/word/2016/wordml/cid" xmlns:w16="http://schemas.microsoft.com/office/word/2018/wordml" xmlns:w16sdtdh="http://schemas.microsoft.com/office/word/2020/wordml/sdtdatahash" xmlns:w16se="http://schemas.microsoft.com/office/word/2015/wordml/symex" xmlns:wpg="http://schemas.microsoft.com/office/word/2010/wordprocessingGroup" xmlns:wpi="http://schemas.microsoft.com/office/word/2010/wordprocessingInk" xmlns:wne="http://schemas.microsoft.com/office/word/2006/wordml" xmlns:wps="http://schemas.microsoft.com/office/word/2010/wordprocessingShape" mc:Ignorable="w14 w15 w16se w16cid w16 w16cex w16sdtdh wp14">
+<w:numbering xmlns:wpc="http://schemas.microsoft.com/office/word/2010/wordprocessingCanvas" xmlns:cx="http://schemas.microsoft.com/office/drawing/2014/chartex" xmlns:cx1="http://schemas.microsoft.com/office/drawing/2015/9/8/chartex" xmlns:cx2="http://schemas.microsoft.com/office/drawing/2015/10/21/chartex" xmlns:cx3="http://schemas.microsoft.com/office/drawing/2016/5/9/chartex" xmlns:cx4="http://schemas.microsoft.com/office/drawing/2016/5/10/chartex" xmlns:cx5="http://schemas.microsoft.com/office/drawing/2016/5/11/chartex" xmlns:cx6="http://schemas.microsoft.com/office/drawing/2016/5/12/chartex" xmlns:cx7="http://schemas.microsoft.com/office/drawing/2016/5/13/chartex" xmlns:cx8="http://schemas.microsoft.com/office/drawing/2016/5/14/chartex" xmlns:mc="http://schemas.openxmlformats.org/markup-compatibility/2006" xmlns:aink="http://schemas.microsoft.com/office/drawing/2016/ink" xmlns:am3d="http://schemas.microsoft.com/office/drawing/2017/model3d" xmlns:o="urn:schemas-microsoft-com:office:office" xmlns:oel="http://schemas.microsoft.com/office/2019/extlst" xmlns:r="http://schemas.openxmlformats.org/officeDocument/2006/relationships" xmlns:m="http://schemas.openxmlformats.org/officeDocument/2006/math" xmlns:v="urn:schemas-microsoft-com:vml" xmlns:wp14="http://schemas.microsoft.com/office/word/2010/wordprocessingDrawing" xmlns:wp="http://schemas.openxmlformats.org/drawingml/2006/wordprocessingDrawing" xmlns:w10="urn:schemas-microsoft-com:office:word" xmlns:w="http://schemas.openxmlformats.org/wordprocessingml/2006/main" xmlns:w14="http://schemas.microsoft.com/office/word/2010/wordml" xmlns:w15="http://schemas.microsoft.com/office/word/2012/wordml" xmlns:w16cex="http://schemas.microsoft.com/office/word/2018/wordml/cex" xmlns:w16cid="http://schemas.microsoft.com/office/word/2016/wordml/cid" xmlns:w16="http://schemas.microsoft.com/office/word/2018/wordml" xmlns:w16du="http://schemas.microsoft.com/office/word/2023/wordml/word16du" xmlns:w16sdtdh="http://schemas.microsoft.com/office/word/2020/wordml/sdtdatahash" xmlns:w16sdtfl="http://schemas.microsoft.com/office/word/2024/wordml/sdtformatlock" xmlns:w16se="http://schemas.microsoft.com/office/word/2015/wordml/symex" xmlns:wpg="http://schemas.microsoft.com/office/word/2010/wordprocessingGroup" xmlns:wpi="http://schemas.microsoft.com/office/word/2010/wordprocessingInk" xmlns:wne="http://schemas.microsoft.com/office/word/2006/wordml" xmlns:wps="http://schemas.microsoft.com/office/word/2010/wordprocessingShape" mc:Ignorable="w14 w15 w16se w16cid w16 w16cex w16sdtdh w16sdtfl w16du wp14">
   <w:abstractNum w:abstractNumId="0" w15:restartNumberingAfterBreak="0">
     <w:nsid w:val="FFFFFF7C"/>
     <w:multiLevelType w:val="singleLevel"/>
@@ -4745,7 +4541,7 @@
     <w:lvl w:ilvl="0">
       <w:start w:val="1"/>
       <w:numFmt w:val="decimal"/>
-      <w:pStyle w:val="3"/>
+      <w:pStyle w:val="ListNumber3"/>
       <w:lvlText w:val="%1."/>
       <w:lvlJc w:val="left"/>
       <w:pPr>
@@ -4763,7 +4559,7 @@
     <w:lvl w:ilvl="0">
       <w:start w:val="1"/>
       <w:numFmt w:val="decimal"/>
-      <w:pStyle w:val="2"/>
+      <w:pStyle w:val="ListNumber2"/>
       <w:lvlText w:val="%1."/>
       <w:lvlJc w:val="left"/>
       <w:pPr>
@@ -4801,7 +4597,7 @@
     <w:lvl w:ilvl="0">
       <w:start w:val="1"/>
       <w:numFmt w:val="bullet"/>
-      <w:pStyle w:val="30"/>
+      <w:pStyle w:val="ListBullet3"/>
       <w:lvlText w:val=""/>
       <w:lvlJc w:val="left"/>
       <w:pPr>
@@ -4822,7 +4618,7 @@
     <w:lvl w:ilvl="0">
       <w:start w:val="1"/>
       <w:numFmt w:val="bullet"/>
-      <w:pStyle w:val="20"/>
+      <w:pStyle w:val="ListBullet2"/>
       <w:lvlText w:val=""/>
       <w:lvlJc w:val="left"/>
       <w:pPr>
@@ -4843,7 +4639,7 @@
     <w:lvl w:ilvl="0">
       <w:start w:val="1"/>
       <w:numFmt w:val="decimal"/>
-      <w:pStyle w:val="a"/>
+      <w:pStyle w:val="ListNumber"/>
       <w:lvlText w:val="%1."/>
       <w:lvlJc w:val="left"/>
       <w:pPr>
@@ -4861,7 +4657,7 @@
     <w:lvl w:ilvl="0">
       <w:start w:val="1"/>
       <w:numFmt w:val="bullet"/>
-      <w:pStyle w:val="a0"/>
+      <w:pStyle w:val="ListBullet"/>
       <w:lvlText w:val=""/>
       <w:lvlJc w:val="left"/>
       <w:pPr>
@@ -4875,38 +4671,38 @@
       </w:rPr>
     </w:lvl>
   </w:abstractNum>
-  <w:num w:numId="1">
+  <w:num w:numId="1" w16cid:durableId="1488322656">
     <w:abstractNumId w:val="8"/>
   </w:num>
-  <w:num w:numId="2">
+  <w:num w:numId="2" w16cid:durableId="1106194518">
     <w:abstractNumId w:val="6"/>
   </w:num>
-  <w:num w:numId="3">
+  <w:num w:numId="3" w16cid:durableId="751048806">
     <w:abstractNumId w:val="5"/>
   </w:num>
-  <w:num w:numId="4">
+  <w:num w:numId="4" w16cid:durableId="800653568">
     <w:abstractNumId w:val="4"/>
   </w:num>
-  <w:num w:numId="5">
+  <w:num w:numId="5" w16cid:durableId="390930950">
     <w:abstractNumId w:val="7"/>
   </w:num>
-  <w:num w:numId="6">
+  <w:num w:numId="6" w16cid:durableId="1662079828">
     <w:abstractNumId w:val="3"/>
   </w:num>
-  <w:num w:numId="7">
+  <w:num w:numId="7" w16cid:durableId="385494921">
     <w:abstractNumId w:val="2"/>
   </w:num>
-  <w:num w:numId="8">
+  <w:num w:numId="8" w16cid:durableId="445386746">
     <w:abstractNumId w:val="1"/>
   </w:num>
-  <w:num w:numId="9">
+  <w:num w:numId="9" w16cid:durableId="1228102276">
     <w:abstractNumId w:val="0"/>
   </w:num>
 </w:numbering>
 </file>
 
 <file path=word/styles.xml><?xml version="1.0" encoding="utf-8"?>
-<w:styles xmlns:mc="http://schemas.openxmlformats.org/markup-compatibility/2006" xmlns:r="http://schemas.openxmlformats.org/officeDocument/2006/relationships" xmlns:w="http://schemas.openxmlformats.org/wordprocessingml/2006/main" xmlns:w14="http://schemas.microsoft.com/office/word/2010/wordml" xmlns:w15="http://schemas.microsoft.com/office/word/2012/wordml" xmlns:w16cex="http://schemas.microsoft.com/office/word/2018/wordml/cex" xmlns:w16cid="http://schemas.microsoft.com/office/word/2016/wordml/cid" xmlns:w16="http://schemas.microsoft.com/office/word/2018/wordml" xmlns:w16sdtdh="http://schemas.microsoft.com/office/word/2020/wordml/sdtdatahash" xmlns:w16se="http://schemas.microsoft.com/office/word/2015/wordml/symex" mc:Ignorable="w14 w15 w16se w16cid w16 w16cex w16sdtdh">
+<w:styles xmlns:mc="http://schemas.openxmlformats.org/markup-compatibility/2006" xmlns:r="http://schemas.openxmlformats.org/officeDocument/2006/relationships" xmlns:w="http://schemas.openxmlformats.org/wordprocessingml/2006/main" xmlns:w14="http://schemas.microsoft.com/office/word/2010/wordml" xmlns:w15="http://schemas.microsoft.com/office/word/2012/wordml" xmlns:w16cex="http://schemas.microsoft.com/office/word/2018/wordml/cex" xmlns:w16cid="http://schemas.microsoft.com/office/word/2016/wordml/cid" xmlns:w16="http://schemas.microsoft.com/office/word/2018/wordml" xmlns:w16du="http://schemas.microsoft.com/office/word/2023/wordml/word16du" xmlns:w16sdtdh="http://schemas.microsoft.com/office/word/2020/wordml/sdtdatahash" xmlns:w16sdtfl="http://schemas.microsoft.com/office/word/2024/wordml/sdtformatlock" xmlns:w16se="http://schemas.microsoft.com/office/word/2015/wordml/symex" mc:Ignorable="w14 w15 w16se w16cid w16 w16cex w16sdtdh w16sdtfl w16du">
   <w:docDefaults>
     <w:rPrDefault>
       <w:rPr>
@@ -5190,11 +4986,6 @@
     <w:lsdException w:name="Book Title" w:uiPriority="33" w:qFormat="1"/>
     <w:lsdException w:name="Bibliography" w:semiHidden="1" w:uiPriority="37" w:unhideWhenUsed="1"/>
     <w:lsdException w:name="TOC Heading" w:semiHidden="1" w:uiPriority="39" w:unhideWhenUsed="1" w:qFormat="1"/>
-    <w:lsdException w:name="Plain Table 5" w:semiHidden="1" w:unhideWhenUsed="1"/>
-    <w:lsdException w:name="Grid Table Light" w:semiHidden="1" w:unhideWhenUsed="1"/>
-    <w:lsdException w:name="Grid Table 1 Light" w:semiHidden="1" w:unhideWhenUsed="1"/>
-    <w:lsdException w:name="Grid Table 2" w:semiHidden="1" w:unhideWhenUsed="1"/>
-    <w:lsdException w:name="Grid Table 3" w:semiHidden="1" w:unhideWhenUsed="1"/>
     <w:lsdException w:name="Grid Table 4" w:uiPriority="49"/>
     <w:lsdException w:name="Grid Table 5 Dark" w:uiPriority="50"/>
     <w:lsdException w:name="Grid Table 6 Colorful" w:uiPriority="51"/>
@@ -5296,7 +5087,7 @@
     <w:lsdException w:name="Unresolved Mention" w:semiHidden="1" w:unhideWhenUsed="1"/>
     <w:lsdException w:name="Smart Link" w:semiHidden="1" w:unhideWhenUsed="1"/>
   </w:latentStyles>
-  <w:style w:type="paragraph" w:default="1" w:styleId="a1">
+  <w:style w:type="paragraph" w:default="1" w:styleId="Normal">
     <w:name w:val="Normal"/>
     <w:qFormat/>
     <w:rsid w:val="00FC693F"/>
@@ -5311,11 +5102,11 @@
       <w:sz w:val="24"/>
     </w:rPr>
   </w:style>
-  <w:style w:type="paragraph" w:styleId="1">
+  <w:style w:type="paragraph" w:styleId="Heading1">
     <w:name w:val="heading 1"/>
-    <w:basedOn w:val="a1"/>
-    <w:next w:val="a1"/>
-    <w:link w:val="10"/>
+    <w:basedOn w:val="Normal"/>
+    <w:next w:val="Normal"/>
+    <w:link w:val="Heading1Char"/>
     <w:uiPriority w:val="9"/>
     <w:qFormat/>
     <w:rsid w:val="00FC693F"/>
@@ -5334,11 +5125,11 @@
       <w:szCs w:val="28"/>
     </w:rPr>
   </w:style>
-  <w:style w:type="paragraph" w:styleId="21">
+  <w:style w:type="paragraph" w:styleId="Heading2">
     <w:name w:val="heading 2"/>
-    <w:basedOn w:val="a1"/>
-    <w:next w:val="a1"/>
-    <w:link w:val="22"/>
+    <w:basedOn w:val="Normal"/>
+    <w:next w:val="Normal"/>
+    <w:link w:val="Heading2Char"/>
     <w:uiPriority w:val="9"/>
     <w:unhideWhenUsed/>
     <w:qFormat/>
@@ -5357,11 +5148,11 @@
       <w:szCs w:val="26"/>
     </w:rPr>
   </w:style>
-  <w:style w:type="paragraph" w:styleId="31">
+  <w:style w:type="paragraph" w:styleId="Heading3">
     <w:name w:val="heading 3"/>
-    <w:basedOn w:val="a1"/>
-    <w:next w:val="a1"/>
-    <w:link w:val="32"/>
+    <w:basedOn w:val="Normal"/>
+    <w:next w:val="Normal"/>
+    <w:link w:val="Heading3Char"/>
     <w:uiPriority w:val="9"/>
     <w:unhideWhenUsed/>
     <w:qFormat/>
@@ -5379,11 +5170,11 @@
       <w:color w:val="4F81BD" w:themeColor="accent1"/>
     </w:rPr>
   </w:style>
-  <w:style w:type="paragraph" w:styleId="4">
+  <w:style w:type="paragraph" w:styleId="Heading4">
     <w:name w:val="heading 4"/>
-    <w:basedOn w:val="a1"/>
-    <w:next w:val="a1"/>
-    <w:link w:val="40"/>
+    <w:basedOn w:val="Normal"/>
+    <w:next w:val="Normal"/>
+    <w:link w:val="Heading4Char"/>
     <w:uiPriority w:val="9"/>
     <w:semiHidden/>
     <w:unhideWhenUsed/>
@@ -5404,11 +5195,11 @@
       <w:color w:val="4F81BD" w:themeColor="accent1"/>
     </w:rPr>
   </w:style>
-  <w:style w:type="paragraph" w:styleId="5">
+  <w:style w:type="paragraph" w:styleId="Heading5">
     <w:name w:val="heading 5"/>
-    <w:basedOn w:val="a1"/>
-    <w:next w:val="a1"/>
-    <w:link w:val="50"/>
+    <w:basedOn w:val="Normal"/>
+    <w:next w:val="Normal"/>
+    <w:link w:val="Heading5Char"/>
     <w:uiPriority w:val="9"/>
     <w:semiHidden/>
     <w:unhideWhenUsed/>
@@ -5425,11 +5216,11 @@
       <w:color w:val="243F60" w:themeColor="accent1" w:themeShade="7F"/>
     </w:rPr>
   </w:style>
-  <w:style w:type="paragraph" w:styleId="6">
+  <w:style w:type="paragraph" w:styleId="Heading6">
     <w:name w:val="heading 6"/>
-    <w:basedOn w:val="a1"/>
-    <w:next w:val="a1"/>
-    <w:link w:val="60"/>
+    <w:basedOn w:val="Normal"/>
+    <w:next w:val="Normal"/>
+    <w:link w:val="Heading6Char"/>
     <w:uiPriority w:val="9"/>
     <w:semiHidden/>
     <w:unhideWhenUsed/>
@@ -5448,11 +5239,11 @@
       <w:color w:val="243F60" w:themeColor="accent1" w:themeShade="7F"/>
     </w:rPr>
   </w:style>
-  <w:style w:type="paragraph" w:styleId="7">
+  <w:style w:type="paragraph" w:styleId="Heading7">
     <w:name w:val="heading 7"/>
-    <w:basedOn w:val="a1"/>
-    <w:next w:val="a1"/>
-    <w:link w:val="70"/>
+    <w:basedOn w:val="Normal"/>
+    <w:next w:val="Normal"/>
+    <w:link w:val="Heading7Char"/>
     <w:uiPriority w:val="9"/>
     <w:semiHidden/>
     <w:unhideWhenUsed/>
@@ -5471,11 +5262,11 @@
       <w:color w:val="404040" w:themeColor="text1" w:themeTint="BF"/>
     </w:rPr>
   </w:style>
-  <w:style w:type="paragraph" w:styleId="8">
+  <w:style w:type="paragraph" w:styleId="Heading8">
     <w:name w:val="heading 8"/>
-    <w:basedOn w:val="a1"/>
-    <w:next w:val="a1"/>
-    <w:link w:val="80"/>
+    <w:basedOn w:val="Normal"/>
+    <w:next w:val="Normal"/>
+    <w:link w:val="Heading8Char"/>
     <w:uiPriority w:val="9"/>
     <w:semiHidden/>
     <w:unhideWhenUsed/>
@@ -5494,11 +5285,11 @@
       <w:szCs w:val="20"/>
     </w:rPr>
   </w:style>
-  <w:style w:type="paragraph" w:styleId="9">
+  <w:style w:type="paragraph" w:styleId="Heading9">
     <w:name w:val="heading 9"/>
-    <w:basedOn w:val="a1"/>
-    <w:next w:val="a1"/>
-    <w:link w:val="90"/>
+    <w:basedOn w:val="Normal"/>
+    <w:next w:val="Normal"/>
+    <w:link w:val="Heading9Char"/>
     <w:uiPriority w:val="9"/>
     <w:semiHidden/>
     <w:unhideWhenUsed/>
@@ -5519,13 +5310,13 @@
       <w:szCs w:val="20"/>
     </w:rPr>
   </w:style>
-  <w:style w:type="character" w:default="1" w:styleId="a2">
+  <w:style w:type="character" w:default="1" w:styleId="DefaultParagraphFont">
     <w:name w:val="Default Paragraph Font"/>
     <w:uiPriority w:val="1"/>
     <w:semiHidden/>
     <w:unhideWhenUsed/>
   </w:style>
-  <w:style w:type="table" w:default="1" w:styleId="a3">
+  <w:style w:type="table" w:default="1" w:styleId="TableNormal">
     <w:name w:val="Normal Table"/>
     <w:uiPriority w:val="99"/>
     <w:semiHidden/>
@@ -5540,16 +5331,16 @@
       </w:tblCellMar>
     </w:tblPr>
   </w:style>
-  <w:style w:type="numbering" w:default="1" w:styleId="a4">
+  <w:style w:type="numbering" w:default="1" w:styleId="NoList">
     <w:name w:val="No List"/>
     <w:uiPriority w:val="99"/>
     <w:semiHidden/>
     <w:unhideWhenUsed/>
   </w:style>
-  <w:style w:type="paragraph" w:styleId="a5">
+  <w:style w:type="paragraph" w:styleId="Header">
     <w:name w:val="header"/>
-    <w:basedOn w:val="a1"/>
-    <w:link w:val="a6"/>
+    <w:basedOn w:val="Normal"/>
+    <w:link w:val="HeaderChar"/>
     <w:uiPriority w:val="99"/>
     <w:unhideWhenUsed/>
     <w:rsid w:val="00E618BF"/>
@@ -5561,17 +5352,17 @@
       <w:spacing w:line="240" w:lineRule="auto"/>
     </w:pPr>
   </w:style>
-  <w:style w:type="character" w:customStyle="1" w:styleId="a6">
-    <w:name w:val="Верхний колонтитул Знак"/>
-    <w:basedOn w:val="a2"/>
-    <w:link w:val="a5"/>
+  <w:style w:type="character" w:customStyle="1" w:styleId="HeaderChar">
+    <w:name w:val="Header Char"/>
+    <w:basedOn w:val="DefaultParagraphFont"/>
+    <w:link w:val="Header"/>
     <w:uiPriority w:val="99"/>
     <w:rsid w:val="00E618BF"/>
   </w:style>
-  <w:style w:type="paragraph" w:styleId="a7">
+  <w:style w:type="paragraph" w:styleId="Footer">
     <w:name w:val="footer"/>
-    <w:basedOn w:val="a1"/>
-    <w:link w:val="a8"/>
+    <w:basedOn w:val="Normal"/>
+    <w:link w:val="FooterChar"/>
     <w:uiPriority w:val="99"/>
     <w:unhideWhenUsed/>
     <w:rsid w:val="00E618BF"/>
@@ -5583,14 +5374,14 @@
       <w:spacing w:line="240" w:lineRule="auto"/>
     </w:pPr>
   </w:style>
-  <w:style w:type="character" w:customStyle="1" w:styleId="a8">
-    <w:name w:val="Нижний колонтитул Знак"/>
-    <w:basedOn w:val="a2"/>
-    <w:link w:val="a7"/>
+  <w:style w:type="character" w:customStyle="1" w:styleId="FooterChar">
+    <w:name w:val="Footer Char"/>
+    <w:basedOn w:val="DefaultParagraphFont"/>
+    <w:link w:val="Footer"/>
     <w:uiPriority w:val="99"/>
     <w:rsid w:val="00E618BF"/>
   </w:style>
-  <w:style w:type="paragraph" w:styleId="a9">
+  <w:style w:type="paragraph" w:styleId="NoSpacing">
     <w:name w:val="No Spacing"/>
     <w:uiPriority w:val="1"/>
     <w:qFormat/>
@@ -5599,10 +5390,10 @@
       <w:spacing w:after="0" w:line="240" w:lineRule="auto"/>
     </w:pPr>
   </w:style>
-  <w:style w:type="character" w:customStyle="1" w:styleId="10">
-    <w:name w:val="Заголовок 1 Знак"/>
-    <w:basedOn w:val="a2"/>
-    <w:link w:val="1"/>
+  <w:style w:type="character" w:customStyle="1" w:styleId="Heading1Char">
+    <w:name w:val="Heading 1 Char"/>
+    <w:basedOn w:val="DefaultParagraphFont"/>
+    <w:link w:val="Heading1"/>
     <w:uiPriority w:val="9"/>
     <w:rsid w:val="00FC693F"/>
     <w:rPr>
@@ -5614,10 +5405,10 @@
       <w:szCs w:val="28"/>
     </w:rPr>
   </w:style>
-  <w:style w:type="character" w:customStyle="1" w:styleId="22">
-    <w:name w:val="Заголовок 2 Знак"/>
-    <w:basedOn w:val="a2"/>
-    <w:link w:val="21"/>
+  <w:style w:type="character" w:customStyle="1" w:styleId="Heading2Char">
+    <w:name w:val="Heading 2 Char"/>
+    <w:basedOn w:val="DefaultParagraphFont"/>
+    <w:link w:val="Heading2"/>
     <w:uiPriority w:val="9"/>
     <w:rsid w:val="00FC693F"/>
     <w:rPr>
@@ -5629,10 +5420,10 @@
       <w:szCs w:val="26"/>
     </w:rPr>
   </w:style>
-  <w:style w:type="character" w:customStyle="1" w:styleId="32">
-    <w:name w:val="Заголовок 3 Знак"/>
-    <w:basedOn w:val="a2"/>
-    <w:link w:val="31"/>
+  <w:style w:type="character" w:customStyle="1" w:styleId="Heading3Char">
+    <w:name w:val="Heading 3 Char"/>
+    <w:basedOn w:val="DefaultParagraphFont"/>
+    <w:link w:val="Heading3"/>
     <w:uiPriority w:val="9"/>
     <w:rsid w:val="00FC693F"/>
     <w:rPr>
@@ -5642,11 +5433,11 @@
       <w:color w:val="4F81BD" w:themeColor="accent1"/>
     </w:rPr>
   </w:style>
-  <w:style w:type="paragraph" w:styleId="aa">
+  <w:style w:type="paragraph" w:styleId="Title">
     <w:name w:val="Title"/>
-    <w:basedOn w:val="a1"/>
-    <w:next w:val="a1"/>
-    <w:link w:val="ab"/>
+    <w:basedOn w:val="Normal"/>
+    <w:next w:val="Normal"/>
+    <w:link w:val="TitleChar"/>
     <w:uiPriority w:val="10"/>
     <w:qFormat/>
     <w:rsid w:val="00FC693F"/>
@@ -5666,10 +5457,10 @@
       <w:szCs w:val="52"/>
     </w:rPr>
   </w:style>
-  <w:style w:type="character" w:customStyle="1" w:styleId="ab">
-    <w:name w:val="Заголовок Знак"/>
-    <w:basedOn w:val="a2"/>
-    <w:link w:val="aa"/>
+  <w:style w:type="character" w:customStyle="1" w:styleId="TitleChar">
+    <w:name w:val="Title Char"/>
+    <w:basedOn w:val="DefaultParagraphFont"/>
+    <w:link w:val="Title"/>
     <w:uiPriority w:val="10"/>
     <w:rsid w:val="00FC693F"/>
     <w:rPr>
@@ -5681,11 +5472,11 @@
       <w:szCs w:val="52"/>
     </w:rPr>
   </w:style>
-  <w:style w:type="paragraph" w:styleId="ac">
+  <w:style w:type="paragraph" w:styleId="Subtitle">
     <w:name w:val="Subtitle"/>
-    <w:basedOn w:val="a1"/>
-    <w:next w:val="a1"/>
-    <w:link w:val="ad"/>
+    <w:basedOn w:val="Normal"/>
+    <w:next w:val="Normal"/>
+    <w:link w:val="SubtitleChar"/>
     <w:uiPriority w:val="11"/>
     <w:qFormat/>
     <w:rsid w:val="00FC693F"/>
@@ -5704,10 +5495,10 @@
       <w:szCs w:val="24"/>
     </w:rPr>
   </w:style>
-  <w:style w:type="character" w:customStyle="1" w:styleId="ad">
-    <w:name w:val="Подзаголовок Знак"/>
-    <w:basedOn w:val="a2"/>
-    <w:link w:val="ac"/>
+  <w:style w:type="character" w:customStyle="1" w:styleId="SubtitleChar">
+    <w:name w:val="Subtitle Char"/>
+    <w:basedOn w:val="DefaultParagraphFont"/>
+    <w:link w:val="Subtitle"/>
     <w:uiPriority w:val="11"/>
     <w:rsid w:val="00FC693F"/>
     <w:rPr>
@@ -5720,9 +5511,9 @@
       <w:szCs w:val="24"/>
     </w:rPr>
   </w:style>
-  <w:style w:type="paragraph" w:styleId="ae">
+  <w:style w:type="paragraph" w:styleId="ListParagraph">
     <w:name w:val="List Paragraph"/>
-    <w:basedOn w:val="a1"/>
+    <w:basedOn w:val="Normal"/>
     <w:uiPriority w:val="34"/>
     <w:qFormat/>
     <w:rsid w:val="00FC693F"/>
@@ -5731,10 +5522,10 @@
       <w:contextualSpacing/>
     </w:pPr>
   </w:style>
-  <w:style w:type="paragraph" w:styleId="af">
+  <w:style w:type="paragraph" w:styleId="BodyText">
     <w:name w:val="Body Text"/>
-    <w:basedOn w:val="a1"/>
-    <w:link w:val="af0"/>
+    <w:basedOn w:val="Normal"/>
+    <w:link w:val="BodyTextChar"/>
     <w:uiPriority w:val="99"/>
     <w:unhideWhenUsed/>
     <w:rsid w:val="00AA1D8D"/>
@@ -5742,17 +5533,17 @@
       <w:spacing w:after="120"/>
     </w:pPr>
   </w:style>
-  <w:style w:type="character" w:customStyle="1" w:styleId="af0">
-    <w:name w:val="Основной текст Знак"/>
-    <w:basedOn w:val="a2"/>
-    <w:link w:val="af"/>
+  <w:style w:type="character" w:customStyle="1" w:styleId="BodyTextChar">
+    <w:name w:val="Body Text Char"/>
+    <w:basedOn w:val="DefaultParagraphFont"/>
+    <w:link w:val="BodyText"/>
     <w:uiPriority w:val="99"/>
     <w:rsid w:val="00AA1D8D"/>
   </w:style>
-  <w:style w:type="paragraph" w:styleId="23">
+  <w:style w:type="paragraph" w:styleId="BodyText2">
     <w:name w:val="Body Text 2"/>
-    <w:basedOn w:val="a1"/>
-    <w:link w:val="24"/>
+    <w:basedOn w:val="Normal"/>
+    <w:link w:val="BodyText2Char"/>
     <w:uiPriority w:val="99"/>
     <w:unhideWhenUsed/>
     <w:rsid w:val="00AA1D8D"/>
@@ -5760,17 +5551,17 @@
       <w:spacing w:after="120" w:line="480" w:lineRule="auto"/>
     </w:pPr>
   </w:style>
-  <w:style w:type="character" w:customStyle="1" w:styleId="24">
-    <w:name w:val="Основной текст 2 Знак"/>
-    <w:basedOn w:val="a2"/>
-    <w:link w:val="23"/>
+  <w:style w:type="character" w:customStyle="1" w:styleId="BodyText2Char">
+    <w:name w:val="Body Text 2 Char"/>
+    <w:basedOn w:val="DefaultParagraphFont"/>
+    <w:link w:val="BodyText2"/>
     <w:uiPriority w:val="99"/>
     <w:rsid w:val="00AA1D8D"/>
   </w:style>
-  <w:style w:type="paragraph" w:styleId="33">
+  <w:style w:type="paragraph" w:styleId="BodyText3">
     <w:name w:val="Body Text 3"/>
-    <w:basedOn w:val="a1"/>
-    <w:link w:val="34"/>
+    <w:basedOn w:val="Normal"/>
+    <w:link w:val="BodyText3Char"/>
     <w:uiPriority w:val="99"/>
     <w:unhideWhenUsed/>
     <w:rsid w:val="00AA1D8D"/>
@@ -5782,10 +5573,10 @@
       <w:szCs w:val="16"/>
     </w:rPr>
   </w:style>
-  <w:style w:type="character" w:customStyle="1" w:styleId="34">
-    <w:name w:val="Основной текст 3 Знак"/>
-    <w:basedOn w:val="a2"/>
-    <w:link w:val="33"/>
+  <w:style w:type="character" w:customStyle="1" w:styleId="BodyText3Char">
+    <w:name w:val="Body Text 3 Char"/>
+    <w:basedOn w:val="DefaultParagraphFont"/>
+    <w:link w:val="BodyText3"/>
     <w:uiPriority w:val="99"/>
     <w:rsid w:val="00AA1D8D"/>
     <w:rPr>
@@ -5793,9 +5584,9 @@
       <w:szCs w:val="16"/>
     </w:rPr>
   </w:style>
-  <w:style w:type="paragraph" w:styleId="af1">
+  <w:style w:type="paragraph" w:styleId="List">
     <w:name w:val="List"/>
-    <w:basedOn w:val="a1"/>
+    <w:basedOn w:val="Normal"/>
     <w:uiPriority w:val="99"/>
     <w:unhideWhenUsed/>
     <w:rsid w:val="00AA1D8D"/>
@@ -5804,9 +5595,9 @@
       <w:contextualSpacing/>
     </w:pPr>
   </w:style>
-  <w:style w:type="paragraph" w:styleId="25">
+  <w:style w:type="paragraph" w:styleId="List2">
     <w:name w:val="List 2"/>
-    <w:basedOn w:val="a1"/>
+    <w:basedOn w:val="Normal"/>
     <w:uiPriority w:val="99"/>
     <w:unhideWhenUsed/>
     <w:rsid w:val="00326F90"/>
@@ -5815,9 +5606,9 @@
       <w:contextualSpacing/>
     </w:pPr>
   </w:style>
-  <w:style w:type="paragraph" w:styleId="35">
+  <w:style w:type="paragraph" w:styleId="List3">
     <w:name w:val="List 3"/>
-    <w:basedOn w:val="a1"/>
+    <w:basedOn w:val="Normal"/>
     <w:uiPriority w:val="99"/>
     <w:unhideWhenUsed/>
     <w:rsid w:val="00326F90"/>
@@ -5826,9 +5617,9 @@
       <w:contextualSpacing/>
     </w:pPr>
   </w:style>
-  <w:style w:type="paragraph" w:styleId="a0">
+  <w:style w:type="paragraph" w:styleId="ListBullet">
     <w:name w:val="List Bullet"/>
-    <w:basedOn w:val="a1"/>
+    <w:basedOn w:val="Normal"/>
     <w:uiPriority w:val="99"/>
     <w:unhideWhenUsed/>
     <w:rsid w:val="00326F90"/>
@@ -5839,9 +5630,9 @@
       <w:contextualSpacing/>
     </w:pPr>
   </w:style>
-  <w:style w:type="paragraph" w:styleId="20">
+  <w:style w:type="paragraph" w:styleId="ListBullet2">
     <w:name w:val="List Bullet 2"/>
-    <w:basedOn w:val="a1"/>
+    <w:basedOn w:val="Normal"/>
     <w:uiPriority w:val="99"/>
     <w:unhideWhenUsed/>
     <w:rsid w:val="00326F90"/>
@@ -5852,9 +5643,9 @@
       <w:contextualSpacing/>
     </w:pPr>
   </w:style>
-  <w:style w:type="paragraph" w:styleId="30">
+  <w:style w:type="paragraph" w:styleId="ListBullet3">
     <w:name w:val="List Bullet 3"/>
-    <w:basedOn w:val="a1"/>
+    <w:basedOn w:val="Normal"/>
     <w:uiPriority w:val="99"/>
     <w:unhideWhenUsed/>
     <w:rsid w:val="00326F90"/>
@@ -5865,9 +5656,9 @@
       <w:contextualSpacing/>
     </w:pPr>
   </w:style>
-  <w:style w:type="paragraph" w:styleId="a">
+  <w:style w:type="paragraph" w:styleId="ListNumber">
     <w:name w:val="List Number"/>
-    <w:basedOn w:val="a1"/>
+    <w:basedOn w:val="Normal"/>
     <w:uiPriority w:val="99"/>
     <w:unhideWhenUsed/>
     <w:rsid w:val="00326F90"/>
@@ -5878,9 +5669,9 @@
       <w:contextualSpacing/>
     </w:pPr>
   </w:style>
-  <w:style w:type="paragraph" w:styleId="2">
+  <w:style w:type="paragraph" w:styleId="ListNumber2">
     <w:name w:val="List Number 2"/>
-    <w:basedOn w:val="a1"/>
+    <w:basedOn w:val="Normal"/>
     <w:uiPriority w:val="99"/>
     <w:unhideWhenUsed/>
     <w:rsid w:val="0029639D"/>
@@ -5891,9 +5682,9 @@
       <w:contextualSpacing/>
     </w:pPr>
   </w:style>
-  <w:style w:type="paragraph" w:styleId="3">
+  <w:style w:type="paragraph" w:styleId="ListNumber3">
     <w:name w:val="List Number 3"/>
-    <w:basedOn w:val="a1"/>
+    <w:basedOn w:val="Normal"/>
     <w:uiPriority w:val="99"/>
     <w:unhideWhenUsed/>
     <w:rsid w:val="0029639D"/>
@@ -5904,9 +5695,9 @@
       <w:contextualSpacing/>
     </w:pPr>
   </w:style>
-  <w:style w:type="paragraph" w:styleId="af2">
+  <w:style w:type="paragraph" w:styleId="ListContinue">
     <w:name w:val="List Continue"/>
-    <w:basedOn w:val="a1"/>
+    <w:basedOn w:val="Normal"/>
     <w:uiPriority w:val="99"/>
     <w:unhideWhenUsed/>
     <w:rsid w:val="0029639D"/>
@@ -5916,9 +5707,9 @@
       <w:contextualSpacing/>
     </w:pPr>
   </w:style>
-  <w:style w:type="paragraph" w:styleId="26">
+  <w:style w:type="paragraph" w:styleId="ListContinue2">
     <w:name w:val="List Continue 2"/>
-    <w:basedOn w:val="a1"/>
+    <w:basedOn w:val="Normal"/>
     <w:uiPriority w:val="99"/>
     <w:unhideWhenUsed/>
     <w:rsid w:val="0029639D"/>
@@ -5928,9 +5719,9 @@
       <w:contextualSpacing/>
     </w:pPr>
   </w:style>
-  <w:style w:type="paragraph" w:styleId="36">
+  <w:style w:type="paragraph" w:styleId="ListContinue3">
     <w:name w:val="List Continue 3"/>
-    <w:basedOn w:val="a1"/>
+    <w:basedOn w:val="Normal"/>
     <w:uiPriority w:val="99"/>
     <w:unhideWhenUsed/>
     <w:rsid w:val="0029639D"/>
@@ -5940,9 +5731,9 @@
       <w:contextualSpacing/>
     </w:pPr>
   </w:style>
-  <w:style w:type="paragraph" w:styleId="af3">
+  <w:style w:type="paragraph" w:styleId="MacroText">
     <w:name w:val="macro"/>
-    <w:link w:val="af4"/>
+    <w:link w:val="MacroTextChar"/>
     <w:uiPriority w:val="99"/>
     <w:unhideWhenUsed/>
     <w:rsid w:val="0029639D"/>
@@ -5963,10 +5754,10 @@
       <w:szCs w:val="20"/>
     </w:rPr>
   </w:style>
-  <w:style w:type="character" w:customStyle="1" w:styleId="af4">
-    <w:name w:val="Текст макроса Знак"/>
-    <w:basedOn w:val="a2"/>
-    <w:link w:val="af3"/>
+  <w:style w:type="character" w:customStyle="1" w:styleId="MacroTextChar">
+    <w:name w:val="Macro Text Char"/>
+    <w:basedOn w:val="DefaultParagraphFont"/>
+    <w:link w:val="MacroText"/>
     <w:uiPriority w:val="99"/>
     <w:rsid w:val="0029639D"/>
     <w:rPr>
@@ -5975,11 +5766,11 @@
       <w:szCs w:val="20"/>
     </w:rPr>
   </w:style>
-  <w:style w:type="paragraph" w:styleId="27">
+  <w:style w:type="paragraph" w:styleId="Quote">
     <w:name w:val="Quote"/>
-    <w:basedOn w:val="a1"/>
-    <w:next w:val="a1"/>
-    <w:link w:val="28"/>
+    <w:basedOn w:val="Normal"/>
+    <w:next w:val="Normal"/>
+    <w:link w:val="QuoteChar"/>
     <w:uiPriority w:val="29"/>
     <w:qFormat/>
     <w:rsid w:val="00FC693F"/>
@@ -5989,10 +5780,10 @@
       <w:color w:val="000000" w:themeColor="text1"/>
     </w:rPr>
   </w:style>
-  <w:style w:type="character" w:customStyle="1" w:styleId="28">
-    <w:name w:val="Цитата 2 Знак"/>
-    <w:basedOn w:val="a2"/>
-    <w:link w:val="27"/>
+  <w:style w:type="character" w:customStyle="1" w:styleId="QuoteChar">
+    <w:name w:val="Quote Char"/>
+    <w:basedOn w:val="DefaultParagraphFont"/>
+    <w:link w:val="Quote"/>
     <w:uiPriority w:val="29"/>
     <w:rsid w:val="00FC693F"/>
     <w:rPr>
@@ -6001,10 +5792,10 @@
       <w:color w:val="000000" w:themeColor="text1"/>
     </w:rPr>
   </w:style>
-  <w:style w:type="character" w:customStyle="1" w:styleId="40">
-    <w:name w:val="Заголовок 4 Знак"/>
-    <w:basedOn w:val="a2"/>
-    <w:link w:val="4"/>
+  <w:style w:type="character" w:customStyle="1" w:styleId="Heading4Char">
+    <w:name w:val="Heading 4 Char"/>
+    <w:basedOn w:val="DefaultParagraphFont"/>
+    <w:link w:val="Heading4"/>
     <w:uiPriority w:val="9"/>
     <w:semiHidden/>
     <w:rsid w:val="00FC693F"/>
@@ -6017,10 +5808,10 @@
       <w:color w:val="4F81BD" w:themeColor="accent1"/>
     </w:rPr>
   </w:style>
-  <w:style w:type="character" w:customStyle="1" w:styleId="50">
-    <w:name w:val="Заголовок 5 Знак"/>
-    <w:basedOn w:val="a2"/>
-    <w:link w:val="5"/>
+  <w:style w:type="character" w:customStyle="1" w:styleId="Heading5Char">
+    <w:name w:val="Heading 5 Char"/>
+    <w:basedOn w:val="DefaultParagraphFont"/>
+    <w:link w:val="Heading5"/>
     <w:uiPriority w:val="9"/>
     <w:semiHidden/>
     <w:rsid w:val="00FC693F"/>
@@ -6029,10 +5820,10 @@
       <w:color w:val="243F60" w:themeColor="accent1" w:themeShade="7F"/>
     </w:rPr>
   </w:style>
-  <w:style w:type="character" w:customStyle="1" w:styleId="60">
-    <w:name w:val="Заголовок 6 Знак"/>
-    <w:basedOn w:val="a2"/>
-    <w:link w:val="6"/>
+  <w:style w:type="character" w:customStyle="1" w:styleId="Heading6Char">
+    <w:name w:val="Heading 6 Char"/>
+    <w:basedOn w:val="DefaultParagraphFont"/>
+    <w:link w:val="Heading6"/>
     <w:uiPriority w:val="9"/>
     <w:semiHidden/>
     <w:rsid w:val="00FC693F"/>
@@ -6043,10 +5834,10 @@
       <w:color w:val="243F60" w:themeColor="accent1" w:themeShade="7F"/>
     </w:rPr>
   </w:style>
-  <w:style w:type="character" w:customStyle="1" w:styleId="70">
-    <w:name w:val="Заголовок 7 Знак"/>
-    <w:basedOn w:val="a2"/>
-    <w:link w:val="7"/>
+  <w:style w:type="character" w:customStyle="1" w:styleId="Heading7Char">
+    <w:name w:val="Heading 7 Char"/>
+    <w:basedOn w:val="DefaultParagraphFont"/>
+    <w:link w:val="Heading7"/>
     <w:uiPriority w:val="9"/>
     <w:semiHidden/>
     <w:rsid w:val="00FC693F"/>
@@ -6057,10 +5848,10 @@
       <w:color w:val="404040" w:themeColor="text1" w:themeTint="BF"/>
     </w:rPr>
   </w:style>
-  <w:style w:type="character" w:customStyle="1" w:styleId="80">
-    <w:name w:val="Заголовок 8 Знак"/>
-    <w:basedOn w:val="a2"/>
-    <w:link w:val="8"/>
+  <w:style w:type="character" w:customStyle="1" w:styleId="Heading8Char">
+    <w:name w:val="Heading 8 Char"/>
+    <w:basedOn w:val="DefaultParagraphFont"/>
+    <w:link w:val="Heading8"/>
     <w:uiPriority w:val="9"/>
     <w:semiHidden/>
     <w:rsid w:val="00FC693F"/>
@@ -6071,10 +5862,10 @@
       <w:szCs w:val="20"/>
     </w:rPr>
   </w:style>
-  <w:style w:type="character" w:customStyle="1" w:styleId="90">
-    <w:name w:val="Заголовок 9 Знак"/>
-    <w:basedOn w:val="a2"/>
-    <w:link w:val="9"/>
+  <w:style w:type="character" w:customStyle="1" w:styleId="Heading9Char">
+    <w:name w:val="Heading 9 Char"/>
+    <w:basedOn w:val="DefaultParagraphFont"/>
+    <w:link w:val="Heading9"/>
     <w:uiPriority w:val="9"/>
     <w:semiHidden/>
     <w:rsid w:val="00FC693F"/>
@@ -6087,10 +5878,10 @@
       <w:szCs w:val="20"/>
     </w:rPr>
   </w:style>
-  <w:style w:type="paragraph" w:styleId="af5">
+  <w:style w:type="paragraph" w:styleId="Caption">
     <w:name w:val="caption"/>
-    <w:basedOn w:val="a1"/>
-    <w:next w:val="a1"/>
+    <w:basedOn w:val="Normal"/>
+    <w:next w:val="Normal"/>
     <w:uiPriority w:val="35"/>
     <w:semiHidden/>
     <w:unhideWhenUsed/>
@@ -6107,9 +5898,9 @@
       <w:szCs w:val="18"/>
     </w:rPr>
   </w:style>
-  <w:style w:type="character" w:styleId="af6">
+  <w:style w:type="character" w:styleId="Strong">
     <w:name w:val="Strong"/>
-    <w:basedOn w:val="a2"/>
+    <w:basedOn w:val="DefaultParagraphFont"/>
     <w:uiPriority w:val="22"/>
     <w:qFormat/>
     <w:rsid w:val="00FC693F"/>
@@ -6118,9 +5909,9 @@
       <w:bCs/>
     </w:rPr>
   </w:style>
-  <w:style w:type="character" w:styleId="af7">
+  <w:style w:type="character" w:styleId="Emphasis">
     <w:name w:val="Emphasis"/>
-    <w:basedOn w:val="a2"/>
+    <w:basedOn w:val="DefaultParagraphFont"/>
     <w:uiPriority w:val="20"/>
     <w:qFormat/>
     <w:rsid w:val="00FC693F"/>
@@ -6129,11 +5920,11 @@
       <w:iCs/>
     </w:rPr>
   </w:style>
-  <w:style w:type="paragraph" w:styleId="af8">
+  <w:style w:type="paragraph" w:styleId="IntenseQuote">
     <w:name w:val="Intense Quote"/>
-    <w:basedOn w:val="a1"/>
-    <w:next w:val="a1"/>
-    <w:link w:val="af9"/>
+    <w:basedOn w:val="Normal"/>
+    <w:next w:val="Normal"/>
+    <w:link w:val="IntenseQuoteChar"/>
     <w:uiPriority w:val="30"/>
     <w:qFormat/>
     <w:rsid w:val="00FC693F"/>
@@ -6152,10 +5943,10 @@
       <w:color w:val="4F81BD" w:themeColor="accent1"/>
     </w:rPr>
   </w:style>
-  <w:style w:type="character" w:customStyle="1" w:styleId="af9">
-    <w:name w:val="Выделенная цитата Знак"/>
-    <w:basedOn w:val="a2"/>
-    <w:link w:val="af8"/>
+  <w:style w:type="character" w:customStyle="1" w:styleId="IntenseQuoteChar">
+    <w:name w:val="Intense Quote Char"/>
+    <w:basedOn w:val="DefaultParagraphFont"/>
+    <w:link w:val="IntenseQuote"/>
     <w:uiPriority w:val="30"/>
     <w:rsid w:val="00FC693F"/>
     <w:rPr>
@@ -6166,9 +5957,9 @@
       <w:color w:val="4F81BD" w:themeColor="accent1"/>
     </w:rPr>
   </w:style>
-  <w:style w:type="character" w:styleId="afa">
+  <w:style w:type="character" w:styleId="SubtleEmphasis">
     <w:name w:val="Subtle Emphasis"/>
-    <w:basedOn w:val="a2"/>
+    <w:basedOn w:val="DefaultParagraphFont"/>
     <w:uiPriority w:val="19"/>
     <w:qFormat/>
     <w:rsid w:val="00FC693F"/>
@@ -6178,9 +5969,9 @@
       <w:color w:val="808080" w:themeColor="text1" w:themeTint="7F"/>
     </w:rPr>
   </w:style>
-  <w:style w:type="character" w:styleId="afb">
+  <w:style w:type="character" w:styleId="IntenseEmphasis">
     <w:name w:val="Intense Emphasis"/>
-    <w:basedOn w:val="a2"/>
+    <w:basedOn w:val="DefaultParagraphFont"/>
     <w:uiPriority w:val="21"/>
     <w:qFormat/>
     <w:rsid w:val="00FC693F"/>
@@ -6192,9 +5983,9 @@
       <w:color w:val="4F81BD" w:themeColor="accent1"/>
     </w:rPr>
   </w:style>
-  <w:style w:type="character" w:styleId="afc">
+  <w:style w:type="character" w:styleId="SubtleReference">
     <w:name w:val="Subtle Reference"/>
-    <w:basedOn w:val="a2"/>
+    <w:basedOn w:val="DefaultParagraphFont"/>
     <w:uiPriority w:val="31"/>
     <w:qFormat/>
     <w:rsid w:val="00FC693F"/>
@@ -6204,9 +5995,9 @@
       <w:u w:val="single"/>
     </w:rPr>
   </w:style>
-  <w:style w:type="character" w:styleId="afd">
+  <w:style w:type="character" w:styleId="IntenseReference">
     <w:name w:val="Intense Reference"/>
-    <w:basedOn w:val="a2"/>
+    <w:basedOn w:val="DefaultParagraphFont"/>
     <w:uiPriority w:val="32"/>
     <w:qFormat/>
     <w:rsid w:val="00FC693F"/>
@@ -6219,9 +6010,9 @@
       <w:u w:val="single"/>
     </w:rPr>
   </w:style>
-  <w:style w:type="character" w:styleId="afe">
+  <w:style w:type="character" w:styleId="BookTitle">
     <w:name w:val="Book Title"/>
-    <w:basedOn w:val="a2"/>
+    <w:basedOn w:val="DefaultParagraphFont"/>
     <w:uiPriority w:val="33"/>
     <w:qFormat/>
     <w:rsid w:val="00FC693F"/>
@@ -6232,10 +6023,10 @@
       <w:spacing w:val="5"/>
     </w:rPr>
   </w:style>
-  <w:style w:type="paragraph" w:styleId="aff">
+  <w:style w:type="paragraph" w:styleId="TOCHeading">
     <w:name w:val="TOC Heading"/>
-    <w:basedOn w:val="1"/>
-    <w:next w:val="a1"/>
+    <w:basedOn w:val="Heading1"/>
+    <w:next w:val="Normal"/>
     <w:uiPriority w:val="39"/>
     <w:semiHidden/>
     <w:unhideWhenUsed/>
@@ -6245,9 +6036,9 @@
       <w:outlineLvl w:val="9"/>
     </w:pPr>
   </w:style>
-  <w:style w:type="table" w:styleId="aff0">
+  <w:style w:type="table" w:styleId="TableGrid">
     <w:name w:val="Table Grid"/>
-    <w:basedOn w:val="a3"/>
+    <w:basedOn w:val="TableNormal"/>
     <w:uiPriority w:val="59"/>
     <w:rsid w:val="00FC693F"/>
     <w:pPr>
@@ -6264,9 +6055,9 @@
       </w:tblBorders>
     </w:tblPr>
   </w:style>
-  <w:style w:type="table" w:styleId="aff1">
+  <w:style w:type="table" w:styleId="LightShading">
     <w:name w:val="Light Shading"/>
-    <w:basedOn w:val="a3"/>
+    <w:basedOn w:val="TableNormal"/>
     <w:uiPriority w:val="60"/>
     <w:rsid w:val="00FC693F"/>
     <w:pPr>
@@ -6360,9 +6151,9 @@
       </w:tcPr>
     </w:tblStylePr>
   </w:style>
-  <w:style w:type="table" w:styleId="-1">
+  <w:style w:type="table" w:styleId="LightShading-Accent1">
     <w:name w:val="Light Shading Accent 1"/>
-    <w:basedOn w:val="a3"/>
+    <w:basedOn w:val="TableNormal"/>
     <w:uiPriority w:val="60"/>
     <w:rsid w:val="00FC693F"/>
     <w:pPr>
@@ -6456,9 +6247,9 @@
       </w:tcPr>
     </w:tblStylePr>
   </w:style>
-  <w:style w:type="table" w:styleId="-2">
+  <w:style w:type="table" w:styleId="LightShading-Accent2">
     <w:name w:val="Light Shading Accent 2"/>
-    <w:basedOn w:val="a3"/>
+    <w:basedOn w:val="TableNormal"/>
     <w:uiPriority w:val="60"/>
     <w:rsid w:val="00FC693F"/>
     <w:pPr>
@@ -6552,9 +6343,9 @@
       </w:tcPr>
     </w:tblStylePr>
   </w:style>
-  <w:style w:type="table" w:styleId="-3">
+  <w:style w:type="table" w:styleId="LightShading-Accent3">
     <w:name w:val="Light Shading Accent 3"/>
-    <w:basedOn w:val="a3"/>
+    <w:basedOn w:val="TableNormal"/>
     <w:uiPriority w:val="60"/>
     <w:rsid w:val="00FC693F"/>
     <w:pPr>
@@ -6648,9 +6439,9 @@
       </w:tcPr>
     </w:tblStylePr>
   </w:style>
-  <w:style w:type="table" w:styleId="-4">
+  <w:style w:type="table" w:styleId="LightShading-Accent4">
     <w:name w:val="Light Shading Accent 4"/>
-    <w:basedOn w:val="a3"/>
+    <w:basedOn w:val="TableNormal"/>
     <w:uiPriority w:val="60"/>
     <w:rsid w:val="00FC693F"/>
     <w:pPr>
@@ -6744,9 +6535,9 @@
       </w:tcPr>
     </w:tblStylePr>
   </w:style>
-  <w:style w:type="table" w:styleId="-5">
+  <w:style w:type="table" w:styleId="LightShading-Accent5">
     <w:name w:val="Light Shading Accent 5"/>
-    <w:basedOn w:val="a3"/>
+    <w:basedOn w:val="TableNormal"/>
     <w:uiPriority w:val="60"/>
     <w:rsid w:val="00FC693F"/>
     <w:pPr>
@@ -6840,9 +6631,9 @@
       </w:tcPr>
     </w:tblStylePr>
   </w:style>
-  <w:style w:type="table" w:styleId="-6">
+  <w:style w:type="table" w:styleId="LightShading-Accent6">
     <w:name w:val="Light Shading Accent 6"/>
-    <w:basedOn w:val="a3"/>
+    <w:basedOn w:val="TableNormal"/>
     <w:uiPriority w:val="60"/>
     <w:rsid w:val="00FC693F"/>
     <w:pPr>
@@ -6936,9 +6727,9 @@
       </w:tcPr>
     </w:tblStylePr>
   </w:style>
-  <w:style w:type="table" w:styleId="aff2">
+  <w:style w:type="table" w:styleId="LightList">
     <w:name w:val="Light List"/>
-    <w:basedOn w:val="a3"/>
+    <w:basedOn w:val="TableNormal"/>
     <w:uiPriority w:val="61"/>
     <w:rsid w:val="00FC693F"/>
     <w:pPr>
@@ -7021,9 +6812,9 @@
       </w:tcPr>
     </w:tblStylePr>
   </w:style>
-  <w:style w:type="table" w:styleId="-10">
+  <w:style w:type="table" w:styleId="LightList-Accent1">
     <w:name w:val="Light List Accent 1"/>
-    <w:basedOn w:val="a3"/>
+    <w:basedOn w:val="TableNormal"/>
     <w:uiPriority w:val="61"/>
     <w:rsid w:val="00FC693F"/>
     <w:pPr>
@@ -7106,9 +6897,9 @@
       </w:tcPr>
     </w:tblStylePr>
   </w:style>
-  <w:style w:type="table" w:styleId="-20">
+  <w:style w:type="table" w:styleId="LightList-Accent2">
     <w:name w:val="Light List Accent 2"/>
-    <w:basedOn w:val="a3"/>
+    <w:basedOn w:val="TableNormal"/>
     <w:uiPriority w:val="61"/>
     <w:rsid w:val="00CB0664"/>
     <w:pPr>
@@ -7191,9 +6982,9 @@
       </w:tcPr>
     </w:tblStylePr>
   </w:style>
-  <w:style w:type="table" w:styleId="-30">
+  <w:style w:type="table" w:styleId="LightList-Accent3">
     <w:name w:val="Light List Accent 3"/>
-    <w:basedOn w:val="a3"/>
+    <w:basedOn w:val="TableNormal"/>
     <w:uiPriority w:val="61"/>
     <w:rsid w:val="00CB0664"/>
     <w:pPr>
@@ -7276,9 +7067,9 @@
       </w:tcPr>
     </w:tblStylePr>
   </w:style>
-  <w:style w:type="table" w:styleId="-40">
+  <w:style w:type="table" w:styleId="LightList-Accent4">
     <w:name w:val="Light List Accent 4"/>
-    <w:basedOn w:val="a3"/>
+    <w:basedOn w:val="TableNormal"/>
     <w:uiPriority w:val="61"/>
     <w:rsid w:val="00CB0664"/>
     <w:pPr>
@@ -7361,9 +7152,9 @@
       </w:tcPr>
     </w:tblStylePr>
   </w:style>
-  <w:style w:type="table" w:styleId="-50">
+  <w:style w:type="table" w:styleId="LightList-Accent5">
     <w:name w:val="Light List Accent 5"/>
-    <w:basedOn w:val="a3"/>
+    <w:basedOn w:val="TableNormal"/>
     <w:uiPriority w:val="61"/>
     <w:rsid w:val="00CB0664"/>
     <w:pPr>
@@ -7446,9 +7237,9 @@
       </w:tcPr>
     </w:tblStylePr>
   </w:style>
-  <w:style w:type="table" w:styleId="-60">
+  <w:style w:type="table" w:styleId="LightList-Accent6">
     <w:name w:val="Light List Accent 6"/>
-    <w:basedOn w:val="a3"/>
+    <w:basedOn w:val="TableNormal"/>
     <w:uiPriority w:val="61"/>
     <w:rsid w:val="00CB0664"/>
     <w:pPr>
@@ -7531,9 +7322,9 @@
       </w:tcPr>
     </w:tblStylePr>
   </w:style>
-  <w:style w:type="table" w:styleId="aff3">
+  <w:style w:type="table" w:styleId="LightGrid">
     <w:name w:val="Light Grid"/>
-    <w:basedOn w:val="a3"/>
+    <w:basedOn w:val="TableNormal"/>
     <w:uiPriority w:val="62"/>
     <w:rsid w:val="00CB0664"/>
     <w:pPr>
@@ -7654,9 +7445,9 @@
       </w:tcPr>
     </w:tblStylePr>
   </w:style>
-  <w:style w:type="table" w:styleId="-11">
+  <w:style w:type="table" w:styleId="LightGrid-Accent1">
     <w:name w:val="Light Grid Accent 1"/>
-    <w:basedOn w:val="a3"/>
+    <w:basedOn w:val="TableNormal"/>
     <w:uiPriority w:val="62"/>
     <w:rsid w:val="00CB0664"/>
     <w:pPr>
@@ -7777,9 +7568,9 @@
       </w:tcPr>
     </w:tblStylePr>
   </w:style>
-  <w:style w:type="table" w:styleId="-21">
+  <w:style w:type="table" w:styleId="LightGrid-Accent2">
     <w:name w:val="Light Grid Accent 2"/>
-    <w:basedOn w:val="a3"/>
+    <w:basedOn w:val="TableNormal"/>
     <w:uiPriority w:val="62"/>
     <w:rsid w:val="00CB0664"/>
     <w:pPr>
@@ -7900,9 +7691,9 @@
       </w:tcPr>
     </w:tblStylePr>
   </w:style>
-  <w:style w:type="table" w:styleId="-31">
+  <w:style w:type="table" w:styleId="LightGrid-Accent3">
     <w:name w:val="Light Grid Accent 3"/>
-    <w:basedOn w:val="a3"/>
+    <w:basedOn w:val="TableNormal"/>
     <w:uiPriority w:val="62"/>
     <w:rsid w:val="00CB0664"/>
     <w:pPr>
@@ -8023,9 +7814,9 @@
       </w:tcPr>
     </w:tblStylePr>
   </w:style>
-  <w:style w:type="table" w:styleId="-41">
+  <w:style w:type="table" w:styleId="LightGrid-Accent4">
     <w:name w:val="Light Grid Accent 4"/>
-    <w:basedOn w:val="a3"/>
+    <w:basedOn w:val="TableNormal"/>
     <w:uiPriority w:val="62"/>
     <w:rsid w:val="00CB0664"/>
     <w:pPr>
@@ -8146,9 +7937,9 @@
       </w:tcPr>
     </w:tblStylePr>
   </w:style>
-  <w:style w:type="table" w:styleId="-51">
+  <w:style w:type="table" w:styleId="LightGrid-Accent5">
     <w:name w:val="Light Grid Accent 5"/>
-    <w:basedOn w:val="a3"/>
+    <w:basedOn w:val="TableNormal"/>
     <w:uiPriority w:val="62"/>
     <w:rsid w:val="00CB0664"/>
     <w:pPr>
@@ -8269,9 +8060,9 @@
       </w:tcPr>
     </w:tblStylePr>
   </w:style>
-  <w:style w:type="table" w:styleId="-61">
+  <w:style w:type="table" w:styleId="LightGrid-Accent6">
     <w:name w:val="Light Grid Accent 6"/>
-    <w:basedOn w:val="a3"/>
+    <w:basedOn w:val="TableNormal"/>
     <w:uiPriority w:val="62"/>
     <w:rsid w:val="00CB0664"/>
     <w:pPr>
@@ -8392,9 +8183,9 @@
       </w:tcPr>
     </w:tblStylePr>
   </w:style>
-  <w:style w:type="table" w:styleId="11">
+  <w:style w:type="table" w:styleId="MediumShading1">
     <w:name w:val="Medium Shading 1"/>
-    <w:basedOn w:val="a3"/>
+    <w:basedOn w:val="TableNormal"/>
     <w:uiPriority w:val="63"/>
     <w:rsid w:val="00CB0664"/>
     <w:pPr>
@@ -8491,9 +8282,9 @@
       </w:tcPr>
     </w:tblStylePr>
   </w:style>
-  <w:style w:type="table" w:styleId="1-1">
+  <w:style w:type="table" w:styleId="MediumShading1-Accent1">
     <w:name w:val="Medium Shading 1 Accent 1"/>
-    <w:basedOn w:val="a3"/>
+    <w:basedOn w:val="TableNormal"/>
     <w:uiPriority w:val="63"/>
     <w:rsid w:val="00CB0664"/>
     <w:pPr>
@@ -8590,9 +8381,9 @@
       </w:tcPr>
     </w:tblStylePr>
   </w:style>
-  <w:style w:type="table" w:styleId="1-2">
+  <w:style w:type="table" w:styleId="MediumShading1-Accent2">
     <w:name w:val="Medium Shading 1 Accent 2"/>
-    <w:basedOn w:val="a3"/>
+    <w:basedOn w:val="TableNormal"/>
     <w:uiPriority w:val="63"/>
     <w:rsid w:val="00CB0664"/>
     <w:pPr>
@@ -8689,9 +8480,9 @@
       </w:tcPr>
     </w:tblStylePr>
   </w:style>
-  <w:style w:type="table" w:styleId="1-3">
+  <w:style w:type="table" w:styleId="MediumShading1-Accent3">
     <w:name w:val="Medium Shading 1 Accent 3"/>
-    <w:basedOn w:val="a3"/>
+    <w:basedOn w:val="TableNormal"/>
     <w:uiPriority w:val="63"/>
     <w:rsid w:val="00CB0664"/>
     <w:pPr>
@@ -8788,9 +8579,9 @@
       </w:tcPr>
     </w:tblStylePr>
   </w:style>
-  <w:style w:type="table" w:styleId="1-4">
+  <w:style w:type="table" w:styleId="MediumShading1-Accent4">
     <w:name w:val="Medium Shading 1 Accent 4"/>
-    <w:basedOn w:val="a3"/>
+    <w:basedOn w:val="TableNormal"/>
     <w:uiPriority w:val="63"/>
     <w:rsid w:val="00CB0664"/>
     <w:pPr>
@@ -8887,9 +8678,9 @@
       </w:tcPr>
     </w:tblStylePr>
   </w:style>
-  <w:style w:type="table" w:styleId="1-5">
+  <w:style w:type="table" w:styleId="MediumShading1-Accent5">
     <w:name w:val="Medium Shading 1 Accent 5"/>
-    <w:basedOn w:val="a3"/>
+    <w:basedOn w:val="TableNormal"/>
     <w:uiPriority w:val="63"/>
     <w:rsid w:val="00CB0664"/>
     <w:pPr>
@@ -8986,9 +8777,9 @@
       </w:tcPr>
     </w:tblStylePr>
   </w:style>
-  <w:style w:type="table" w:styleId="1-6">
+  <w:style w:type="table" w:styleId="MediumShading1-Accent6">
     <w:name w:val="Medium Shading 1 Accent 6"/>
-    <w:basedOn w:val="a3"/>
+    <w:basedOn w:val="TableNormal"/>
     <w:uiPriority w:val="63"/>
     <w:rsid w:val="00CB0664"/>
     <w:pPr>
@@ -9085,9 +8876,9 @@
       </w:tcPr>
     </w:tblStylePr>
   </w:style>
-  <w:style w:type="table" w:styleId="29">
+  <w:style w:type="table" w:styleId="MediumShading2">
     <w:name w:val="Medium Shading 2"/>
-    <w:basedOn w:val="a3"/>
+    <w:basedOn w:val="TableNormal"/>
     <w:uiPriority w:val="64"/>
     <w:rsid w:val="00CB0664"/>
     <w:pPr>
@@ -9227,9 +9018,9 @@
       </w:tcPr>
     </w:tblStylePr>
   </w:style>
-  <w:style w:type="table" w:styleId="2-1">
+  <w:style w:type="table" w:styleId="MediumShading2-Accent1">
     <w:name w:val="Medium Shading 2 Accent 1"/>
-    <w:basedOn w:val="a3"/>
+    <w:basedOn w:val="TableNormal"/>
     <w:uiPriority w:val="64"/>
     <w:rsid w:val="00CB0664"/>
     <w:pPr>
@@ -9369,9 +9160,9 @@
       </w:tcPr>
     </w:tblStylePr>
   </w:style>
-  <w:style w:type="table" w:styleId="2-2">
+  <w:style w:type="table" w:styleId="MediumShading2-Accent2">
     <w:name w:val="Medium Shading 2 Accent 2"/>
-    <w:basedOn w:val="a3"/>
+    <w:basedOn w:val="TableNormal"/>
     <w:uiPriority w:val="64"/>
     <w:rsid w:val="00CB0664"/>
     <w:pPr>
@@ -9511,9 +9302,9 @@
       </w:tcPr>
     </w:tblStylePr>
   </w:style>
-  <w:style w:type="table" w:styleId="2-3">
+  <w:style w:type="table" w:styleId="MediumShading2-Accent3">
     <w:name w:val="Medium Shading 2 Accent 3"/>
-    <w:basedOn w:val="a3"/>
+    <w:basedOn w:val="TableNormal"/>
     <w:uiPriority w:val="64"/>
     <w:rsid w:val="00CB0664"/>
     <w:pPr>
@@ -9653,9 +9444,9 @@
       </w:tcPr>
     </w:tblStylePr>
   </w:style>
-  <w:style w:type="table" w:styleId="2-4">
+  <w:style w:type="table" w:styleId="MediumShading2-Accent4">
     <w:name w:val="Medium Shading 2 Accent 4"/>
-    <w:basedOn w:val="a3"/>
+    <w:basedOn w:val="TableNormal"/>
     <w:uiPriority w:val="64"/>
     <w:rsid w:val="00CB0664"/>
     <w:pPr>
@@ -9795,9 +9586,9 @@
       </w:tcPr>
     </w:tblStylePr>
   </w:style>
-  <w:style w:type="table" w:styleId="2-5">
+  <w:style w:type="table" w:styleId="MediumShading2-Accent5">
     <w:name w:val="Medium Shading 2 Accent 5"/>
-    <w:basedOn w:val="a3"/>
+    <w:basedOn w:val="TableNormal"/>
     <w:uiPriority w:val="64"/>
     <w:rsid w:val="00CB0664"/>
     <w:pPr>
@@ -9937,9 +9728,9 @@
       </w:tcPr>
     </w:tblStylePr>
   </w:style>
-  <w:style w:type="table" w:styleId="2-6">
+  <w:style w:type="table" w:styleId="MediumShading2-Accent6">
     <w:name w:val="Medium Shading 2 Accent 6"/>
-    <w:basedOn w:val="a3"/>
+    <w:basedOn w:val="TableNormal"/>
     <w:uiPriority w:val="64"/>
     <w:rsid w:val="00CB0664"/>
     <w:pPr>
@@ -10079,9 +9870,9 @@
       </w:tcPr>
     </w:tblStylePr>
   </w:style>
-  <w:style w:type="table" w:styleId="12">
+  <w:style w:type="table" w:styleId="MediumList1">
     <w:name w:val="Medium List 1"/>
-    <w:basedOn w:val="a3"/>
+    <w:basedOn w:val="TableNormal"/>
     <w:uiPriority w:val="65"/>
     <w:rsid w:val="00CB0664"/>
     <w:pPr>
@@ -10156,9 +9947,9 @@
       </w:tcPr>
     </w:tblStylePr>
   </w:style>
-  <w:style w:type="table" w:styleId="1-10">
+  <w:style w:type="table" w:styleId="MediumList1-Accent1">
     <w:name w:val="Medium List 1 Accent 1"/>
-    <w:basedOn w:val="a3"/>
+    <w:basedOn w:val="TableNormal"/>
     <w:uiPriority w:val="65"/>
     <w:rsid w:val="00CB0664"/>
     <w:pPr>
@@ -10233,9 +10024,9 @@
       </w:tcPr>
     </w:tblStylePr>
   </w:style>
-  <w:style w:type="table" w:styleId="1-20">
+  <w:style w:type="table" w:styleId="MediumList1-Accent2">
     <w:name w:val="Medium List 1 Accent 2"/>
-    <w:basedOn w:val="a3"/>
+    <w:basedOn w:val="TableNormal"/>
     <w:uiPriority w:val="65"/>
     <w:rsid w:val="00CB0664"/>
     <w:pPr>
@@ -10310,9 +10101,9 @@
       </w:tcPr>
     </w:tblStylePr>
   </w:style>
-  <w:style w:type="table" w:styleId="1-30">
+  <w:style w:type="table" w:styleId="MediumList1-Accent3">
     <w:name w:val="Medium List 1 Accent 3"/>
-    <w:basedOn w:val="a3"/>
+    <w:basedOn w:val="TableNormal"/>
     <w:uiPriority w:val="65"/>
     <w:rsid w:val="00CB0664"/>
     <w:pPr>
@@ -10387,9 +10178,9 @@
       </w:tcPr>
     </w:tblStylePr>
   </w:style>
-  <w:style w:type="table" w:styleId="1-40">
+  <w:style w:type="table" w:styleId="MediumList1-Accent4">
     <w:name w:val="Medium List 1 Accent 4"/>
-    <w:basedOn w:val="a3"/>
+    <w:basedOn w:val="TableNormal"/>
     <w:uiPriority w:val="65"/>
     <w:rsid w:val="00CB0664"/>
     <w:pPr>
@@ -10464,9 +10255,9 @@
       </w:tcPr>
     </w:tblStylePr>
   </w:style>
-  <w:style w:type="table" w:styleId="1-50">
+  <w:style w:type="table" w:styleId="MediumList1-Accent5">
     <w:name w:val="Medium List 1 Accent 5"/>
-    <w:basedOn w:val="a3"/>
+    <w:basedOn w:val="TableNormal"/>
     <w:uiPriority w:val="65"/>
     <w:rsid w:val="00CB0664"/>
     <w:pPr>
@@ -10541,9 +10332,9 @@
       </w:tcPr>
     </w:tblStylePr>
   </w:style>
-  <w:style w:type="table" w:styleId="1-60">
+  <w:style w:type="table" w:styleId="MediumList1-Accent6">
     <w:name w:val="Medium List 1 Accent 6"/>
-    <w:basedOn w:val="a3"/>
+    <w:basedOn w:val="TableNormal"/>
     <w:uiPriority w:val="65"/>
     <w:rsid w:val="00CB0664"/>
     <w:pPr>
@@ -10618,9 +10409,9 @@
       </w:tcPr>
     </w:tblStylePr>
   </w:style>
-  <w:style w:type="table" w:styleId="2a">
+  <w:style w:type="table" w:styleId="MediumList2">
     <w:name w:val="Medium List 2"/>
-    <w:basedOn w:val="a3"/>
+    <w:basedOn w:val="TableNormal"/>
     <w:uiPriority w:val="66"/>
     <w:rsid w:val="00CB0664"/>
     <w:pPr>
@@ -10739,9 +10530,9 @@
       </w:tcPr>
     </w:tblStylePr>
   </w:style>
-  <w:style w:type="table" w:styleId="2-10">
+  <w:style w:type="table" w:styleId="MediumList2-Accent1">
     <w:name w:val="Medium List 2 Accent 1"/>
-    <w:basedOn w:val="a3"/>
+    <w:basedOn w:val="TableNormal"/>
     <w:uiPriority w:val="66"/>
     <w:rsid w:val="00CB0664"/>
     <w:pPr>
@@ -10860,9 +10651,9 @@
       </w:tcPr>
     </w:tblStylePr>
   </w:style>
-  <w:style w:type="table" w:styleId="2-20">
+  <w:style w:type="table" w:styleId="MediumList2-Accent2">
     <w:name w:val="Medium List 2 Accent 2"/>
-    <w:basedOn w:val="a3"/>
+    <w:basedOn w:val="TableNormal"/>
     <w:uiPriority w:val="66"/>
     <w:rsid w:val="00CB0664"/>
     <w:pPr>
@@ -10981,9 +10772,9 @@
       </w:tcPr>
     </w:tblStylePr>
   </w:style>
-  <w:style w:type="table" w:styleId="2-30">
+  <w:style w:type="table" w:styleId="MediumList2-Accent3">
     <w:name w:val="Medium List 2 Accent 3"/>
-    <w:basedOn w:val="a3"/>
+    <w:basedOn w:val="TableNormal"/>
     <w:uiPriority w:val="66"/>
     <w:rsid w:val="00CB0664"/>
     <w:pPr>
@@ -11102,9 +10893,9 @@
       </w:tcPr>
     </w:tblStylePr>
   </w:style>
-  <w:style w:type="table" w:styleId="2-40">
+  <w:style w:type="table" w:styleId="MediumList2-Accent4">
     <w:name w:val="Medium List 2 Accent 4"/>
-    <w:basedOn w:val="a3"/>
+    <w:basedOn w:val="TableNormal"/>
     <w:uiPriority w:val="66"/>
     <w:rsid w:val="00CB0664"/>
     <w:pPr>
@@ -11223,9 +11014,9 @@
       </w:tcPr>
     </w:tblStylePr>
   </w:style>
-  <w:style w:type="table" w:styleId="2-50">
+  <w:style w:type="table" w:styleId="MediumList2-Accent5">
     <w:name w:val="Medium List 2 Accent 5"/>
-    <w:basedOn w:val="a3"/>
+    <w:basedOn w:val="TableNormal"/>
     <w:uiPriority w:val="66"/>
     <w:rsid w:val="00CB0664"/>
     <w:pPr>
@@ -11344,9 +11135,9 @@
       </w:tcPr>
     </w:tblStylePr>
   </w:style>
-  <w:style w:type="table" w:styleId="2-60">
+  <w:style w:type="table" w:styleId="MediumList2-Accent6">
     <w:name w:val="Medium List 2 Accent 6"/>
-    <w:basedOn w:val="a3"/>
+    <w:basedOn w:val="TableNormal"/>
     <w:uiPriority w:val="66"/>
     <w:rsid w:val="00CB0664"/>
     <w:pPr>
@@ -11465,9 +11256,9 @@
       </w:tcPr>
     </w:tblStylePr>
   </w:style>
-  <w:style w:type="table" w:styleId="13">
+  <w:style w:type="table" w:styleId="MediumGrid1">
     <w:name w:val="Medium Grid 1"/>
-    <w:basedOn w:val="a3"/>
+    <w:basedOn w:val="TableNormal"/>
     <w:uiPriority w:val="67"/>
     <w:rsid w:val="00CB0664"/>
     <w:pPr>
@@ -11531,9 +11322,9 @@
       </w:tcPr>
     </w:tblStylePr>
   </w:style>
-  <w:style w:type="table" w:styleId="1-11">
+  <w:style w:type="table" w:styleId="MediumGrid1-Accent1">
     <w:name w:val="Medium Grid 1 Accent 1"/>
-    <w:basedOn w:val="a3"/>
+    <w:basedOn w:val="TableNormal"/>
     <w:uiPriority w:val="67"/>
     <w:rsid w:val="00CB0664"/>
     <w:pPr>
@@ -11597,9 +11388,9 @@
       </w:tcPr>
     </w:tblStylePr>
   </w:style>
-  <w:style w:type="table" w:styleId="1-21">
+  <w:style w:type="table" w:styleId="MediumGrid1-Accent2">
     <w:name w:val="Medium Grid 1 Accent 2"/>
-    <w:basedOn w:val="a3"/>
+    <w:basedOn w:val="TableNormal"/>
     <w:uiPriority w:val="67"/>
     <w:rsid w:val="00CB0664"/>
     <w:pPr>
@@ -11663,9 +11454,9 @@
       </w:tcPr>
     </w:tblStylePr>
   </w:style>
-  <w:style w:type="table" w:styleId="1-31">
+  <w:style w:type="table" w:styleId="MediumGrid1-Accent3">
     <w:name w:val="Medium Grid 1 Accent 3"/>
-    <w:basedOn w:val="a3"/>
+    <w:basedOn w:val="TableNormal"/>
     <w:uiPriority w:val="67"/>
     <w:rsid w:val="00CB0664"/>
     <w:pPr>
@@ -11729,9 +11520,9 @@
       </w:tcPr>
     </w:tblStylePr>
   </w:style>
-  <w:style w:type="table" w:styleId="1-41">
+  <w:style w:type="table" w:styleId="MediumGrid1-Accent4">
     <w:name w:val="Medium Grid 1 Accent 4"/>
-    <w:basedOn w:val="a3"/>
+    <w:basedOn w:val="TableNormal"/>
     <w:uiPriority w:val="67"/>
     <w:rsid w:val="00CB0664"/>
     <w:pPr>
@@ -11795,9 +11586,9 @@
       </w:tcPr>
     </w:tblStylePr>
   </w:style>
-  <w:style w:type="table" w:styleId="1-51">
+  <w:style w:type="table" w:styleId="MediumGrid1-Accent5">
     <w:name w:val="Medium Grid 1 Accent 5"/>
-    <w:basedOn w:val="a3"/>
+    <w:basedOn w:val="TableNormal"/>
     <w:uiPriority w:val="67"/>
     <w:rsid w:val="00CB0664"/>
     <w:pPr>
@@ -11861,9 +11652,9 @@
       </w:tcPr>
     </w:tblStylePr>
   </w:style>
-  <w:style w:type="table" w:styleId="1-61">
+  <w:style w:type="table" w:styleId="MediumGrid1-Accent6">
     <w:name w:val="Medium Grid 1 Accent 6"/>
-    <w:basedOn w:val="a3"/>
+    <w:basedOn w:val="TableNormal"/>
     <w:uiPriority w:val="67"/>
     <w:rsid w:val="00CB0664"/>
     <w:pPr>
@@ -11927,9 +11718,9 @@
       </w:tcPr>
     </w:tblStylePr>
   </w:style>
-  <w:style w:type="table" w:styleId="2b">
+  <w:style w:type="table" w:styleId="MediumGrid2">
     <w:name w:val="Medium Grid 2"/>
-    <w:basedOn w:val="a3"/>
+    <w:basedOn w:val="TableNormal"/>
     <w:uiPriority w:val="68"/>
     <w:rsid w:val="00CB0664"/>
     <w:pPr>
@@ -12045,9 +11836,9 @@
       </w:tcPr>
     </w:tblStylePr>
   </w:style>
-  <w:style w:type="table" w:styleId="2-11">
+  <w:style w:type="table" w:styleId="MediumGrid2-Accent1">
     <w:name w:val="Medium Grid 2 Accent 1"/>
-    <w:basedOn w:val="a3"/>
+    <w:basedOn w:val="TableNormal"/>
     <w:uiPriority w:val="68"/>
     <w:rsid w:val="00CB0664"/>
     <w:pPr>
@@ -12163,9 +11954,9 @@
       </w:tcPr>
     </w:tblStylePr>
   </w:style>
-  <w:style w:type="table" w:styleId="2-21">
+  <w:style w:type="table" w:styleId="MediumGrid2-Accent2">
     <w:name w:val="Medium Grid 2 Accent 2"/>
-    <w:basedOn w:val="a3"/>
+    <w:basedOn w:val="TableNormal"/>
     <w:uiPriority w:val="68"/>
     <w:rsid w:val="00CB0664"/>
     <w:pPr>
@@ -12281,9 +12072,9 @@
       </w:tcPr>
     </w:tblStylePr>
   </w:style>
-  <w:style w:type="table" w:styleId="2-31">
+  <w:style w:type="table" w:styleId="MediumGrid2-Accent3">
     <w:name w:val="Medium Grid 2 Accent 3"/>
-    <w:basedOn w:val="a3"/>
+    <w:basedOn w:val="TableNormal"/>
     <w:uiPriority w:val="68"/>
     <w:rsid w:val="00CB0664"/>
     <w:pPr>
@@ -12399,9 +12190,9 @@
       </w:tcPr>
     </w:tblStylePr>
   </w:style>
-  <w:style w:type="table" w:styleId="2-41">
+  <w:style w:type="table" w:styleId="MediumGrid2-Accent4">
     <w:name w:val="Medium Grid 2 Accent 4"/>
-    <w:basedOn w:val="a3"/>
+    <w:basedOn w:val="TableNormal"/>
     <w:uiPriority w:val="68"/>
     <w:rsid w:val="00CB0664"/>
     <w:pPr>
@@ -12517,9 +12308,9 @@
       </w:tcPr>
     </w:tblStylePr>
   </w:style>
-  <w:style w:type="table" w:styleId="2-51">
+  <w:style w:type="table" w:styleId="MediumGrid2-Accent5">
     <w:name w:val="Medium Grid 2 Accent 5"/>
-    <w:basedOn w:val="a3"/>
+    <w:basedOn w:val="TableNormal"/>
     <w:uiPriority w:val="68"/>
     <w:rsid w:val="00CB0664"/>
     <w:pPr>
@@ -12635,9 +12426,9 @@
       </w:tcPr>
     </w:tblStylePr>
   </w:style>
-  <w:style w:type="table" w:styleId="2-61">
+  <w:style w:type="table" w:styleId="MediumGrid2-Accent6">
     <w:name w:val="Medium Grid 2 Accent 6"/>
-    <w:basedOn w:val="a3"/>
+    <w:basedOn w:val="TableNormal"/>
     <w:uiPriority w:val="68"/>
     <w:rsid w:val="00CB0664"/>
     <w:pPr>
@@ -12753,9 +12544,9 @@
       </w:tcPr>
     </w:tblStylePr>
   </w:style>
-  <w:style w:type="table" w:styleId="37">
+  <w:style w:type="table" w:styleId="MediumGrid3">
     <w:name w:val="Medium Grid 3"/>
-    <w:basedOn w:val="a3"/>
+    <w:basedOn w:val="TableNormal"/>
     <w:uiPriority w:val="69"/>
     <w:rsid w:val="00CB0664"/>
     <w:pPr>
@@ -12887,9 +12678,9 @@
       </w:tcPr>
     </w:tblStylePr>
   </w:style>
-  <w:style w:type="table" w:styleId="3-1">
+  <w:style w:type="table" w:styleId="MediumGrid3-Accent1">
     <w:name w:val="Medium Grid 3 Accent 1"/>
-    <w:basedOn w:val="a3"/>
+    <w:basedOn w:val="TableNormal"/>
     <w:uiPriority w:val="69"/>
     <w:rsid w:val="00CB0664"/>
     <w:pPr>
@@ -13021,9 +12812,9 @@
       </w:tcPr>
     </w:tblStylePr>
   </w:style>
-  <w:style w:type="table" w:styleId="3-2">
+  <w:style w:type="table" w:styleId="MediumGrid3-Accent2">
     <w:name w:val="Medium Grid 3 Accent 2"/>
-    <w:basedOn w:val="a3"/>
+    <w:basedOn w:val="TableNormal"/>
     <w:uiPriority w:val="69"/>
     <w:rsid w:val="00CB0664"/>
     <w:pPr>
@@ -13155,9 +12946,9 @@
       </w:tcPr>
     </w:tblStylePr>
   </w:style>
-  <w:style w:type="table" w:styleId="3-3">
+  <w:style w:type="table" w:styleId="MediumGrid3-Accent3">
     <w:name w:val="Medium Grid 3 Accent 3"/>
-    <w:basedOn w:val="a3"/>
+    <w:basedOn w:val="TableNormal"/>
     <w:uiPriority w:val="69"/>
     <w:rsid w:val="00CB0664"/>
     <w:pPr>
@@ -13289,9 +13080,9 @@
       </w:tcPr>
     </w:tblStylePr>
   </w:style>
-  <w:style w:type="table" w:styleId="3-4">
+  <w:style w:type="table" w:styleId="MediumGrid3-Accent4">
     <w:name w:val="Medium Grid 3 Accent 4"/>
-    <w:basedOn w:val="a3"/>
+    <w:basedOn w:val="TableNormal"/>
     <w:uiPriority w:val="69"/>
     <w:rsid w:val="00CB0664"/>
     <w:pPr>
@@ -13423,9 +13214,9 @@
       </w:tcPr>
     </w:tblStylePr>
   </w:style>
-  <w:style w:type="table" w:styleId="3-5">
+  <w:style w:type="table" w:styleId="MediumGrid3-Accent5">
     <w:name w:val="Medium Grid 3 Accent 5"/>
-    <w:basedOn w:val="a3"/>
+    <w:basedOn w:val="TableNormal"/>
     <w:uiPriority w:val="69"/>
     <w:rsid w:val="00CB0664"/>
     <w:pPr>
@@ -13557,9 +13348,9 @@
       </w:tcPr>
     </w:tblStylePr>
   </w:style>
-  <w:style w:type="table" w:styleId="3-6">
+  <w:style w:type="table" w:styleId="MediumGrid3-Accent6">
     <w:name w:val="Medium Grid 3 Accent 6"/>
-    <w:basedOn w:val="a3"/>
+    <w:basedOn w:val="TableNormal"/>
     <w:uiPriority w:val="69"/>
     <w:rsid w:val="00CB0664"/>
     <w:pPr>
@@ -13691,9 +13482,9 @@
       </w:tcPr>
     </w:tblStylePr>
   </w:style>
-  <w:style w:type="table" w:styleId="aff4">
+  <w:style w:type="table" w:styleId="DarkList">
     <w:name w:val="Dark List"/>
-    <w:basedOn w:val="a3"/>
+    <w:basedOn w:val="TableNormal"/>
     <w:uiPriority w:val="70"/>
     <w:rsid w:val="00CB0664"/>
     <w:pPr>
@@ -13798,9 +13589,9 @@
       </w:tcPr>
     </w:tblStylePr>
   </w:style>
-  <w:style w:type="table" w:styleId="-12">
+  <w:style w:type="table" w:styleId="DarkList-Accent1">
     <w:name w:val="Dark List Accent 1"/>
-    <w:basedOn w:val="a3"/>
+    <w:basedOn w:val="TableNormal"/>
     <w:uiPriority w:val="70"/>
     <w:rsid w:val="00CB0664"/>
     <w:pPr>
@@ -13905,9 +13696,9 @@
       </w:tcPr>
     </w:tblStylePr>
   </w:style>
-  <w:style w:type="table" w:styleId="-22">
+  <w:style w:type="table" w:styleId="DarkList-Accent2">
     <w:name w:val="Dark List Accent 2"/>
-    <w:basedOn w:val="a3"/>
+    <w:basedOn w:val="TableNormal"/>
     <w:uiPriority w:val="70"/>
     <w:rsid w:val="00CB0664"/>
     <w:pPr>
@@ -14012,9 +13803,9 @@
       </w:tcPr>
     </w:tblStylePr>
   </w:style>
-  <w:style w:type="table" w:styleId="-32">
+  <w:style w:type="table" w:styleId="DarkList-Accent3">
     <w:name w:val="Dark List Accent 3"/>
-    <w:basedOn w:val="a3"/>
+    <w:basedOn w:val="TableNormal"/>
     <w:uiPriority w:val="70"/>
     <w:rsid w:val="00CB0664"/>
     <w:pPr>
@@ -14119,9 +13910,9 @@
       </w:tcPr>
     </w:tblStylePr>
   </w:style>
-  <w:style w:type="table" w:styleId="-42">
+  <w:style w:type="table" w:styleId="DarkList-Accent4">
     <w:name w:val="Dark List Accent 4"/>
-    <w:basedOn w:val="a3"/>
+    <w:basedOn w:val="TableNormal"/>
     <w:uiPriority w:val="70"/>
     <w:rsid w:val="00CB0664"/>
     <w:pPr>
@@ -14226,9 +14017,9 @@
       </w:tcPr>
     </w:tblStylePr>
   </w:style>
-  <w:style w:type="table" w:styleId="-52">
+  <w:style w:type="table" w:styleId="DarkList-Accent5">
     <w:name w:val="Dark List Accent 5"/>
-    <w:basedOn w:val="a3"/>
+    <w:basedOn w:val="TableNormal"/>
     <w:uiPriority w:val="70"/>
     <w:rsid w:val="00CB0664"/>
     <w:pPr>
@@ -14333,9 +14124,9 @@
       </w:tcPr>
     </w:tblStylePr>
   </w:style>
-  <w:style w:type="table" w:styleId="-62">
+  <w:style w:type="table" w:styleId="DarkList-Accent6">
     <w:name w:val="Dark List Accent 6"/>
-    <w:basedOn w:val="a3"/>
+    <w:basedOn w:val="TableNormal"/>
     <w:uiPriority w:val="70"/>
     <w:rsid w:val="00CB0664"/>
     <w:pPr>
@@ -14440,9 +14231,9 @@
       </w:tcPr>
     </w:tblStylePr>
   </w:style>
-  <w:style w:type="table" w:styleId="aff5">
+  <w:style w:type="table" w:styleId="ColorfulShading">
     <w:name w:val="Colorful Shading"/>
-    <w:basedOn w:val="a3"/>
+    <w:basedOn w:val="TableNormal"/>
     <w:uiPriority w:val="71"/>
     <w:rsid w:val="00CB0664"/>
     <w:pPr>
@@ -14555,9 +14346,9 @@
       </w:rPr>
     </w:tblStylePr>
   </w:style>
-  <w:style w:type="table" w:styleId="-13">
+  <w:style w:type="table" w:styleId="ColorfulShading-Accent1">
     <w:name w:val="Colorful Shading Accent 1"/>
-    <w:basedOn w:val="a3"/>
+    <w:basedOn w:val="TableNormal"/>
     <w:uiPriority w:val="71"/>
     <w:rsid w:val="00CB0664"/>
     <w:pPr>
@@ -14670,9 +14461,9 @@
       </w:rPr>
     </w:tblStylePr>
   </w:style>
-  <w:style w:type="table" w:styleId="-23">
+  <w:style w:type="table" w:styleId="ColorfulShading-Accent2">
     <w:name w:val="Colorful Shading Accent 2"/>
-    <w:basedOn w:val="a3"/>
+    <w:basedOn w:val="TableNormal"/>
     <w:uiPriority w:val="71"/>
     <w:rsid w:val="00CB0664"/>
     <w:pPr>
@@ -14785,9 +14576,9 @@
       </w:rPr>
     </w:tblStylePr>
   </w:style>
-  <w:style w:type="table" w:styleId="-33">
+  <w:style w:type="table" w:styleId="ColorfulShading-Accent3">
     <w:name w:val="Colorful Shading Accent 3"/>
-    <w:basedOn w:val="a3"/>
+    <w:basedOn w:val="TableNormal"/>
     <w:uiPriority w:val="71"/>
     <w:rsid w:val="00CB0664"/>
     <w:pPr>
@@ -14890,9 +14681,9 @@
       </w:tcPr>
     </w:tblStylePr>
   </w:style>
-  <w:style w:type="table" w:styleId="-43">
+  <w:style w:type="table" w:styleId="ColorfulShading-Accent4">
     <w:name w:val="Colorful Shading Accent 4"/>
-    <w:basedOn w:val="a3"/>
+    <w:basedOn w:val="TableNormal"/>
     <w:uiPriority w:val="71"/>
     <w:rsid w:val="00CB0664"/>
     <w:pPr>
@@ -15005,9 +14796,9 @@
       </w:rPr>
     </w:tblStylePr>
   </w:style>
-  <w:style w:type="table" w:styleId="-53">
+  <w:style w:type="table" w:styleId="ColorfulShading-Accent5">
     <w:name w:val="Colorful Shading Accent 5"/>
-    <w:basedOn w:val="a3"/>
+    <w:basedOn w:val="TableNormal"/>
     <w:uiPriority w:val="71"/>
     <w:rsid w:val="00CB0664"/>
     <w:pPr>
@@ -15120,9 +14911,9 @@
       </w:rPr>
     </w:tblStylePr>
   </w:style>
-  <w:style w:type="table" w:styleId="-63">
+  <w:style w:type="table" w:styleId="ColorfulShading-Accent6">
     <w:name w:val="Colorful Shading Accent 6"/>
-    <w:basedOn w:val="a3"/>
+    <w:basedOn w:val="TableNormal"/>
     <w:uiPriority w:val="71"/>
     <w:rsid w:val="00CB0664"/>
     <w:pPr>
@@ -15235,9 +15026,9 @@
       </w:rPr>
     </w:tblStylePr>
   </w:style>
-  <w:style w:type="table" w:styleId="aff6">
+  <w:style w:type="table" w:styleId="ColorfulList">
     <w:name w:val="Colorful List"/>
-    <w:basedOn w:val="a3"/>
+    <w:basedOn w:val="TableNormal"/>
     <w:uiPriority w:val="72"/>
     <w:rsid w:val="00CB0664"/>
     <w:pPr>
@@ -15314,9 +15105,9 @@
       </w:tcPr>
     </w:tblStylePr>
   </w:style>
-  <w:style w:type="table" w:styleId="-14">
+  <w:style w:type="table" w:styleId="ColorfulList-Accent1">
     <w:name w:val="Colorful List Accent 1"/>
-    <w:basedOn w:val="a3"/>
+    <w:basedOn w:val="TableNormal"/>
     <w:uiPriority w:val="72"/>
     <w:rsid w:val="00CB0664"/>
     <w:pPr>
@@ -15393,9 +15184,9 @@
       </w:tcPr>
     </w:tblStylePr>
   </w:style>
-  <w:style w:type="table" w:styleId="-24">
+  <w:style w:type="table" w:styleId="ColorfulList-Accent2">
     <w:name w:val="Colorful List Accent 2"/>
-    <w:basedOn w:val="a3"/>
+    <w:basedOn w:val="TableNormal"/>
     <w:uiPriority w:val="72"/>
     <w:rsid w:val="00CB0664"/>
     <w:pPr>
@@ -15472,9 +15263,9 @@
       </w:tcPr>
     </w:tblStylePr>
   </w:style>
-  <w:style w:type="table" w:styleId="-34">
+  <w:style w:type="table" w:styleId="ColorfulList-Accent3">
     <w:name w:val="Colorful List Accent 3"/>
-    <w:basedOn w:val="a3"/>
+    <w:basedOn w:val="TableNormal"/>
     <w:uiPriority w:val="72"/>
     <w:rsid w:val="00CB0664"/>
     <w:pPr>
@@ -15551,9 +15342,9 @@
       </w:tcPr>
     </w:tblStylePr>
   </w:style>
-  <w:style w:type="table" w:styleId="-44">
+  <w:style w:type="table" w:styleId="ColorfulList-Accent4">
     <w:name w:val="Colorful List Accent 4"/>
-    <w:basedOn w:val="a3"/>
+    <w:basedOn w:val="TableNormal"/>
     <w:uiPriority w:val="72"/>
     <w:rsid w:val="00CB0664"/>
     <w:pPr>
@@ -15630,9 +15421,9 @@
       </w:tcPr>
     </w:tblStylePr>
   </w:style>
-  <w:style w:type="table" w:styleId="-54">
+  <w:style w:type="table" w:styleId="ColorfulList-Accent5">
     <w:name w:val="Colorful List Accent 5"/>
-    <w:basedOn w:val="a3"/>
+    <w:basedOn w:val="TableNormal"/>
     <w:uiPriority w:val="72"/>
     <w:rsid w:val="00CB0664"/>
     <w:pPr>
@@ -15709,9 +15500,9 @@
       </w:tcPr>
     </w:tblStylePr>
   </w:style>
-  <w:style w:type="table" w:styleId="-64">
+  <w:style w:type="table" w:styleId="ColorfulList-Accent6">
     <w:name w:val="Colorful List Accent 6"/>
-    <w:basedOn w:val="a3"/>
+    <w:basedOn w:val="TableNormal"/>
     <w:uiPriority w:val="72"/>
     <w:rsid w:val="00CB0664"/>
     <w:pPr>
@@ -15788,9 +15579,9 @@
       </w:tcPr>
     </w:tblStylePr>
   </w:style>
-  <w:style w:type="table" w:styleId="aff7">
+  <w:style w:type="table" w:styleId="ColorfulGrid">
     <w:name w:val="Colorful Grid"/>
-    <w:basedOn w:val="a3"/>
+    <w:basedOn w:val="TableNormal"/>
     <w:uiPriority w:val="73"/>
     <w:rsid w:val="00CB0664"/>
     <w:pPr>
@@ -15861,9 +15652,9 @@
       </w:tcPr>
     </w:tblStylePr>
   </w:style>
-  <w:style w:type="table" w:styleId="-15">
+  <w:style w:type="table" w:styleId="ColorfulGrid-Accent1">
     <w:name w:val="Colorful Grid Accent 1"/>
-    <w:basedOn w:val="a3"/>
+    <w:basedOn w:val="TableNormal"/>
     <w:uiPriority w:val="73"/>
     <w:rsid w:val="00CB0664"/>
     <w:pPr>
@@ -15934,9 +15725,9 @@
       </w:tcPr>
     </w:tblStylePr>
   </w:style>
-  <w:style w:type="table" w:styleId="-25">
+  <w:style w:type="table" w:styleId="ColorfulGrid-Accent2">
     <w:name w:val="Colorful Grid Accent 2"/>
-    <w:basedOn w:val="a3"/>
+    <w:basedOn w:val="TableNormal"/>
     <w:uiPriority w:val="73"/>
     <w:rsid w:val="00CB0664"/>
     <w:pPr>
@@ -16007,9 +15798,9 @@
       </w:tcPr>
     </w:tblStylePr>
   </w:style>
-  <w:style w:type="table" w:styleId="-35">
+  <w:style w:type="table" w:styleId="ColorfulGrid-Accent3">
     <w:name w:val="Colorful Grid Accent 3"/>
-    <w:basedOn w:val="a3"/>
+    <w:basedOn w:val="TableNormal"/>
     <w:uiPriority w:val="73"/>
     <w:rsid w:val="00CB0664"/>
     <w:pPr>
@@ -16080,9 +15871,9 @@
       </w:tcPr>
     </w:tblStylePr>
   </w:style>
-  <w:style w:type="table" w:styleId="-45">
+  <w:style w:type="table" w:styleId="ColorfulGrid-Accent4">
     <w:name w:val="Colorful Grid Accent 4"/>
-    <w:basedOn w:val="a3"/>
+    <w:basedOn w:val="TableNormal"/>
     <w:uiPriority w:val="73"/>
     <w:rsid w:val="00CB0664"/>
     <w:pPr>
@@ -16153,9 +15944,9 @@
       </w:tcPr>
     </w:tblStylePr>
   </w:style>
-  <w:style w:type="table" w:styleId="-55">
+  <w:style w:type="table" w:styleId="ColorfulGrid-Accent5">
     <w:name w:val="Colorful Grid Accent 5"/>
-    <w:basedOn w:val="a3"/>
+    <w:basedOn w:val="TableNormal"/>
     <w:uiPriority w:val="73"/>
     <w:rsid w:val="00CB0664"/>
     <w:pPr>
@@ -16226,9 +16017,9 @@
       </w:tcPr>
     </w:tblStylePr>
   </w:style>
-  <w:style w:type="table" w:styleId="-65">
+  <w:style w:type="table" w:styleId="ColorfulGrid-Accent6">
     <w:name w:val="Colorful Grid Accent 6"/>
-    <w:basedOn w:val="a3"/>
+    <w:basedOn w:val="TableNormal"/>
     <w:uiPriority w:val="73"/>
     <w:rsid w:val="00CB0664"/>
     <w:pPr>
@@ -16299,10 +16090,10 @@
       </w:tcPr>
     </w:tblStylePr>
   </w:style>
-  <w:style w:type="paragraph" w:styleId="14">
+  <w:style w:type="paragraph" w:styleId="TOC1">
     <w:name w:val="toc 1"/>
-    <w:basedOn w:val="a1"/>
-    <w:next w:val="a1"/>
+    <w:basedOn w:val="Normal"/>
+    <w:next w:val="Normal"/>
     <w:autoRedefine/>
     <w:uiPriority w:val="39"/>
     <w:unhideWhenUsed/>
@@ -16311,10 +16102,10 @@
       <w:spacing w:after="100"/>
     </w:pPr>
   </w:style>
-  <w:style w:type="paragraph" w:styleId="2c">
+  <w:style w:type="paragraph" w:styleId="TOC2">
     <w:name w:val="toc 2"/>
-    <w:basedOn w:val="a1"/>
-    <w:next w:val="a1"/>
+    <w:basedOn w:val="Normal"/>
+    <w:next w:val="Normal"/>
     <w:autoRedefine/>
     <w:uiPriority w:val="39"/>
     <w:unhideWhenUsed/>
@@ -16324,9 +16115,9 @@
       <w:ind w:left="240"/>
     </w:pPr>
   </w:style>
-  <w:style w:type="character" w:styleId="aff8">
+  <w:style w:type="character" w:styleId="Hyperlink">
     <w:name w:val="Hyperlink"/>
-    <w:basedOn w:val="a2"/>
+    <w:basedOn w:val="DefaultParagraphFont"/>
     <w:uiPriority w:val="99"/>
     <w:unhideWhenUsed/>
     <w:rsid w:val="00D76E21"/>

</xml_diff>

<commit_message>
Report: mention the published v0.1.0 release and link to it
</commit_message>
<xml_diff>
--- a/docs/report/Assignment3_Report.docx
+++ b/docs/report/Assignment3_Report.docx
@@ -1968,7 +1968,6 @@
     </w:p>
     <w:p>
       <w:r>
-        <w:lastRenderedPageBreak/>
         <w:t xml:space="preserve">Decisions </w:t>
       </w:r>
       <w:r>
@@ -1978,7 +1977,11 @@
         <w:t>not</w:t>
       </w:r>
       <w:r>
-        <w:t xml:space="preserve"> to use a technology followed the same criteria. The statsmodels library offers seasonal decomposition and ARIMA, but it is a heavy dependency, while the decomposition and the forecast model take fewer than 200 transparent, fully tested lines here. Deep learning was rejected for a scientific reason: 32 years of monthly data give only 384 points, far too few for a neural network, whereas an interpretable statistical model can be validated honestly against a simple baseline.</w:t>
+        <w:t xml:space="preserve"> to use a technology followed the same criteria. The statsmodels library offers seasonal decomposition and ARIMA, but it is a heavy dependency, while the decomposition and the </w:t>
+      </w:r>
+      <w:r>
+        <w:lastRenderedPageBreak/>
+        <w:t>forecast model take fewer than 200 transparent, fully tested lines here. Deep learning was rejected for a scientific reason: 32 years of monthly data give only 384 points, far too few for a neural network, whereas an interpretable statistical model can be validated honestly against a simple baseline.</w:t>
       </w:r>
     </w:p>
     <w:p>
@@ -2594,11 +2597,11 @@
     </w:p>
     <w:p>
       <w:r>
-        <w:t xml:space="preserve">Git was chosen for three reasons. Cheap local branches make it natural to isolate every change and verify it before it reaches the main branch. Content hashing guarantees that a commit identifier refers to exactly one state of the code, which matters for reproducibility. And Git is the </w:t>
+        <w:t xml:space="preserve">Git was chosen for three reasons. Cheap local branches make it natural to isolate every change and verify it before it reaches the main branch. Content hashing guarantees that a commit identifier refers to exactly one state of the code, which matters for reproducibility. And Git is the standard of both industry and open science, so most users and reviewers already know it. Its </w:t>
       </w:r>
       <w:r>
         <w:lastRenderedPageBreak/>
-        <w:t>standard of both industry and open science, so most users and reviewers already know it. Its weaknesses are not significant here: the repository holds only source code and a few small data and image files.</w:t>
+        <w:t>weaknesses are not significant here: the repository holds only source code and a few small data and image files.</w:t>
       </w:r>
     </w:p>
     <w:p>
@@ -2960,7 +2963,6 @@
     </w:p>
     <w:p>
       <w:r>
-        <w:lastRenderedPageBreak/>
         <w:t xml:space="preserve">The CI workflow uses several standard techniques. A </w:t>
       </w:r>
       <w:r>
@@ -2970,7 +2972,11 @@
         <w:t>build matrix</w:t>
       </w:r>
       <w:r>
-        <w:t xml:space="preserve"> repeats the tests in six environments — four Python versions on Ubuntu plus Windows and macOS — and so catches errors that appear on one platform only. </w:t>
+        <w:t xml:space="preserve"> repeats the tests in six environments — four Python versions on Ubuntu plus Windows and macOS — and so catches </w:t>
+      </w:r>
+      <w:r>
+        <w:lastRenderedPageBreak/>
+        <w:t xml:space="preserve">errors that appear on one platform only. </w:t>
       </w:r>
       <w:r>
         <w:rPr>
@@ -3074,7 +3080,10 @@
     </w:p>
     <w:p>
       <w:r>
-        <w:t>The third workflow implements continuous delivery. When a version tag is pushed, it checks that the tag matches the package version, repeats the tests, builds the wheel and the source archive and publishes them as a GitHub Release. The workflow therefore cannot publish code that fails its tests.</w:t>
+        <w:t xml:space="preserve">The third workflow implements continuous delivery. When a version tag is pushed, it checks that the tag matches the package version, repeats the tests, builds the wheel and the source archive and publishes them as a GitHub Release. </w:t>
+      </w:r>
+      <w:r>
+        <w:t>The workflow therefore cannot publish code that fails its tests; version 0.1.0 was released this way.</w:t>
       </w:r>
     </w:p>
     <w:p>
@@ -3109,11 +3118,7 @@
         <w:t>oracle problem</w:t>
       </w:r>
       <w:r>
-        <w:t xml:space="preserve"> with a synthetic dataset </w:t>
-      </w:r>
-      <w:r>
-        <w:lastRenderedPageBreak/>
-        <w:t>that imitates Astana's climate, has a known warming and contains deliberate defects (gaps, sensor spikes, -999 codes). The tests require the tool to remove the defects and recover the known trend.</w:t>
+        <w:t xml:space="preserve"> with a synthetic dataset that imitates Astana's climate, has a known warming and contains deliberate defects (gaps, sensor spikes, -999 codes). The tests require the tool to remove the defects and recover the known trend.</w:t>
       </w:r>
     </w:p>
     <w:p>
@@ -3121,6 +3126,7 @@
         <w:rPr>
           <w:b/>
         </w:rPr>
+        <w:lastRenderedPageBreak/>
         <w:t>Reproducibility.</w:t>
       </w:r>
       <w:r>
@@ -4064,6 +4070,47 @@
               <w:jc w:val="left"/>
             </w:pPr>
             <w:r>
+              <w:t>Release v0.1.0</w:t>
+            </w:r>
+          </w:p>
+        </w:tc>
+        <w:tc>
+          <w:tcPr>
+            <w:tcW w:w="6236" w:type="dxa"/>
+          </w:tcPr>
+          <w:p>
+            <w:pPr>
+              <w:spacing w:before="40" w:after="40" w:line="240" w:lineRule="auto"/>
+              <w:ind w:firstLine="0"/>
+              <w:jc w:val="left"/>
+            </w:pPr>
+            <w:hyperlink r:id="rId18" w:history="1">
+              <w:r>
+                <w:rPr>
+                  <w:rStyle w:val="Hyperlink"/>
+                </w:rPr>
+                <w:t>releases/tag/v0.1.0</w:t>
+              </w:r>
+            </w:hyperlink>
+          </w:p>
+        </w:tc>
+      </w:tr>
+      <w:tr>
+        <w:trPr>
+          <w:cantSplit/>
+          <w:jc w:val="center"/>
+        </w:trPr>
+        <w:tc>
+          <w:tcPr>
+            <w:tcW w:w="3118" w:type="dxa"/>
+          </w:tcPr>
+          <w:p>
+            <w:pPr>
+              <w:spacing w:before="40" w:after="40" w:line="240" w:lineRule="auto"/>
+              <w:ind w:firstLine="0"/>
+              <w:jc w:val="left"/>
+            </w:pPr>
+            <w:r>
               <w:t>Issues</w:t>
             </w:r>
           </w:p>
@@ -4078,7 +4125,7 @@
               <w:ind w:firstLine="0"/>
               <w:jc w:val="left"/>
             </w:pPr>
-            <w:hyperlink r:id="rId18">
+            <w:hyperlink r:id="rId19">
               <w:r>
                 <w:rPr>
                   <w:color w:val="0563C1"/>
@@ -4225,7 +4272,7 @@
       <w:r>
         <w:t xml:space="preserve">1. Talgatov A. climate-analyzer: source code repository. GitHub, 2026. URL: </w:t>
       </w:r>
-      <w:hyperlink r:id="rId19">
+      <w:hyperlink r:id="rId20">
         <w:r>
           <w:rPr>
             <w:color w:val="0563C1"/>
@@ -4252,7 +4299,7 @@
       <w:r>
         <w:t xml:space="preserve">3. Chacon S., Straub B. Pro Git. 2nd ed. Apress, 2014. URL: </w:t>
       </w:r>
-      <w:hyperlink r:id="rId20">
+      <w:hyperlink r:id="rId21">
         <w:r>
           <w:rPr>
             <w:color w:val="0563C1"/>
@@ -4270,7 +4317,7 @@
       <w:r>
         <w:t xml:space="preserve">4. Fowler M. Continuous Integration. 2000 (rewritten 2006, revised 2024). URL: </w:t>
       </w:r>
-      <w:hyperlink r:id="rId21">
+      <w:hyperlink r:id="rId22">
         <w:r>
           <w:rPr>
             <w:color w:val="0563C1"/>
@@ -4333,7 +4380,7 @@
       <w:r>
         <w:t xml:space="preserve">10. Zippenfenig P. Open-Meteo.com Weather API. Zenodo, 2023. URL: </w:t>
       </w:r>
-      <w:hyperlink r:id="rId22">
+      <w:hyperlink r:id="rId23">
         <w:r>
           <w:rPr>
             <w:color w:val="0563C1"/>
@@ -4360,7 +4407,7 @@
       <w:r>
         <w:t xml:space="preserve">12. GitHub Actions documentation. GitHub Docs. URL: </w:t>
       </w:r>
-      <w:hyperlink r:id="rId23">
+      <w:hyperlink r:id="rId24">
         <w:r>
           <w:rPr>
             <w:color w:val="0563C1"/>
@@ -4378,7 +4425,7 @@
       <w:r>
         <w:t xml:space="preserve">13. Pogoda i Klimat. Climate of Astana (station 35188), 1991–2020 normals. URL: </w:t>
       </w:r>
-      <w:hyperlink r:id="rId24">
+      <w:hyperlink r:id="rId25">
         <w:r>
           <w:rPr>
             <w:color w:val="0563C1"/>
@@ -4396,7 +4443,7 @@
       <w:r>
         <w:t xml:space="preserve">14. Kazhydromet. Annual Bulletin of Monitoring Status and Climate Change of Kazakhstan: 2023. Astana, 2024. 90 p. URL: </w:t>
       </w:r>
-      <w:hyperlink r:id="rId25">
+      <w:hyperlink r:id="rId26">
         <w:r>
           <w:rPr>
             <w:color w:val="0563C1"/>
@@ -4407,7 +4454,7 @@
       </w:hyperlink>
     </w:p>
     <w:sectPr>
-      <w:footerReference w:type="default" r:id="rId26"/>
+      <w:footerReference w:type="default" r:id="rId27"/>
       <w:pgSz w:w="11906" w:h="16838"/>
       <w:pgMar w:top="1134" w:right="850" w:bottom="1134" w:left="1417" w:header="720" w:footer="720" w:gutter="0"/>
       <w:cols w:space="720"/>
@@ -16126,6 +16173,18 @@
       <w:u w:val="single"/>
     </w:rPr>
   </w:style>
+  <w:style w:type="character" w:styleId="UnresolvedMention">
+    <w:name w:val="Unresolved Mention"/>
+    <w:basedOn w:val="DefaultParagraphFont"/>
+    <w:uiPriority w:val="99"/>
+    <w:semiHidden/>
+    <w:unhideWhenUsed/>
+    <w:rsid w:val="00712C54"/>
+    <w:rPr>
+      <w:color w:val="605E5C"/>
+      <w:shd w:val="clear" w:color="auto" w:fill="E1DFDD"/>
+    </w:rPr>
+  </w:style>
 </w:styles>
 </file>
 

</xml_diff>

<commit_message>
Update Assignment 3 report with additional insights and revisions based on recent feedback.
</commit_message>
<xml_diff>
--- a/docs/report/Assignment3_Report.docx
+++ b/docs/report/Assignment3_Report.docx
@@ -923,10 +923,1838 @@
         <w:rPr>
           <w:b/>
         </w:rPr>
+        <w:t xml:space="preserve">Requirements specification.</w:t>
+      </w:r>
+      <w:r>
+        <w:t xml:space="preserve"> Four kinds of user were considered: a researcher who analyses a station file from the command line, a student who explores the result in the web interface, a developer who reuses the pipeline as a library, and a maintainer who needs checks and releases to run without manual steps. They give five use cases: analyse a CSV file and obtain a report (UC1); download real data for a city and analyse it (UC2); try the tool offline on the bundled sample (UC3); explore the result interactively and download the report (UC4); repeat the study on fresh data every month (UC5). Table 1 lists the functional requirements and Table 2 the non-functional ones; every requirement names the test or mechanism that verifies it, so none is left as a wish. The full specification, with data requirements, constraints and acceptance criteria, is in docs/REQUIREMENTS.md. Known limits are part of the requirements: the forecast is statistical and cannot predict individual weather events, and Open-Meteo describes a model grid cell, not a weather station.</w:t>
+      </w:r>
+    </w:p>
+    <w:p>
+      <w:pPr>
+        <w:keepNext/>
+        <w:spacing w:before="120"/>
+        <w:ind w:firstLine="0"/>
+        <w:jc w:val="left"/>
+      </w:pPr>
+      <w:r>
+        <w:t>Table 1 – Functional requirements and the tests that verify them</w:t>
+      </w:r>
+    </w:p>
+    <w:tbl>
+      <w:tblPr>
+        <w:tblStyle w:val="TableGrid"/>
+        <w:tblW w:w="0" w:type="auto"/>
+        <w:jc w:val="center"/>
+        <w:tblLayout w:type="fixed"/>
+        <w:tblLook w:val="04A0" w:firstRow="1" w:lastRow="0" w:firstColumn="1" w:lastColumn="0" w:noHBand="0" w:noVBand="1"/>
+      </w:tblPr>
+      <w:tblGrid>
+        <w:gridCol w:w="700"/>
+        <w:gridCol w:w="5900"/>
+        <w:gridCol w:w="2754"/>
+      </w:tblGrid>
+      <w:tr>
+        <w:trPr>
+          <w:cantSplit/>
+          <w:tblHeader/>
+          <w:jc w:val="center"/>
+        </w:trPr>
+        <w:tc>
+          <w:tcPr>
+            <w:tcW w:w="700" w:type="dxa"/>
+          </w:tcPr>
+          <w:p>
+            <w:pPr>
+              <w:keepNext/>
+              <w:spacing w:before="40" w:after="40" w:line="240" w:lineRule="auto"/>
+              <w:ind w:firstLine="0"/>
+              <w:jc w:val="left"/>
+            </w:pPr>
+            <w:r>
+              <w:rPr>
+                <w:b/>
+              </w:rPr>
+              <w:t>ID</w:t>
+            </w:r>
+          </w:p>
+        </w:tc>
+        <w:tc>
+          <w:tcPr>
+            <w:tcW w:w="5900" w:type="dxa"/>
+          </w:tcPr>
+          <w:p>
+            <w:pPr>
+              <w:keepNext/>
+              <w:spacing w:before="40" w:after="40" w:line="240" w:lineRule="auto"/>
+              <w:ind w:firstLine="0"/>
+              <w:jc w:val="left"/>
+            </w:pPr>
+            <w:r>
+              <w:rPr>
+                <w:b/>
+              </w:rPr>
+              <w:t>Requirement</w:t>
+            </w:r>
+          </w:p>
+        </w:tc>
+        <w:tc>
+          <w:tcPr>
+            <w:tcW w:w="2754" w:type="dxa"/>
+          </w:tcPr>
+          <w:p>
+            <w:pPr>
+              <w:keepNext/>
+              <w:spacing w:before="40" w:after="40" w:line="240" w:lineRule="auto"/>
+              <w:ind w:firstLine="0"/>
+              <w:jc w:val="left"/>
+            </w:pPr>
+            <w:r>
+              <w:rPr>
+                <w:b/>
+              </w:rPr>
+              <w:t>Verified by</w:t>
+            </w:r>
+          </w:p>
+        </w:tc>
+      </w:tr>
+      <w:tr>
+        <w:trPr>
+          <w:cantSplit/>
+          <w:jc w:val="center"/>
+        </w:trPr>
+        <w:tc>
+          <w:tcPr>
+            <w:tcW w:w="700" w:type="dxa"/>
+          </w:tcPr>
+          <w:p>
+            <w:pPr>
+              <w:keepNext/>
+              <w:spacing w:before="40" w:after="40" w:line="240" w:lineRule="auto"/>
+              <w:ind w:firstLine="0"/>
+              <w:jc w:val="left"/>
+            </w:pPr>
+            <w:r>
+              <w:t>F1</w:t>
+            </w:r>
+          </w:p>
+        </w:tc>
+        <w:tc>
+          <w:tcPr>
+            <w:tcW w:w="5900" w:type="dxa"/>
+          </w:tcPr>
+          <w:p>
+            <w:pPr>
+              <w:keepNext/>
+              <w:spacing w:before="40" w:after="40" w:line="240" w:lineRule="auto"/>
+              <w:ind w:firstLine="0"/>
+              <w:jc w:val="left"/>
+            </w:pPr>
+            <w:r>
+              <w:t>Read a CSV file with a date column; detect the date column automatically or take it by name</w:t>
+            </w:r>
+          </w:p>
+        </w:tc>
+        <w:tc>
+          <w:tcPr>
+            <w:tcW w:w="2754" w:type="dxa"/>
+          </w:tcPr>
+          <w:p>
+            <w:pPr>
+              <w:keepNext/>
+              <w:spacing w:before="40" w:after="40" w:line="240" w:lineRule="auto"/>
+              <w:ind w:firstLine="0"/>
+              <w:jc w:val="left"/>
+            </w:pPr>
+            <w:r>
+              <w:t>test_io</w:t>
+            </w:r>
+          </w:p>
+        </w:tc>
+      </w:tr>
+      <w:tr>
+        <w:trPr>
+          <w:cantSplit/>
+          <w:jc w:val="center"/>
+        </w:trPr>
+        <w:tc>
+          <w:tcPr>
+            <w:tcW w:w="700" w:type="dxa"/>
+          </w:tcPr>
+          <w:p>
+            <w:pPr>
+              <w:keepNext/>
+              <w:spacing w:before="40" w:after="40" w:line="240" w:lineRule="auto"/>
+              <w:ind w:firstLine="0"/>
+              <w:jc w:val="left"/>
+            </w:pPr>
+            <w:r>
+              <w:t>F2</w:t>
+            </w:r>
+          </w:p>
+        </w:tc>
+        <w:tc>
+          <w:tcPr>
+            <w:tcW w:w="5900" w:type="dxa"/>
+          </w:tcPr>
+          <w:p>
+            <w:pPr>
+              <w:keepNext/>
+              <w:spacing w:before="40" w:after="40" w:line="240" w:lineRule="auto"/>
+              <w:ind w:firstLine="0"/>
+              <w:jc w:val="left"/>
+            </w:pPr>
+            <w:r>
+              <w:t>Convert placeholder codes such as -999 to missing values; sort rows and remove duplicate dates</w:t>
+            </w:r>
+          </w:p>
+        </w:tc>
+        <w:tc>
+          <w:tcPr>
+            <w:tcW w:w="2754" w:type="dxa"/>
+          </w:tcPr>
+          <w:p>
+            <w:pPr>
+              <w:keepNext/>
+              <w:spacing w:before="40" w:after="40" w:line="240" w:lineRule="auto"/>
+              <w:ind w:firstLine="0"/>
+              <w:jc w:val="left"/>
+            </w:pPr>
+            <w:r>
+              <w:t>test_io</w:t>
+            </w:r>
+          </w:p>
+        </w:tc>
+      </w:tr>
+      <w:tr>
+        <w:trPr>
+          <w:cantSplit/>
+          <w:jc w:val="center"/>
+        </w:trPr>
+        <w:tc>
+          <w:tcPr>
+            <w:tcW w:w="700" w:type="dxa"/>
+          </w:tcPr>
+          <w:p>
+            <w:pPr>
+              <w:keepNext/>
+              <w:spacing w:before="40" w:after="40" w:line="240" w:lineRule="auto"/>
+              <w:ind w:firstLine="0"/>
+              <w:jc w:val="left"/>
+            </w:pPr>
+            <w:r>
+              <w:t>F3</w:t>
+            </w:r>
+          </w:p>
+        </w:tc>
+        <w:tc>
+          <w:tcPr>
+            <w:tcW w:w="5900" w:type="dxa"/>
+          </w:tcPr>
+          <w:p>
+            <w:pPr>
+              <w:keepNext/>
+              <w:spacing w:before="40" w:after="40" w:line="240" w:lineRule="auto"/>
+              <w:ind w:firstLine="0"/>
+              <w:jc w:val="left"/>
+            </w:pPr>
+            <w:r>
+              <w:t>Download daily history for a city or coordinates from Open-Meteo</w:t>
+            </w:r>
+          </w:p>
+        </w:tc>
+        <w:tc>
+          <w:tcPr>
+            <w:tcW w:w="2754" w:type="dxa"/>
+          </w:tcPr>
+          <w:p>
+            <w:pPr>
+              <w:keepNext/>
+              <w:spacing w:before="40" w:after="40" w:line="240" w:lineRule="auto"/>
+              <w:ind w:firstLine="0"/>
+              <w:jc w:val="left"/>
+            </w:pPr>
+            <w:r>
+              <w:t>test_sources</w:t>
+            </w:r>
+          </w:p>
+        </w:tc>
+      </w:tr>
+      <w:tr>
+        <w:trPr>
+          <w:cantSplit/>
+          <w:jc w:val="center"/>
+        </w:trPr>
+        <w:tc>
+          <w:tcPr>
+            <w:tcW w:w="700" w:type="dxa"/>
+          </w:tcPr>
+          <w:p>
+            <w:pPr>
+              <w:keepNext/>
+              <w:spacing w:before="40" w:after="40" w:line="240" w:lineRule="auto"/>
+              <w:ind w:firstLine="0"/>
+              <w:jc w:val="left"/>
+            </w:pPr>
+            <w:r>
+              <w:t>F4</w:t>
+            </w:r>
+          </w:p>
+        </w:tc>
+        <w:tc>
+          <w:tcPr>
+            <w:tcW w:w="5900" w:type="dxa"/>
+          </w:tcPr>
+          <w:p>
+            <w:pPr>
+              <w:keepNext/>
+              <w:spacing w:before="40" w:after="40" w:line="240" w:lineRule="auto"/>
+              <w:ind w:firstLine="0"/>
+              <w:jc w:val="left"/>
+            </w:pPr>
+            <w:r>
+              <w:t>Detect outliers relative to the same calendar month (z-score or IQR, configurable, or off)</w:t>
+            </w:r>
+          </w:p>
+        </w:tc>
+        <w:tc>
+          <w:tcPr>
+            <w:tcW w:w="2754" w:type="dxa"/>
+          </w:tcPr>
+          <w:p>
+            <w:pPr>
+              <w:keepNext/>
+              <w:spacing w:before="40" w:after="40" w:line="240" w:lineRule="auto"/>
+              <w:ind w:firstLine="0"/>
+              <w:jc w:val="left"/>
+            </w:pPr>
+            <w:r>
+              <w:t>test_cleaning</w:t>
+            </w:r>
+          </w:p>
+        </w:tc>
+      </w:tr>
+      <w:tr>
+        <w:trPr>
+          <w:cantSplit/>
+          <w:jc w:val="center"/>
+        </w:trPr>
+        <w:tc>
+          <w:tcPr>
+            <w:tcW w:w="700" w:type="dxa"/>
+          </w:tcPr>
+          <w:p>
+            <w:pPr>
+              <w:keepNext/>
+              <w:spacing w:before="40" w:after="40" w:line="240" w:lineRule="auto"/>
+              <w:ind w:firstLine="0"/>
+              <w:jc w:val="left"/>
+            </w:pPr>
+            <w:r>
+              <w:t>F5</w:t>
+            </w:r>
+          </w:p>
+        </w:tc>
+        <w:tc>
+          <w:tcPr>
+            <w:tcW w:w="5900" w:type="dxa"/>
+          </w:tcPr>
+          <w:p>
+            <w:pPr>
+              <w:keepNext/>
+              <w:spacing w:before="40" w:after="40" w:line="240" w:lineRule="auto"/>
+              <w:ind w:firstLine="0"/>
+              <w:jc w:val="left"/>
+            </w:pPr>
+            <w:r>
+              <w:t>Interpolate gaps of up to 3 days (configurable); longer gaps stay missing</w:t>
+            </w:r>
+          </w:p>
+        </w:tc>
+        <w:tc>
+          <w:tcPr>
+            <w:tcW w:w="2754" w:type="dxa"/>
+          </w:tcPr>
+          <w:p>
+            <w:pPr>
+              <w:keepNext/>
+              <w:spacing w:before="40" w:after="40" w:line="240" w:lineRule="auto"/>
+              <w:ind w:firstLine="0"/>
+              <w:jc w:val="left"/>
+            </w:pPr>
+            <w:r>
+              <w:t>test_cleaning</w:t>
+            </w:r>
+          </w:p>
+        </w:tc>
+      </w:tr>
+      <w:tr>
+        <w:trPr>
+          <w:cantSplit/>
+          <w:jc w:val="center"/>
+        </w:trPr>
+        <w:tc>
+          <w:tcPr>
+            <w:tcW w:w="700" w:type="dxa"/>
+          </w:tcPr>
+          <w:p>
+            <w:pPr>
+              <w:keepNext/>
+              <w:spacing w:before="40" w:after="40" w:line="240" w:lineRule="auto"/>
+              <w:ind w:firstLine="0"/>
+              <w:jc w:val="left"/>
+            </w:pPr>
+            <w:r>
+              <w:t>F6</w:t>
+            </w:r>
+          </w:p>
+        </w:tc>
+        <w:tc>
+          <w:tcPr>
+            <w:tcW w:w="5900" w:type="dxa"/>
+          </w:tcPr>
+          <w:p>
+            <w:pPr>
+              <w:keepNext/>
+              <w:spacing w:before="40" w:after="40" w:line="240" w:lineRule="auto"/>
+              <w:ind w:firstLine="0"/>
+              <w:jc w:val="left"/>
+            </w:pPr>
+            <w:r>
+              <w:t>Report how many values were removed and filled</w:t>
+            </w:r>
+          </w:p>
+        </w:tc>
+        <w:tc>
+          <w:tcPr>
+            <w:tcW w:w="2754" w:type="dxa"/>
+          </w:tcPr>
+          <w:p>
+            <w:pPr>
+              <w:keepNext/>
+              <w:spacing w:before="40" w:after="40" w:line="240" w:lineRule="auto"/>
+              <w:ind w:firstLine="0"/>
+              <w:jc w:val="left"/>
+            </w:pPr>
+            <w:r>
+              <w:t>test_cleaning</w:t>
+            </w:r>
+          </w:p>
+        </w:tc>
+      </w:tr>
+      <w:tr>
+        <w:trPr>
+          <w:cantSplit/>
+          <w:jc w:val="center"/>
+        </w:trPr>
+        <w:tc>
+          <w:tcPr>
+            <w:tcW w:w="700" w:type="dxa"/>
+          </w:tcPr>
+          <w:p>
+            <w:pPr>
+              <w:keepNext/>
+              <w:spacing w:before="40" w:after="40" w:line="240" w:lineRule="auto"/>
+              <w:ind w:firstLine="0"/>
+              <w:jc w:val="left"/>
+            </w:pPr>
+            <w:r>
+              <w:t>F7</w:t>
+            </w:r>
+          </w:p>
+        </w:tc>
+        <w:tc>
+          <w:tcPr>
+            <w:tcW w:w="5900" w:type="dxa"/>
+          </w:tcPr>
+          <w:p>
+            <w:pPr>
+              <w:keepNext/>
+              <w:spacing w:before="40" w:after="40" w:line="240" w:lineRule="auto"/>
+              <w:ind w:firstLine="0"/>
+              <w:jc w:val="left"/>
+            </w:pPr>
+            <w:r>
+              <w:t>Aggregate to monthly and yearly values; drop months and years with less than 80 % coverage</w:t>
+            </w:r>
+          </w:p>
+        </w:tc>
+        <w:tc>
+          <w:tcPr>
+            <w:tcW w:w="2754" w:type="dxa"/>
+          </w:tcPr>
+          <w:p>
+            <w:pPr>
+              <w:keepNext/>
+              <w:spacing w:before="40" w:after="40" w:line="240" w:lineRule="auto"/>
+              <w:ind w:firstLine="0"/>
+              <w:jc w:val="left"/>
+            </w:pPr>
+            <w:r>
+              <w:t>test_analysis</w:t>
+            </w:r>
+          </w:p>
+        </w:tc>
+      </w:tr>
+      <w:tr>
+        <w:trPr>
+          <w:cantSplit/>
+          <w:jc w:val="center"/>
+        </w:trPr>
+        <w:tc>
+          <w:tcPr>
+            <w:tcW w:w="700" w:type="dxa"/>
+          </w:tcPr>
+          <w:p>
+            <w:pPr>
+              <w:keepNext/>
+              <w:spacing w:before="40" w:after="40" w:line="240" w:lineRule="auto"/>
+              <w:ind w:firstLine="0"/>
+              <w:jc w:val="left"/>
+            </w:pPr>
+            <w:r>
+              <w:t>F8</w:t>
+            </w:r>
+          </w:p>
+        </w:tc>
+        <w:tc>
+          <w:tcPr>
+            <w:tcW w:w="5900" w:type="dxa"/>
+          </w:tcPr>
+          <w:p>
+            <w:pPr>
+              <w:keepNext/>
+              <w:spacing w:before="40" w:after="40" w:line="240" w:lineRule="auto"/>
+              <w:ind w:firstLine="0"/>
+              <w:jc w:val="left"/>
+            </w:pPr>
+            <w:r>
+              <w:t>Estimate the annual trend by OLS and by Mann–Kendall with Sen's slope, with p-values</w:t>
+            </w:r>
+          </w:p>
+        </w:tc>
+        <w:tc>
+          <w:tcPr>
+            <w:tcW w:w="2754" w:type="dxa"/>
+          </w:tcPr>
+          <w:p>
+            <w:pPr>
+              <w:keepNext/>
+              <w:spacing w:before="40" w:after="40" w:line="240" w:lineRule="auto"/>
+              <w:ind w:firstLine="0"/>
+              <w:jc w:val="left"/>
+            </w:pPr>
+            <w:r>
+              <w:t>test_analysis</w:t>
+            </w:r>
+          </w:p>
+        </w:tc>
+      </w:tr>
+      <w:tr>
+        <w:trPr>
+          <w:cantSplit/>
+          <w:jc w:val="center"/>
+        </w:trPr>
+        <w:tc>
+          <w:tcPr>
+            <w:tcW w:w="700" w:type="dxa"/>
+          </w:tcPr>
+          <w:p>
+            <w:pPr>
+              <w:keepNext/>
+              <w:spacing w:before="40" w:after="40" w:line="240" w:lineRule="auto"/>
+              <w:ind w:firstLine="0"/>
+              <w:jc w:val="left"/>
+            </w:pPr>
+            <w:r>
+              <w:t>F9</w:t>
+            </w:r>
+          </w:p>
+        </w:tc>
+        <w:tc>
+          <w:tcPr>
+            <w:tcW w:w="5900" w:type="dxa"/>
+          </w:tcPr>
+          <w:p>
+            <w:pPr>
+              <w:keepNext/>
+              <w:spacing w:before="40" w:after="40" w:line="240" w:lineRule="auto"/>
+              <w:ind w:firstLine="0"/>
+              <w:jc w:val="left"/>
+            </w:pPr>
+            <w:r>
+              <w:t>Compute anomalies against a baseline period, climatology and seasonal decomposition</w:t>
+            </w:r>
+          </w:p>
+        </w:tc>
+        <w:tc>
+          <w:tcPr>
+            <w:tcW w:w="2754" w:type="dxa"/>
+          </w:tcPr>
+          <w:p>
+            <w:pPr>
+              <w:keepNext/>
+              <w:spacing w:before="40" w:after="40" w:line="240" w:lineRule="auto"/>
+              <w:ind w:firstLine="0"/>
+              <w:jc w:val="left"/>
+            </w:pPr>
+            <w:r>
+              <w:t>test_analysis</w:t>
+            </w:r>
+          </w:p>
+        </w:tc>
+      </w:tr>
+      <w:tr>
+        <w:trPr>
+          <w:cantSplit/>
+          <w:jc w:val="center"/>
+        </w:trPr>
+        <w:tc>
+          <w:tcPr>
+            <w:tcW w:w="700" w:type="dxa"/>
+          </w:tcPr>
+          <w:p>
+            <w:pPr>
+              <w:keepNext/>
+              <w:spacing w:before="40" w:after="40" w:line="240" w:lineRule="auto"/>
+              <w:ind w:firstLine="0"/>
+              <w:jc w:val="left"/>
+            </w:pPr>
+            <w:r>
+              <w:t>F10</w:t>
+            </w:r>
+          </w:p>
+        </w:tc>
+        <w:tc>
+          <w:tcPr>
+            <w:tcW w:w="5900" w:type="dxa"/>
+          </w:tcPr>
+          <w:p>
+            <w:pPr>
+              <w:keepNext/>
+              <w:spacing w:before="40" w:after="40" w:line="240" w:lineRule="auto"/>
+              <w:ind w:firstLine="0"/>
+              <w:jc w:val="left"/>
+            </w:pPr>
+            <w:r>
+              <w:t>Count warm and cold extreme days per year (10th/90th percentile of the same month)</w:t>
+            </w:r>
+          </w:p>
+        </w:tc>
+        <w:tc>
+          <w:tcPr>
+            <w:tcW w:w="2754" w:type="dxa"/>
+          </w:tcPr>
+          <w:p>
+            <w:pPr>
+              <w:keepNext/>
+              <w:spacing w:before="40" w:after="40" w:line="240" w:lineRule="auto"/>
+              <w:ind w:firstLine="0"/>
+              <w:jc w:val="left"/>
+            </w:pPr>
+            <w:r>
+              <w:t>test_analysis</w:t>
+            </w:r>
+          </w:p>
+        </w:tc>
+      </w:tr>
+      <w:tr>
+        <w:trPr>
+          <w:cantSplit/>
+          <w:jc w:val="center"/>
+        </w:trPr>
+        <w:tc>
+          <w:tcPr>
+            <w:tcW w:w="700" w:type="dxa"/>
+          </w:tcPr>
+          <w:p>
+            <w:pPr>
+              <w:keepNext/>
+              <w:spacing w:before="40" w:after="40" w:line="240" w:lineRule="auto"/>
+              <w:ind w:firstLine="0"/>
+              <w:jc w:val="left"/>
+            </w:pPr>
+            <w:r>
+              <w:t>F11</w:t>
+            </w:r>
+          </w:p>
+        </w:tc>
+        <w:tc>
+          <w:tcPr>
+            <w:tcW w:w="5900" w:type="dxa"/>
+          </w:tcPr>
+          <w:p>
+            <w:pPr>
+              <w:keepNext/>
+              <w:spacing w:before="40" w:after="40" w:line="240" w:lineRule="auto"/>
+              <w:ind w:firstLine="0"/>
+              <w:jc w:val="left"/>
+            </w:pPr>
+            <w:r>
+              <w:t>Fit trend + annual harmonics + AR(1) and forecast N months with a 95 % interval</w:t>
+            </w:r>
+          </w:p>
+        </w:tc>
+        <w:tc>
+          <w:tcPr>
+            <w:tcW w:w="2754" w:type="dxa"/>
+          </w:tcPr>
+          <w:p>
+            <w:pPr>
+              <w:keepNext/>
+              <w:spacing w:before="40" w:after="40" w:line="240" w:lineRule="auto"/>
+              <w:ind w:firstLine="0"/>
+              <w:jc w:val="left"/>
+            </w:pPr>
+            <w:r>
+              <w:t>test_forecast</w:t>
+            </w:r>
+          </w:p>
+        </w:tc>
+      </w:tr>
+      <w:tr>
+        <w:trPr>
+          <w:cantSplit/>
+          <w:jc w:val="center"/>
+        </w:trPr>
+        <w:tc>
+          <w:tcPr>
+            <w:tcW w:w="700" w:type="dxa"/>
+          </w:tcPr>
+          <w:p>
+            <w:pPr>
+              <w:keepNext/>
+              <w:spacing w:before="40" w:after="40" w:line="240" w:lineRule="auto"/>
+              <w:ind w:firstLine="0"/>
+              <w:jc w:val="left"/>
+            </w:pPr>
+            <w:r>
+              <w:t>F12</w:t>
+            </w:r>
+          </w:p>
+        </w:tc>
+        <w:tc>
+          <w:tcPr>
+            <w:tcW w:w="5900" w:type="dxa"/>
+          </w:tcPr>
+          <w:p>
+            <w:pPr>
+              <w:keepNext/>
+              <w:spacing w:before="40" w:after="40" w:line="240" w:lineRule="auto"/>
+              <w:ind w:firstLine="0"/>
+              <w:jc w:val="left"/>
+            </w:pPr>
+            <w:r>
+              <w:t>Backtest on the last N months and compare the error with the climatology baseline</w:t>
+            </w:r>
+          </w:p>
+        </w:tc>
+        <w:tc>
+          <w:tcPr>
+            <w:tcW w:w="2754" w:type="dxa"/>
+          </w:tcPr>
+          <w:p>
+            <w:pPr>
+              <w:keepNext/>
+              <w:spacing w:before="40" w:after="40" w:line="240" w:lineRule="auto"/>
+              <w:ind w:firstLine="0"/>
+              <w:jc w:val="left"/>
+            </w:pPr>
+            <w:r>
+              <w:t>test_forecast</w:t>
+            </w:r>
+          </w:p>
+        </w:tc>
+      </w:tr>
+      <w:tr>
+        <w:trPr>
+          <w:cantSplit/>
+          <w:jc w:val="center"/>
+        </w:trPr>
+        <w:tc>
+          <w:tcPr>
+            <w:tcW w:w="700" w:type="dxa"/>
+          </w:tcPr>
+          <w:p>
+            <w:pPr>
+              <w:keepNext/>
+              <w:spacing w:before="40" w:after="40" w:line="240" w:lineRule="auto"/>
+              <w:ind w:firstLine="0"/>
+              <w:jc w:val="left"/>
+            </w:pPr>
+            <w:r>
+              <w:t>F13</w:t>
+            </w:r>
+          </w:p>
+        </w:tc>
+        <w:tc>
+          <w:tcPr>
+            <w:tcW w:w="5900" w:type="dxa"/>
+          </w:tcPr>
+          <w:p>
+            <w:pPr>
+              <w:keepNext/>
+              <w:spacing w:before="40" w:after="40" w:line="240" w:lineRule="auto"/>
+              <w:ind w:firstLine="0"/>
+              <w:jc w:val="left"/>
+            </w:pPr>
+            <w:r>
+              <w:t>Write report.md, summary.json, CSV tables and PNG figures</w:t>
+            </w:r>
+          </w:p>
+        </w:tc>
+        <w:tc>
+          <w:tcPr>
+            <w:tcW w:w="2754" w:type="dxa"/>
+          </w:tcPr>
+          <w:p>
+            <w:pPr>
+              <w:keepNext/>
+              <w:spacing w:before="40" w:after="40" w:line="240" w:lineRule="auto"/>
+              <w:ind w:firstLine="0"/>
+              <w:jc w:val="left"/>
+            </w:pPr>
+            <w:r>
+              <w:t>test_pipeline, test_plotting_cli</w:t>
+            </w:r>
+          </w:p>
+        </w:tc>
+      </w:tr>
+      <w:tr>
+        <w:trPr>
+          <w:cantSplit/>
+          <w:jc w:val="center"/>
+        </w:trPr>
+        <w:tc>
+          <w:tcPr>
+            <w:tcW w:w="700" w:type="dxa"/>
+          </w:tcPr>
+          <w:p>
+            <w:pPr>
+              <w:keepNext/>
+              <w:spacing w:before="40" w:after="40" w:line="240" w:lineRule="auto"/>
+              <w:ind w:firstLine="0"/>
+              <w:jc w:val="left"/>
+            </w:pPr>
+            <w:r>
+              <w:t>F14</w:t>
+            </w:r>
+          </w:p>
+        </w:tc>
+        <w:tc>
+          <w:tcPr>
+            <w:tcW w:w="5900" w:type="dxa"/>
+          </w:tcPr>
+          <w:p>
+            <w:pPr>
+              <w:keepNext/>
+              <w:spacing w:before="40" w:after="40" w:line="240" w:lineRule="auto"/>
+              <w:ind w:firstLine="0"/>
+              <w:jc w:val="left"/>
+            </w:pPr>
+            <w:r>
+              <w:t>Skip a stage that cannot run with a warning and finish the rest of the analysis</w:t>
+            </w:r>
+          </w:p>
+        </w:tc>
+        <w:tc>
+          <w:tcPr>
+            <w:tcW w:w="2754" w:type="dxa"/>
+          </w:tcPr>
+          <w:p>
+            <w:pPr>
+              <w:keepNext/>
+              <w:spacing w:before="40" w:after="40" w:line="240" w:lineRule="auto"/>
+              <w:ind w:firstLine="0"/>
+              <w:jc w:val="left"/>
+            </w:pPr>
+            <w:r>
+              <w:t>test_pipeline</w:t>
+            </w:r>
+          </w:p>
+        </w:tc>
+      </w:tr>
+      <w:tr>
+        <w:trPr>
+          <w:cantSplit/>
+          <w:jc w:val="center"/>
+        </w:trPr>
+        <w:tc>
+          <w:tcPr>
+            <w:tcW w:w="700" w:type="dxa"/>
+          </w:tcPr>
+          <w:p>
+            <w:pPr>
+              <w:keepNext/>
+              <w:spacing w:before="40" w:after="40" w:line="240" w:lineRule="auto"/>
+              <w:ind w:firstLine="0"/>
+              <w:jc w:val="left"/>
+            </w:pPr>
+            <w:r>
+              <w:t>F15</w:t>
+            </w:r>
+          </w:p>
+        </w:tc>
+        <w:tc>
+          <w:tcPr>
+            <w:tcW w:w="5900" w:type="dxa"/>
+          </w:tcPr>
+          <w:p>
+            <w:pPr>
+              <w:keepNext/>
+              <w:spacing w:before="40" w:after="40" w:line="240" w:lineRule="auto"/>
+              <w:ind w:firstLine="0"/>
+              <w:jc w:val="left"/>
+            </w:pPr>
+            <w:r>
+              <w:t>Web UI: choose the data source, set options, show interactive charts with explanations, download the report</w:t>
+            </w:r>
+          </w:p>
+        </w:tc>
+        <w:tc>
+          <w:tcPr>
+            <w:tcW w:w="2754" w:type="dxa"/>
+          </w:tcPr>
+          <w:p>
+            <w:pPr>
+              <w:keepNext/>
+              <w:spacing w:before="40" w:after="40" w:line="240" w:lineRule="auto"/>
+              <w:ind w:firstLine="0"/>
+              <w:jc w:val="left"/>
+            </w:pPr>
+            <w:r>
+              <w:t>test_app</w:t>
+            </w:r>
+          </w:p>
+        </w:tc>
+      </w:tr>
+      <w:tr>
+        <w:trPr>
+          <w:cantSplit/>
+          <w:jc w:val="center"/>
+        </w:trPr>
+        <w:tc>
+          <w:tcPr>
+            <w:tcW w:w="700" w:type="dxa"/>
+          </w:tcPr>
+          <w:p>
+            <w:pPr>
+              <w:keepNext/>
+              <w:spacing w:before="40" w:after="40" w:line="240" w:lineRule="auto"/>
+              <w:ind w:firstLine="0"/>
+              <w:jc w:val="left"/>
+            </w:pPr>
+            <w:r>
+              <w:t>F16</w:t>
+            </w:r>
+          </w:p>
+        </w:tc>
+        <w:tc>
+          <w:tcPr>
+            <w:tcW w:w="5900" w:type="dxa"/>
+          </w:tcPr>
+          <w:p>
+            <w:pPr>
+              <w:keepNext/>
+              <w:spacing w:before="40" w:after="40" w:line="240" w:lineRule="auto"/>
+              <w:ind w:firstLine="0"/>
+              <w:jc w:val="left"/>
+            </w:pPr>
+            <w:r>
+              <w:t>Command line: analyze and fetch commands with options for variable, units, cleaning, baseline, horizon</w:t>
+            </w:r>
+          </w:p>
+        </w:tc>
+        <w:tc>
+          <w:tcPr>
+            <w:tcW w:w="2754" w:type="dxa"/>
+          </w:tcPr>
+          <w:p>
+            <w:pPr>
+              <w:keepNext/>
+              <w:spacing w:before="40" w:after="40" w:line="240" w:lineRule="auto"/>
+              <w:ind w:firstLine="0"/>
+              <w:jc w:val="left"/>
+            </w:pPr>
+            <w:r>
+              <w:t>test_plotting_cli</w:t>
+            </w:r>
+          </w:p>
+        </w:tc>
+      </w:tr>
+    </w:tbl>
+    <w:p>
+      <w:pPr>
+        <w:spacing w:line="240" w:lineRule="auto"/>
+        <w:ind w:firstLine="0"/>
+      </w:pPr>
+    </w:p>
+    <w:p>
+      <w:pPr>
+        <w:keepNext/>
+        <w:spacing w:before="120"/>
+        <w:ind w:firstLine="0"/>
+        <w:jc w:val="left"/>
+      </w:pPr>
+      <w:r>
+        <w:t>Table 2 – Non-functional requirements and how they are met</w:t>
+      </w:r>
+    </w:p>
+    <w:tbl>
+      <w:tblPr>
+        <w:tblStyle w:val="TableGrid"/>
+        <w:tblW w:w="0" w:type="auto"/>
+        <w:jc w:val="center"/>
+        <w:tblLayout w:type="fixed"/>
+        <w:tblLook w:val="04A0" w:firstRow="1" w:lastRow="0" w:firstColumn="1" w:lastColumn="0" w:noHBand="0" w:noVBand="1"/>
+      </w:tblPr>
+      <w:tblGrid>
+        <w:gridCol w:w="700"/>
+        <w:gridCol w:w="5200"/>
+        <w:gridCol w:w="3454"/>
+      </w:tblGrid>
+      <w:tr>
+        <w:trPr>
+          <w:cantSplit/>
+          <w:tblHeader/>
+          <w:jc w:val="center"/>
+        </w:trPr>
+        <w:tc>
+          <w:tcPr>
+            <w:tcW w:w="700" w:type="dxa"/>
+          </w:tcPr>
+          <w:p>
+            <w:pPr>
+              <w:keepNext/>
+              <w:spacing w:before="40" w:after="40" w:line="240" w:lineRule="auto"/>
+              <w:ind w:firstLine="0"/>
+              <w:jc w:val="left"/>
+            </w:pPr>
+            <w:r>
+              <w:rPr>
+                <w:b/>
+              </w:rPr>
+              <w:t>ID</w:t>
+            </w:r>
+          </w:p>
+        </w:tc>
+        <w:tc>
+          <w:tcPr>
+            <w:tcW w:w="5200" w:type="dxa"/>
+          </w:tcPr>
+          <w:p>
+            <w:pPr>
+              <w:keepNext/>
+              <w:spacing w:before="40" w:after="40" w:line="240" w:lineRule="auto"/>
+              <w:ind w:firstLine="0"/>
+              <w:jc w:val="left"/>
+            </w:pPr>
+            <w:r>
+              <w:rPr>
+                <w:b/>
+              </w:rPr>
+              <w:t>Requirement</w:t>
+            </w:r>
+          </w:p>
+        </w:tc>
+        <w:tc>
+          <w:tcPr>
+            <w:tcW w:w="3454" w:type="dxa"/>
+          </w:tcPr>
+          <w:p>
+            <w:pPr>
+              <w:keepNext/>
+              <w:spacing w:before="40" w:after="40" w:line="240" w:lineRule="auto"/>
+              <w:ind w:firstLine="0"/>
+              <w:jc w:val="left"/>
+            </w:pPr>
+            <w:r>
+              <w:rPr>
+                <w:b/>
+              </w:rPr>
+              <w:t>How it is met</w:t>
+            </w:r>
+          </w:p>
+        </w:tc>
+      </w:tr>
+      <w:tr>
+        <w:trPr>
+          <w:cantSplit/>
+          <w:jc w:val="center"/>
+        </w:trPr>
+        <w:tc>
+          <w:tcPr>
+            <w:tcW w:w="700" w:type="dxa"/>
+          </w:tcPr>
+          <w:p>
+            <w:pPr>
+              <w:keepNext/>
+              <w:spacing w:before="40" w:after="40" w:line="240" w:lineRule="auto"/>
+              <w:ind w:firstLine="0"/>
+              <w:jc w:val="left"/>
+            </w:pPr>
+            <w:r>
+              <w:t>N1</w:t>
+            </w:r>
+          </w:p>
+        </w:tc>
+        <w:tc>
+          <w:tcPr>
+            <w:tcW w:w="5200" w:type="dxa"/>
+          </w:tcPr>
+          <w:p>
+            <w:pPr>
+              <w:keepNext/>
+              <w:spacing w:before="40" w:after="40" w:line="240" w:lineRule="auto"/>
+              <w:ind w:firstLine="0"/>
+              <w:jc w:val="left"/>
+            </w:pPr>
+            <w:r>
+              <w:t>Correctness: recover a known trend from data with known defects</w:t>
+            </w:r>
+          </w:p>
+        </w:tc>
+        <w:tc>
+          <w:tcPr>
+            <w:tcW w:w="3454" w:type="dxa"/>
+          </w:tcPr>
+          <w:p>
+            <w:pPr>
+              <w:keepNext/>
+              <w:spacing w:before="40" w:after="40" w:line="240" w:lineRule="auto"/>
+              <w:ind w:firstLine="0"/>
+              <w:jc w:val="left"/>
+            </w:pPr>
+            <w:r>
+              <w:t>Synthetic dataset, +0.35 °C per decade</w:t>
+            </w:r>
+          </w:p>
+        </w:tc>
+      </w:tr>
+      <w:tr>
+        <w:trPr>
+          <w:cantSplit/>
+          <w:jc w:val="center"/>
+        </w:trPr>
+        <w:tc>
+          <w:tcPr>
+            <w:tcW w:w="700" w:type="dxa"/>
+          </w:tcPr>
+          <w:p>
+            <w:pPr>
+              <w:keepNext/>
+              <w:spacing w:before="40" w:after="40" w:line="240" w:lineRule="auto"/>
+              <w:ind w:firstLine="0"/>
+              <w:jc w:val="left"/>
+            </w:pPr>
+            <w:r>
+              <w:t>N2</w:t>
+            </w:r>
+          </w:p>
+        </w:tc>
+        <w:tc>
+          <w:tcPr>
+            <w:tcW w:w="5200" w:type="dxa"/>
+          </w:tcPr>
+          <w:p>
+            <w:pPr>
+              <w:keepNext/>
+              <w:spacing w:before="40" w:after="40" w:line="240" w:lineRule="auto"/>
+              <w:ind w:firstLine="0"/>
+              <w:jc w:val="left"/>
+            </w:pPr>
+            <w:r>
+              <w:t>Reproducibility: same input gives the same output on any machine</w:t>
+            </w:r>
+          </w:p>
+        </w:tc>
+        <w:tc>
+          <w:tcPr>
+            <w:tcW w:w="3454" w:type="dxa"/>
+          </w:tcPr>
+          <w:p>
+            <w:pPr>
+              <w:keepNext/>
+              <w:spacing w:before="40" w:after="40" w:line="240" w:lineRule="auto"/>
+              <w:ind w:firstLine="0"/>
+              <w:jc w:val="left"/>
+            </w:pPr>
+            <w:r>
+              <w:t>Fixed seed, no display, no network in tests</w:t>
+            </w:r>
+          </w:p>
+        </w:tc>
+      </w:tr>
+      <w:tr>
+        <w:trPr>
+          <w:cantSplit/>
+          <w:jc w:val="center"/>
+        </w:trPr>
+        <w:tc>
+          <w:tcPr>
+            <w:tcW w:w="700" w:type="dxa"/>
+          </w:tcPr>
+          <w:p>
+            <w:pPr>
+              <w:keepNext/>
+              <w:spacing w:before="40" w:after="40" w:line="240" w:lineRule="auto"/>
+              <w:ind w:firstLine="0"/>
+              <w:jc w:val="left"/>
+            </w:pPr>
+            <w:r>
+              <w:t>N3</w:t>
+            </w:r>
+          </w:p>
+        </w:tc>
+        <w:tc>
+          <w:tcPr>
+            <w:tcW w:w="5200" w:type="dxa"/>
+          </w:tcPr>
+          <w:p>
+            <w:pPr>
+              <w:keepNext/>
+              <w:spacing w:before="40" w:after="40" w:line="240" w:lineRule="auto"/>
+              <w:ind w:firstLine="0"/>
+              <w:jc w:val="left"/>
+            </w:pPr>
+            <w:r>
+              <w:t>Stability: a library update must not change results silently</w:t>
+            </w:r>
+          </w:p>
+        </w:tc>
+        <w:tc>
+          <w:tcPr>
+            <w:tcW w:w="3454" w:type="dxa"/>
+          </w:tcPr>
+          <w:p>
+            <w:pPr>
+              <w:keepNext/>
+              <w:spacing w:before="40" w:after="40" w:line="240" w:lineRule="auto"/>
+              <w:ind w:firstLine="0"/>
+              <w:jc w:val="left"/>
+            </w:pPr>
+            <w:r>
+              <w:t>FutureWarning treated as error</w:t>
+            </w:r>
+          </w:p>
+        </w:tc>
+      </w:tr>
+      <w:tr>
+        <w:trPr>
+          <w:cantSplit/>
+          <w:jc w:val="center"/>
+        </w:trPr>
+        <w:tc>
+          <w:tcPr>
+            <w:tcW w:w="700" w:type="dxa"/>
+          </w:tcPr>
+          <w:p>
+            <w:pPr>
+              <w:keepNext/>
+              <w:spacing w:before="40" w:after="40" w:line="240" w:lineRule="auto"/>
+              <w:ind w:firstLine="0"/>
+              <w:jc w:val="left"/>
+            </w:pPr>
+            <w:r>
+              <w:t>N4</w:t>
+            </w:r>
+          </w:p>
+        </w:tc>
+        <w:tc>
+          <w:tcPr>
+            <w:tcW w:w="5200" w:type="dxa"/>
+          </w:tcPr>
+          <w:p>
+            <w:pPr>
+              <w:keepNext/>
+              <w:spacing w:before="40" w:after="40" w:line="240" w:lineRule="auto"/>
+              <w:ind w:firstLine="0"/>
+              <w:jc w:val="left"/>
+            </w:pPr>
+            <w:r>
+              <w:t>Honesty: uncertainty is always reported, claims not stronger than evidence</w:t>
+            </w:r>
+          </w:p>
+        </w:tc>
+        <w:tc>
+          <w:tcPr>
+            <w:tcW w:w="3454" w:type="dxa"/>
+          </w:tcPr>
+          <w:p>
+            <w:pPr>
+              <w:keepNext/>
+              <w:spacing w:before="40" w:after="40" w:line="240" w:lineRule="auto"/>
+              <w:ind w:firstLine="0"/>
+              <w:jc w:val="left"/>
+            </w:pPr>
+            <w:r>
+              <w:t>Two trend tests, intervals, backtest</w:t>
+            </w:r>
+          </w:p>
+        </w:tc>
+      </w:tr>
+      <w:tr>
+        <w:trPr>
+          <w:cantSplit/>
+          <w:jc w:val="center"/>
+        </w:trPr>
+        <w:tc>
+          <w:tcPr>
+            <w:tcW w:w="700" w:type="dxa"/>
+          </w:tcPr>
+          <w:p>
+            <w:pPr>
+              <w:keepNext/>
+              <w:spacing w:before="40" w:after="40" w:line="240" w:lineRule="auto"/>
+              <w:ind w:firstLine="0"/>
+              <w:jc w:val="left"/>
+            </w:pPr>
+            <w:r>
+              <w:t>N5</w:t>
+            </w:r>
+          </w:p>
+        </w:tc>
+        <w:tc>
+          <w:tcPr>
+            <w:tcW w:w="5200" w:type="dxa"/>
+          </w:tcPr>
+          <w:p>
+            <w:pPr>
+              <w:keepNext/>
+              <w:spacing w:before="40" w:after="40" w:line="240" w:lineRule="auto"/>
+              <w:ind w:firstLine="0"/>
+              <w:jc w:val="left"/>
+            </w:pPr>
+            <w:r>
+              <w:t>Portability: Linux, Windows, macOS; Python 3.10–3.13</w:t>
+            </w:r>
+          </w:p>
+        </w:tc>
+        <w:tc>
+          <w:tcPr>
+            <w:tcW w:w="3454" w:type="dxa"/>
+          </w:tcPr>
+          <w:p>
+            <w:pPr>
+              <w:keepNext/>
+              <w:spacing w:before="40" w:after="40" w:line="240" w:lineRule="auto"/>
+              <w:ind w:firstLine="0"/>
+              <w:jc w:val="left"/>
+            </w:pPr>
+            <w:r>
+              <w:t>CI build matrix</w:t>
+            </w:r>
+          </w:p>
+        </w:tc>
+      </w:tr>
+      <w:tr>
+        <w:trPr>
+          <w:cantSplit/>
+          <w:jc w:val="center"/>
+        </w:trPr>
+        <w:tc>
+          <w:tcPr>
+            <w:tcW w:w="700" w:type="dxa"/>
+          </w:tcPr>
+          <w:p>
+            <w:pPr>
+              <w:keepNext/>
+              <w:spacing w:before="40" w:after="40" w:line="240" w:lineRule="auto"/>
+              <w:ind w:firstLine="0"/>
+              <w:jc w:val="left"/>
+            </w:pPr>
+            <w:r>
+              <w:t>N6</w:t>
+            </w:r>
+          </w:p>
+        </w:tc>
+        <w:tc>
+          <w:tcPr>
+            <w:tcW w:w="5200" w:type="dxa"/>
+          </w:tcPr>
+          <w:p>
+            <w:pPr>
+              <w:keepNext/>
+              <w:spacing w:before="40" w:after="40" w:line="240" w:lineRule="auto"/>
+              <w:ind w:firstLine="0"/>
+              <w:jc w:val="left"/>
+            </w:pPr>
+            <w:r>
+              <w:t>Installability: one command, pip install -e ".[ui]"</w:t>
+            </w:r>
+          </w:p>
+        </w:tc>
+        <w:tc>
+          <w:tcPr>
+            <w:tcW w:w="3454" w:type="dxa"/>
+          </w:tcPr>
+          <w:p>
+            <w:pPr>
+              <w:keepNext/>
+              <w:spacing w:before="40" w:after="40" w:line="240" w:lineRule="auto"/>
+              <w:ind w:firstLine="0"/>
+              <w:jc w:val="left"/>
+            </w:pPr>
+            <w:r>
+              <w:t>pyproject.toml extras</w:t>
+            </w:r>
+          </w:p>
+        </w:tc>
+      </w:tr>
+      <w:tr>
+        <w:trPr>
+          <w:cantSplit/>
+          <w:jc w:val="center"/>
+        </w:trPr>
+        <w:tc>
+          <w:tcPr>
+            <w:tcW w:w="700" w:type="dxa"/>
+          </w:tcPr>
+          <w:p>
+            <w:pPr>
+              <w:keepNext/>
+              <w:spacing w:before="40" w:after="40" w:line="240" w:lineRule="auto"/>
+              <w:ind w:firstLine="0"/>
+              <w:jc w:val="left"/>
+            </w:pPr>
+            <w:r>
+              <w:t>N7</w:t>
+            </w:r>
+          </w:p>
+        </w:tc>
+        <w:tc>
+          <w:tcPr>
+            <w:tcW w:w="5200" w:type="dxa"/>
+          </w:tcPr>
+          <w:p>
+            <w:pPr>
+              <w:keepNext/>
+              <w:spacing w:before="40" w:after="40" w:line="240" w:lineRule="auto"/>
+              <w:ind w:firstLine="0"/>
+              <w:jc w:val="left"/>
+            </w:pPr>
+            <w:r>
+              <w:t>Offline use: analysis and tests need no internet</w:t>
+            </w:r>
+          </w:p>
+        </w:tc>
+        <w:tc>
+          <w:tcPr>
+            <w:tcW w:w="3454" w:type="dxa"/>
+          </w:tcPr>
+          <w:p>
+            <w:pPr>
+              <w:keepNext/>
+              <w:spacing w:before="40" w:after="40" w:line="240" w:lineRule="auto"/>
+              <w:ind w:firstLine="0"/>
+              <w:jc w:val="left"/>
+            </w:pPr>
+            <w:r>
+              <w:t>Bundled sample, injectable network layer</w:t>
+            </w:r>
+          </w:p>
+        </w:tc>
+      </w:tr>
+      <w:tr>
+        <w:trPr>
+          <w:cantSplit/>
+          <w:jc w:val="center"/>
+        </w:trPr>
+        <w:tc>
+          <w:tcPr>
+            <w:tcW w:w="700" w:type="dxa"/>
+          </w:tcPr>
+          <w:p>
+            <w:pPr>
+              <w:keepNext/>
+              <w:spacing w:before="40" w:after="40" w:line="240" w:lineRule="auto"/>
+              <w:ind w:firstLine="0"/>
+              <w:jc w:val="left"/>
+            </w:pPr>
+            <w:r>
+              <w:t>N8</w:t>
+            </w:r>
+          </w:p>
+        </w:tc>
+        <w:tc>
+          <w:tcPr>
+            <w:tcW w:w="5200" w:type="dxa"/>
+          </w:tcPr>
+          <w:p>
+            <w:pPr>
+              <w:keepNext/>
+              <w:spacing w:before="40" w:after="40" w:line="240" w:lineRule="auto"/>
+              <w:ind w:firstLine="0"/>
+              <w:jc w:val="left"/>
+            </w:pPr>
+            <w:r>
+              <w:t>Maintainability: small typed single-purpose modules</w:t>
+            </w:r>
+          </w:p>
+        </w:tc>
+        <w:tc>
+          <w:tcPr>
+            <w:tcW w:w="3454" w:type="dxa"/>
+          </w:tcPr>
+          <w:p>
+            <w:pPr>
+              <w:keepNext/>
+              <w:spacing w:before="40" w:after="40" w:line="240" w:lineRule="auto"/>
+              <w:ind w:firstLine="0"/>
+              <w:jc w:val="left"/>
+            </w:pPr>
+            <w:r>
+              <w:t>src/ layout, mypy, Ruff</w:t>
+            </w:r>
+          </w:p>
+        </w:tc>
+      </w:tr>
+      <w:tr>
+        <w:trPr>
+          <w:cantSplit/>
+          <w:jc w:val="center"/>
+        </w:trPr>
+        <w:tc>
+          <w:tcPr>
+            <w:tcW w:w="700" w:type="dxa"/>
+          </w:tcPr>
+          <w:p>
+            <w:pPr>
+              <w:keepNext/>
+              <w:spacing w:before="40" w:after="40" w:line="240" w:lineRule="auto"/>
+              <w:ind w:firstLine="0"/>
+              <w:jc w:val="left"/>
+            </w:pPr>
+            <w:r>
+              <w:t>N9</w:t>
+            </w:r>
+          </w:p>
+        </w:tc>
+        <w:tc>
+          <w:tcPr>
+            <w:tcW w:w="5200" w:type="dxa"/>
+          </w:tcPr>
+          <w:p>
+            <w:pPr>
+              <w:keepNext/>
+              <w:spacing w:before="40" w:after="40" w:line="240" w:lineRule="auto"/>
+              <w:ind w:firstLine="0"/>
+              <w:jc w:val="left"/>
+            </w:pPr>
+            <w:r>
+              <w:t>Test quality: at least 90 % statement coverage</w:t>
+            </w:r>
+          </w:p>
+        </w:tc>
+        <w:tc>
+          <w:tcPr>
+            <w:tcW w:w="3454" w:type="dxa"/>
+          </w:tcPr>
+          <w:p>
+            <w:pPr>
+              <w:keepNext/>
+              <w:spacing w:before="40" w:after="40" w:line="240" w:lineRule="auto"/>
+              <w:ind w:firstLine="0"/>
+              <w:jc w:val="left"/>
+            </w:pPr>
+            <w:r>
+              <w:t>CI quality gate (actual 99 %)</w:t>
+            </w:r>
+          </w:p>
+        </w:tc>
+      </w:tr>
+      <w:tr>
+        <w:trPr>
+          <w:cantSplit/>
+          <w:jc w:val="center"/>
+        </w:trPr>
+        <w:tc>
+          <w:tcPr>
+            <w:tcW w:w="700" w:type="dxa"/>
+          </w:tcPr>
+          <w:p>
+            <w:pPr>
+              <w:keepNext/>
+              <w:spacing w:before="40" w:after="40" w:line="240" w:lineRule="auto"/>
+              <w:ind w:firstLine="0"/>
+              <w:jc w:val="left"/>
+            </w:pPr>
+            <w:r>
+              <w:t>N10</w:t>
+            </w:r>
+          </w:p>
+        </w:tc>
+        <w:tc>
+          <w:tcPr>
+            <w:tcW w:w="5200" w:type="dxa"/>
+          </w:tcPr>
+          <w:p>
+            <w:pPr>
+              <w:keepNext/>
+              <w:spacing w:before="40" w:after="40" w:line="240" w:lineRule="auto"/>
+              <w:ind w:firstLine="0"/>
+              <w:jc w:val="left"/>
+            </w:pPr>
+            <w:r>
+              <w:t>Performance: a 32-year daily series analysed in seconds on a laptop</w:t>
+            </w:r>
+          </w:p>
+        </w:tc>
+        <w:tc>
+          <w:tcPr>
+            <w:tcW w:w="3454" w:type="dxa"/>
+          </w:tcPr>
+          <w:p>
+            <w:pPr>
+              <w:keepNext/>
+              <w:spacing w:before="40" w:after="40" w:line="240" w:lineRule="auto"/>
+              <w:ind w:firstLine="0"/>
+              <w:jc w:val="left"/>
+            </w:pPr>
+            <w:r>
+              <w:t>Vectorised pandas/NumPy</w:t>
+            </w:r>
+          </w:p>
+        </w:tc>
+      </w:tr>
+      <w:tr>
+        <w:trPr>
+          <w:cantSplit/>
+          <w:jc w:val="center"/>
+        </w:trPr>
+        <w:tc>
+          <w:tcPr>
+            <w:tcW w:w="700" w:type="dxa"/>
+          </w:tcPr>
+          <w:p>
+            <w:pPr>
+              <w:keepNext/>
+              <w:spacing w:before="40" w:after="40" w:line="240" w:lineRule="auto"/>
+              <w:ind w:firstLine="0"/>
+              <w:jc w:val="left"/>
+            </w:pPr>
+            <w:r>
+              <w:t>N11</w:t>
+            </w:r>
+          </w:p>
+        </w:tc>
+        <w:tc>
+          <w:tcPr>
+            <w:tcW w:w="5200" w:type="dxa"/>
+          </w:tcPr>
+          <w:p>
+            <w:pPr>
+              <w:keepNext/>
+              <w:spacing w:before="40" w:after="40" w:line="240" w:lineRule="auto"/>
+              <w:ind w:firstLine="0"/>
+              <w:jc w:val="left"/>
+            </w:pPr>
+            <w:r>
+              <w:t>Security: TLS verification never disabled; read-only CI token</w:t>
+            </w:r>
+          </w:p>
+        </w:tc>
+        <w:tc>
+          <w:tcPr>
+            <w:tcW w:w="3454" w:type="dxa"/>
+          </w:tcPr>
+          <w:p>
+            <w:pPr>
+              <w:keepNext/>
+              <w:spacing w:before="40" w:after="40" w:line="240" w:lineRule="auto"/>
+              <w:ind w:firstLine="0"/>
+              <w:jc w:val="left"/>
+            </w:pPr>
+            <w:r>
+              <w:t>truststore, least-privilege permissions</w:t>
+            </w:r>
+          </w:p>
+        </w:tc>
+      </w:tr>
+      <w:tr>
+        <w:trPr>
+          <w:cantSplit/>
+          <w:jc w:val="center"/>
+        </w:trPr>
+        <w:tc>
+          <w:tcPr>
+            <w:tcW w:w="700" w:type="dxa"/>
+          </w:tcPr>
+          <w:p>
+            <w:pPr>
+              <w:keepNext/>
+              <w:spacing w:before="40" w:after="40" w:line="240" w:lineRule="auto"/>
+              <w:ind w:firstLine="0"/>
+              <w:jc w:val="left"/>
+            </w:pPr>
+            <w:r>
+              <w:t>N12</w:t>
+            </w:r>
+          </w:p>
+        </w:tc>
+        <w:tc>
+          <w:tcPr>
+            <w:tcW w:w="5200" w:type="dxa"/>
+          </w:tcPr>
+          <w:p>
+            <w:pPr>
+              <w:keepNext/>
+              <w:spacing w:before="40" w:after="40" w:line="240" w:lineRule="auto"/>
+              <w:ind w:firstLine="0"/>
+              <w:jc w:val="left"/>
+            </w:pPr>
+            <w:r>
+              <w:t>Licensing: free and open source</w:t>
+            </w:r>
+          </w:p>
+        </w:tc>
+        <w:tc>
+          <w:tcPr>
+            <w:tcW w:w="3454" w:type="dxa"/>
+          </w:tcPr>
+          <w:p>
+            <w:pPr>
+              <w:keepNext/>
+              <w:spacing w:before="40" w:after="40" w:line="240" w:lineRule="auto"/>
+              <w:ind w:firstLine="0"/>
+              <w:jc w:val="left"/>
+            </w:pPr>
+            <w:r>
+              <w:t>MIT licence, CITATION.cff</w:t>
+            </w:r>
+          </w:p>
+        </w:tc>
+      </w:tr>
+    </w:tbl>
+    <w:p>
+      <w:pPr>
+        <w:spacing w:line="240" w:lineRule="auto"/>
+        <w:ind w:firstLine="0"/>
+      </w:pPr>
+    </w:p>
+    <w:p>
+      <w:r>
+        <w:rPr>
+          <w:b/>
+        </w:rPr>
         <w:t>Design and implementation.</w:t>
       </w:r>
       <w:r>
         <w:t xml:space="preserve"> The package consists of small modules with one responsibility each — io, sources, cleaning, analysis, forecast, plotting — joined by a pipeline module. The command line and web interfaces are thin layers over that pipeline, so both always give identical numbers. Network access is isolated in one function that receives its opener as a parameter and can therefore be tested offline. The code is typed Python in the standard src/ layout; Ruff enforces style and mypy checks types.</w:t>
+      </w:r>
+    </w:p>
+    <w:p>
+      <w:r>
+        <w:rPr>
+          <w:b/>
+        </w:rPr>
+        <w:t>Web interface.</w:t>
+      </w:r>
+      <w:r>
+        <w:t xml:space="preserve"> The Streamlit interface (requirement F15) is built for a reader who is not a programmer. The sidebar has three steps: choose the data (offline example, real Open-Meteo data or an uploaded CSV), set the comparison period and the forecast length. The main page opens with a one-sentence verdict and five key figures, and every analysis has its own tab with an interactive chart and a plain-language explanation (Figures 1 and 2).</w:t>
+      </w:r>
+    </w:p>
+    <w:p>
+      <w:pPr>
+        <w:keepNext/>
+        <w:spacing w:before="120" w:line="240" w:lineRule="auto"/>
+        <w:ind w:firstLine="0"/>
+        <w:jc w:val="center"/>
+      </w:pPr>
+      <w:r>
+        <w:drawing>
+          <wp:inline xmlns:a="http://schemas.openxmlformats.org/drawingml/2006/main" xmlns:pic="http://schemas.openxmlformats.org/drawingml/2006/picture">
+            <wp:extent cx="5220000" cy="4660714"/>
+            <wp:docPr id="4" name="Picture 4"/>
+            <wp:cNvGraphicFramePr>
+              <a:graphicFrameLocks noChangeAspect="1"/>
+            </wp:cNvGraphicFramePr>
+            <a:graphic>
+              <a:graphicData uri="http://schemas.openxmlformats.org/drawingml/2006/picture">
+                <pic:pic>
+                  <pic:nvPicPr>
+                    <pic:cNvPr id="0" name="webui_overview.png"/>
+                    <pic:cNvPicPr/>
+                  </pic:nvPicPr>
+                  <pic:blipFill>
+                    <a:blip r:embed="rId30"/>
+                    <a:stretch>
+                      <a:fillRect/>
+                    </a:stretch>
+                  </pic:blipFill>
+                  <pic:spPr>
+                    <a:xfrm>
+                      <a:off x="0" y="0"/>
+                      <a:ext cx="5220000" cy="4660714"/>
+                    </a:xfrm>
+                    <a:prstGeom prst="rect"/>
+                  </pic:spPr>
+                </pic:pic>
+              </a:graphicData>
+            </a:graphic>
+          </wp:inline>
+        </w:drawing>
+      </w:r>
+    </w:p>
+    <w:p>
+      <w:pPr>
+        <w:spacing w:after="120"/>
+        <w:ind w:firstLine="0"/>
+        <w:jc w:val="center"/>
+      </w:pPr>
+      <w:r>
+        <w:t>Figure 1 – Web interface: choice of data, key figures and the long-term trend (example data)</w:t>
+      </w:r>
+    </w:p>
+    <w:p>
+      <w:pPr>
+        <w:keepNext/>
+        <w:spacing w:before="120" w:line="240" w:lineRule="auto"/>
+        <w:ind w:firstLine="0"/>
+        <w:jc w:val="center"/>
+      </w:pPr>
+      <w:r>
+        <w:drawing>
+          <wp:inline xmlns:a="http://schemas.openxmlformats.org/drawingml/2006/main" xmlns:pic="http://schemas.openxmlformats.org/drawingml/2006/picture">
+            <wp:extent cx="5220000" cy="4660714"/>
+            <wp:docPr id="4" name="Picture 4"/>
+            <wp:cNvGraphicFramePr>
+              <a:graphicFrameLocks noChangeAspect="1"/>
+            </wp:cNvGraphicFramePr>
+            <a:graphic>
+              <a:graphicData uri="http://schemas.openxmlformats.org/drawingml/2006/picture">
+                <pic:pic>
+                  <pic:nvPicPr>
+                    <pic:cNvPr id="0" name="webui_forecast.png"/>
+                    <pic:cNvPicPr/>
+                  </pic:nvPicPr>
+                  <pic:blipFill>
+                    <a:blip r:embed="rId31"/>
+                    <a:stretch>
+                      <a:fillRect/>
+                    </a:stretch>
+                  </pic:blipFill>
+                  <pic:spPr>
+                    <a:xfrm>
+                      <a:off x="0" y="0"/>
+                      <a:ext cx="5220000" cy="4660714"/>
+                    </a:xfrm>
+                    <a:prstGeom prst="rect"/>
+                  </pic:spPr>
+                </pic:pic>
+              </a:graphicData>
+            </a:graphic>
+          </wp:inline>
+        </w:drawing>
+      </w:r>
+    </w:p>
+    <w:p>
+      <w:pPr>
+        <w:spacing w:after="120"/>
+        <w:ind w:firstLine="0"/>
+        <w:jc w:val="center"/>
+      </w:pPr>
+      <w:r>
+        <w:t>Figure 2 – Web interface: forecast tab with the 95 % range and the test forecast (example data)</w:t>
       </w:r>
     </w:p>
     <w:p>
@@ -948,7 +2776,7 @@
         <w:t>Deployment and maintenance.</w:t>
       </w:r>
       <w:r>
-        <w:t xml:space="preserve"> A version tag starts a workflow that tests the code, builds the package and publishes a GitHub Release. Maintenance relies on the issue tracker, the changelog, semantic versioning and Dependabot. Table 1 maps each stage to the repository.</w:t>
+        <w:t xml:space="preserve"> A version tag starts a workflow that tests the code, builds the package and publishes a GitHub Release. Maintenance relies on the issue tracker, the changelog, semantic versioning and Dependabot. Table 3 maps each stage to the repository.</w:t>
       </w:r>
     </w:p>
     <w:p>
@@ -959,7 +2787,7 @@
         <w:jc w:val="left"/>
       </w:pPr>
       <w:r>
-        <w:t>Table 1 – Stages of the development process and their artefacts in the project</w:t>
+        <w:t>Table 3 – Stages of the development process and their artefacts in the project</w:t>
       </w:r>
     </w:p>
     <w:tbl>
@@ -1088,7 +2916,7 @@
               <w:jc w:val="left"/>
             </w:pPr>
             <w:r>
-              <w:t>README.md, issue templates</w:t>
+              <w:t>docs/REQUIREMENTS.md, README.md, issue templates</w:t>
             </w:r>
           </w:p>
         </w:tc>
@@ -1463,7 +3291,7 @@
         <w:t>Python</w:t>
       </w:r>
       <w:r>
-        <w:t xml:space="preserve"> meets all five. R is equally strong in statistics but weaker as a general-purpose language for command line tools, packaging and web interfaces; MATLAB needs a commercial licence; Julia is fast but its ecosystem and CI tooling are less mature. Table 2 lists the main components and the reason for each choice.</w:t>
+        <w:t xml:space="preserve"> meets all five. R is equally strong in statistics but weaker as a general-purpose language for command line tools, packaging and web interfaces; MATLAB needs a commercial licence; Julia is fast but its ecosystem and CI tooling are less mature. Table 4 lists the main components and the reason for each choice.</w:t>
       </w:r>
     </w:p>
     <w:p>
@@ -1474,7 +3302,7 @@
         <w:jc w:val="left"/>
       </w:pPr>
       <w:r>
-        <w:t>Table 2 – Selected technologies and the reasons for choosing them</w:t>
+        <w:t>Table 4 – Selected technologies and the reasons for choosing them</w:t>
       </w:r>
     </w:p>
     <w:tbl>
@@ -1965,6 +3793,1673 @@
         <w:spacing w:line="240" w:lineRule="auto"/>
         <w:ind w:firstLine="0"/>
       </w:pPr>
+    </w:p>
+    <w:p>
+      <w:r>
+        <w:t xml:space="preserve">Comparison with alternatives. Table 5 compares the four candidate languages against the criteria above, and Table 6 does the same for the other components. Python is the only option rated high on every criterion: R matches it in statistics but not in packaging and web interfaces, MATLAB needs a commercial licence, and Julia's tooling is still maturing. For the other components the deciding factor was the amount of code and infrastructure the project would have to maintain itself. The assessments are qualitative judgements based on the documentation of each tool and on this project's needs, not measurements.</w:t>
+      </w:r>
+    </w:p>
+    <w:p>
+      <w:pPr>
+        <w:keepNext/>
+        <w:spacing w:before="120"/>
+        <w:ind w:firstLine="0"/>
+        <w:jc w:val="left"/>
+      </w:pPr>
+      <w:r>
+        <w:t>Table 5 – Comparison of programming languages against the selection criteria</w:t>
+      </w:r>
+    </w:p>
+    <w:tbl>
+      <w:tblPr>
+        <w:tblStyle w:val="TableGrid"/>
+        <w:tblW w:w="0" w:type="auto"/>
+        <w:jc w:val="center"/>
+        <w:tblLayout w:type="fixed"/>
+        <w:tblLook w:val="04A0" w:firstRow="1" w:lastRow="0" w:firstColumn="1" w:lastColumn="0" w:noHBand="0" w:noVBand="1"/>
+      </w:tblPr>
+      <w:tblGrid>
+        <w:gridCol w:w="2200"/>
+        <w:gridCol w:w="1800"/>
+        <w:gridCol w:w="1800"/>
+        <w:gridCol w:w="1777"/>
+        <w:gridCol w:w="1777"/>
+      </w:tblGrid>
+      <w:tr>
+        <w:trPr>
+          <w:cantSplit/>
+          <w:tblHeader/>
+          <w:jc w:val="center"/>
+        </w:trPr>
+        <w:tc>
+          <w:tcPr>
+            <w:tcW w:w="2200" w:type="dxa"/>
+          </w:tcPr>
+          <w:p>
+            <w:pPr>
+              <w:keepNext/>
+              <w:spacing w:before="40" w:after="40" w:line="240" w:lineRule="auto"/>
+              <w:ind w:firstLine="0"/>
+              <w:jc w:val="left"/>
+            </w:pPr>
+            <w:r>
+              <w:rPr>
+                <w:b/>
+              </w:rPr>
+              <w:t>Criterion</w:t>
+            </w:r>
+          </w:p>
+        </w:tc>
+        <w:tc>
+          <w:tcPr>
+            <w:tcW w:w="1800" w:type="dxa"/>
+          </w:tcPr>
+          <w:p>
+            <w:pPr>
+              <w:keepNext/>
+              <w:spacing w:before="40" w:after="40" w:line="240" w:lineRule="auto"/>
+              <w:ind w:firstLine="0"/>
+              <w:jc w:val="left"/>
+            </w:pPr>
+            <w:r>
+              <w:rPr>
+                <w:b/>
+              </w:rPr>
+              <w:t>Python</w:t>
+            </w:r>
+          </w:p>
+        </w:tc>
+        <w:tc>
+          <w:tcPr>
+            <w:tcW w:w="1800" w:type="dxa"/>
+          </w:tcPr>
+          <w:p>
+            <w:pPr>
+              <w:keepNext/>
+              <w:spacing w:before="40" w:after="40" w:line="240" w:lineRule="auto"/>
+              <w:ind w:firstLine="0"/>
+              <w:jc w:val="left"/>
+            </w:pPr>
+            <w:r>
+              <w:rPr>
+                <w:b/>
+              </w:rPr>
+              <w:t>R</w:t>
+            </w:r>
+          </w:p>
+        </w:tc>
+        <w:tc>
+          <w:tcPr>
+            <w:tcW w:w="1777" w:type="dxa"/>
+          </w:tcPr>
+          <w:p>
+            <w:pPr>
+              <w:keepNext/>
+              <w:spacing w:before="40" w:after="40" w:line="240" w:lineRule="auto"/>
+              <w:ind w:firstLine="0"/>
+              <w:jc w:val="left"/>
+            </w:pPr>
+            <w:r>
+              <w:rPr>
+                <w:b/>
+              </w:rPr>
+              <w:t>MATLAB</w:t>
+            </w:r>
+          </w:p>
+        </w:tc>
+        <w:tc>
+          <w:tcPr>
+            <w:tcW w:w="1777" w:type="dxa"/>
+          </w:tcPr>
+          <w:p>
+            <w:pPr>
+              <w:keepNext/>
+              <w:spacing w:before="40" w:after="40" w:line="240" w:lineRule="auto"/>
+              <w:ind w:firstLine="0"/>
+              <w:jc w:val="left"/>
+            </w:pPr>
+            <w:r>
+              <w:rPr>
+                <w:b/>
+              </w:rPr>
+              <w:t>Julia</w:t>
+            </w:r>
+          </w:p>
+        </w:tc>
+      </w:tr>
+      <w:tr>
+        <w:trPr>
+          <w:cantSplit/>
+          <w:jc w:val="center"/>
+        </w:trPr>
+        <w:tc>
+          <w:tcPr>
+            <w:tcW w:w="2200" w:type="dxa"/>
+          </w:tcPr>
+          <w:p>
+            <w:pPr>
+              <w:keepNext/>
+              <w:spacing w:before="40" w:after="40" w:line="240" w:lineRule="auto"/>
+              <w:ind w:firstLine="0"/>
+              <w:jc w:val="left"/>
+            </w:pPr>
+            <w:r>
+              <w:t>Scientific libraries</w:t>
+            </w:r>
+          </w:p>
+        </w:tc>
+        <w:tc>
+          <w:tcPr>
+            <w:tcW w:w="1800" w:type="dxa"/>
+          </w:tcPr>
+          <w:p>
+            <w:pPr>
+              <w:keepNext/>
+              <w:spacing w:before="40" w:after="40" w:line="240" w:lineRule="auto"/>
+              <w:ind w:firstLine="0"/>
+              <w:jc w:val="left"/>
+            </w:pPr>
+            <w:r>
+              <w:t>Excellent (NumPy, SciPy, pandas)</w:t>
+            </w:r>
+          </w:p>
+        </w:tc>
+        <w:tc>
+          <w:tcPr>
+            <w:tcW w:w="1800" w:type="dxa"/>
+          </w:tcPr>
+          <w:p>
+            <w:pPr>
+              <w:keepNext/>
+              <w:spacing w:before="40" w:after="40" w:line="240" w:lineRule="auto"/>
+              <w:ind w:firstLine="0"/>
+              <w:jc w:val="left"/>
+            </w:pPr>
+            <w:r>
+              <w:t>Excellent (statistics)</w:t>
+            </w:r>
+          </w:p>
+        </w:tc>
+        <w:tc>
+          <w:tcPr>
+            <w:tcW w:w="1777" w:type="dxa"/>
+          </w:tcPr>
+          <w:p>
+            <w:pPr>
+              <w:keepNext/>
+              <w:spacing w:before="40" w:after="40" w:line="240" w:lineRule="auto"/>
+              <w:ind w:firstLine="0"/>
+              <w:jc w:val="left"/>
+            </w:pPr>
+            <w:r>
+              <w:t>Good</w:t>
+            </w:r>
+          </w:p>
+        </w:tc>
+        <w:tc>
+          <w:tcPr>
+            <w:tcW w:w="1777" w:type="dxa"/>
+          </w:tcPr>
+          <w:p>
+            <w:pPr>
+              <w:keepNext/>
+              <w:spacing w:before="40" w:after="40" w:line="240" w:lineRule="auto"/>
+              <w:ind w:firstLine="0"/>
+              <w:jc w:val="left"/>
+            </w:pPr>
+            <w:r>
+              <w:t>Growing</w:t>
+            </w:r>
+          </w:p>
+        </w:tc>
+      </w:tr>
+      <w:tr>
+        <w:trPr>
+          <w:cantSplit/>
+          <w:jc w:val="center"/>
+        </w:trPr>
+        <w:tc>
+          <w:tcPr>
+            <w:tcW w:w="2200" w:type="dxa"/>
+          </w:tcPr>
+          <w:p>
+            <w:pPr>
+              <w:keepNext/>
+              <w:spacing w:before="40" w:after="40" w:line="240" w:lineRule="auto"/>
+              <w:ind w:firstLine="0"/>
+              <w:jc w:val="left"/>
+            </w:pPr>
+            <w:r>
+              <w:t>General-purpose use (CLI, web UI, packaging)</w:t>
+            </w:r>
+          </w:p>
+        </w:tc>
+        <w:tc>
+          <w:tcPr>
+            <w:tcW w:w="1800" w:type="dxa"/>
+          </w:tcPr>
+          <w:p>
+            <w:pPr>
+              <w:keepNext/>
+              <w:spacing w:before="40" w:after="40" w:line="240" w:lineRule="auto"/>
+              <w:ind w:firstLine="0"/>
+              <w:jc w:val="left"/>
+            </w:pPr>
+            <w:r>
+              <w:t>Excellent</w:t>
+            </w:r>
+          </w:p>
+        </w:tc>
+        <w:tc>
+          <w:tcPr>
+            <w:tcW w:w="1800" w:type="dxa"/>
+          </w:tcPr>
+          <w:p>
+            <w:pPr>
+              <w:keepNext/>
+              <w:spacing w:before="40" w:after="40" w:line="240" w:lineRule="auto"/>
+              <w:ind w:firstLine="0"/>
+              <w:jc w:val="left"/>
+            </w:pPr>
+            <w:r>
+              <w:t>Limited</w:t>
+            </w:r>
+          </w:p>
+        </w:tc>
+        <w:tc>
+          <w:tcPr>
+            <w:tcW w:w="1777" w:type="dxa"/>
+          </w:tcPr>
+          <w:p>
+            <w:pPr>
+              <w:keepNext/>
+              <w:spacing w:before="40" w:after="40" w:line="240" w:lineRule="auto"/>
+              <w:ind w:firstLine="0"/>
+              <w:jc w:val="left"/>
+            </w:pPr>
+            <w:r>
+              <w:t>Limited</w:t>
+            </w:r>
+          </w:p>
+        </w:tc>
+        <w:tc>
+          <w:tcPr>
+            <w:tcW w:w="1777" w:type="dxa"/>
+          </w:tcPr>
+          <w:p>
+            <w:pPr>
+              <w:keepNext/>
+              <w:spacing w:before="40" w:after="40" w:line="240" w:lineRule="auto"/>
+              <w:ind w:firstLine="0"/>
+              <w:jc w:val="left"/>
+            </w:pPr>
+            <w:r>
+              <w:t>Moderate</w:t>
+            </w:r>
+          </w:p>
+        </w:tc>
+      </w:tr>
+      <w:tr>
+        <w:trPr>
+          <w:cantSplit/>
+          <w:jc w:val="center"/>
+        </w:trPr>
+        <w:tc>
+          <w:tcPr>
+            <w:tcW w:w="2200" w:type="dxa"/>
+          </w:tcPr>
+          <w:p>
+            <w:pPr>
+              <w:keepNext/>
+              <w:spacing w:before="40" w:after="40" w:line="240" w:lineRule="auto"/>
+              <w:ind w:firstLine="0"/>
+              <w:jc w:val="left"/>
+            </w:pPr>
+            <w:r>
+              <w:t>Licence cost</w:t>
+            </w:r>
+          </w:p>
+        </w:tc>
+        <w:tc>
+          <w:tcPr>
+            <w:tcW w:w="1800" w:type="dxa"/>
+          </w:tcPr>
+          <w:p>
+            <w:pPr>
+              <w:keepNext/>
+              <w:spacing w:before="40" w:after="40" w:line="240" w:lineRule="auto"/>
+              <w:ind w:firstLine="0"/>
+              <w:jc w:val="left"/>
+            </w:pPr>
+            <w:r>
+              <w:t>Free</w:t>
+            </w:r>
+          </w:p>
+        </w:tc>
+        <w:tc>
+          <w:tcPr>
+            <w:tcW w:w="1800" w:type="dxa"/>
+          </w:tcPr>
+          <w:p>
+            <w:pPr>
+              <w:keepNext/>
+              <w:spacing w:before="40" w:after="40" w:line="240" w:lineRule="auto"/>
+              <w:ind w:firstLine="0"/>
+              <w:jc w:val="left"/>
+            </w:pPr>
+            <w:r>
+              <w:t>Free</w:t>
+            </w:r>
+          </w:p>
+        </w:tc>
+        <w:tc>
+          <w:tcPr>
+            <w:tcW w:w="1777" w:type="dxa"/>
+          </w:tcPr>
+          <w:p>
+            <w:pPr>
+              <w:keepNext/>
+              <w:spacing w:before="40" w:after="40" w:line="240" w:lineRule="auto"/>
+              <w:ind w:firstLine="0"/>
+              <w:jc w:val="left"/>
+            </w:pPr>
+            <w:r>
+              <w:t>Commercial</w:t>
+            </w:r>
+          </w:p>
+        </w:tc>
+        <w:tc>
+          <w:tcPr>
+            <w:tcW w:w="1777" w:type="dxa"/>
+          </w:tcPr>
+          <w:p>
+            <w:pPr>
+              <w:keepNext/>
+              <w:spacing w:before="40" w:after="40" w:line="240" w:lineRule="auto"/>
+              <w:ind w:firstLine="0"/>
+              <w:jc w:val="left"/>
+            </w:pPr>
+            <w:r>
+              <w:t>Free</w:t>
+            </w:r>
+          </w:p>
+        </w:tc>
+      </w:tr>
+      <w:tr>
+        <w:trPr>
+          <w:cantSplit/>
+          <w:jc w:val="center"/>
+        </w:trPr>
+        <w:tc>
+          <w:tcPr>
+            <w:tcW w:w="2200" w:type="dxa"/>
+          </w:tcPr>
+          <w:p>
+            <w:pPr>
+              <w:keepNext/>
+              <w:spacing w:before="40" w:after="40" w:line="240" w:lineRule="auto"/>
+              <w:ind w:firstLine="0"/>
+              <w:jc w:val="left"/>
+            </w:pPr>
+            <w:r>
+              <w:t>CI and tooling maturity</w:t>
+            </w:r>
+          </w:p>
+        </w:tc>
+        <w:tc>
+          <w:tcPr>
+            <w:tcW w:w="1800" w:type="dxa"/>
+          </w:tcPr>
+          <w:p>
+            <w:pPr>
+              <w:keepNext/>
+              <w:spacing w:before="40" w:after="40" w:line="240" w:lineRule="auto"/>
+              <w:ind w:firstLine="0"/>
+              <w:jc w:val="left"/>
+            </w:pPr>
+            <w:r>
+              <w:t>Excellent</w:t>
+            </w:r>
+          </w:p>
+        </w:tc>
+        <w:tc>
+          <w:tcPr>
+            <w:tcW w:w="1800" w:type="dxa"/>
+          </w:tcPr>
+          <w:p>
+            <w:pPr>
+              <w:keepNext/>
+              <w:spacing w:before="40" w:after="40" w:line="240" w:lineRule="auto"/>
+              <w:ind w:firstLine="0"/>
+              <w:jc w:val="left"/>
+            </w:pPr>
+            <w:r>
+              <w:t>Good</w:t>
+            </w:r>
+          </w:p>
+        </w:tc>
+        <w:tc>
+          <w:tcPr>
+            <w:tcW w:w="1777" w:type="dxa"/>
+          </w:tcPr>
+          <w:p>
+            <w:pPr>
+              <w:keepNext/>
+              <w:spacing w:before="40" w:after="40" w:line="240" w:lineRule="auto"/>
+              <w:ind w:firstLine="0"/>
+              <w:jc w:val="left"/>
+            </w:pPr>
+            <w:r>
+              <w:t>Limited</w:t>
+            </w:r>
+          </w:p>
+        </w:tc>
+        <w:tc>
+          <w:tcPr>
+            <w:tcW w:w="1777" w:type="dxa"/>
+          </w:tcPr>
+          <w:p>
+            <w:pPr>
+              <w:keepNext/>
+              <w:spacing w:before="40" w:after="40" w:line="240" w:lineRule="auto"/>
+              <w:ind w:firstLine="0"/>
+              <w:jc w:val="left"/>
+            </w:pPr>
+            <w:r>
+              <w:t>Moderate</w:t>
+            </w:r>
+          </w:p>
+        </w:tc>
+      </w:tr>
+      <w:tr>
+        <w:trPr>
+          <w:cantSplit/>
+          <w:jc w:val="center"/>
+        </w:trPr>
+        <w:tc>
+          <w:tcPr>
+            <w:tcW w:w="2200" w:type="dxa"/>
+          </w:tcPr>
+          <w:p>
+            <w:pPr>
+              <w:keepNext/>
+              <w:spacing w:before="40" w:after="40" w:line="240" w:lineRule="auto"/>
+              <w:ind w:firstLine="0"/>
+              <w:jc w:val="left"/>
+            </w:pPr>
+            <w:r>
+              <w:t>Use in climate science</w:t>
+            </w:r>
+          </w:p>
+        </w:tc>
+        <w:tc>
+          <w:tcPr>
+            <w:tcW w:w="1800" w:type="dxa"/>
+          </w:tcPr>
+          <w:p>
+            <w:pPr>
+              <w:keepNext/>
+              <w:spacing w:before="40" w:after="40" w:line="240" w:lineRule="auto"/>
+              <w:ind w:firstLine="0"/>
+              <w:jc w:val="left"/>
+            </w:pPr>
+            <w:r>
+              <w:t>Very high (xarray, MetPy)</w:t>
+            </w:r>
+          </w:p>
+        </w:tc>
+        <w:tc>
+          <w:tcPr>
+            <w:tcW w:w="1800" w:type="dxa"/>
+          </w:tcPr>
+          <w:p>
+            <w:pPr>
+              <w:keepNext/>
+              <w:spacing w:before="40" w:after="40" w:line="240" w:lineRule="auto"/>
+              <w:ind w:firstLine="0"/>
+              <w:jc w:val="left"/>
+            </w:pPr>
+            <w:r>
+              <w:t>High</w:t>
+            </w:r>
+          </w:p>
+        </w:tc>
+        <w:tc>
+          <w:tcPr>
+            <w:tcW w:w="1777" w:type="dxa"/>
+          </w:tcPr>
+          <w:p>
+            <w:pPr>
+              <w:keepNext/>
+              <w:spacing w:before="40" w:after="40" w:line="240" w:lineRule="auto"/>
+              <w:ind w:firstLine="0"/>
+              <w:jc w:val="left"/>
+            </w:pPr>
+            <w:r>
+              <w:t>Declining</w:t>
+            </w:r>
+          </w:p>
+        </w:tc>
+        <w:tc>
+          <w:tcPr>
+            <w:tcW w:w="1777" w:type="dxa"/>
+          </w:tcPr>
+          <w:p>
+            <w:pPr>
+              <w:keepNext/>
+              <w:spacing w:before="40" w:after="40" w:line="240" w:lineRule="auto"/>
+              <w:ind w:firstLine="0"/>
+              <w:jc w:val="left"/>
+            </w:pPr>
+            <w:r>
+              <w:t>Niche</w:t>
+            </w:r>
+          </w:p>
+        </w:tc>
+      </w:tr>
+      <w:tr>
+        <w:trPr>
+          <w:cantSplit/>
+          <w:jc w:val="center"/>
+        </w:trPr>
+        <w:tc>
+          <w:tcPr>
+            <w:tcW w:w="2200" w:type="dxa"/>
+          </w:tcPr>
+          <w:p>
+            <w:pPr>
+              <w:keepNext/>
+              <w:spacing w:before="40" w:after="40" w:line="240" w:lineRule="auto"/>
+              <w:ind w:firstLine="0"/>
+              <w:jc w:val="left"/>
+            </w:pPr>
+            <w:r>
+              <w:t>Decision</w:t>
+            </w:r>
+          </w:p>
+        </w:tc>
+        <w:tc>
+          <w:tcPr>
+            <w:tcW w:w="1800" w:type="dxa"/>
+          </w:tcPr>
+          <w:p>
+            <w:pPr>
+              <w:keepNext/>
+              <w:spacing w:before="40" w:after="40" w:line="240" w:lineRule="auto"/>
+              <w:ind w:firstLine="0"/>
+              <w:jc w:val="left"/>
+            </w:pPr>
+            <w:r>
+              <w:t>Chosen</w:t>
+            </w:r>
+          </w:p>
+        </w:tc>
+        <w:tc>
+          <w:tcPr>
+            <w:tcW w:w="1800" w:type="dxa"/>
+          </w:tcPr>
+          <w:p>
+            <w:pPr>
+              <w:keepNext/>
+              <w:spacing w:before="40" w:after="40" w:line="240" w:lineRule="auto"/>
+              <w:ind w:firstLine="0"/>
+              <w:jc w:val="left"/>
+            </w:pPr>
+            <w:r>
+              <w:t>Rejected: weak outside statistics</w:t>
+            </w:r>
+          </w:p>
+        </w:tc>
+        <w:tc>
+          <w:tcPr>
+            <w:tcW w:w="1777" w:type="dxa"/>
+          </w:tcPr>
+          <w:p>
+            <w:pPr>
+              <w:keepNext/>
+              <w:spacing w:before="40" w:after="40" w:line="240" w:lineRule="auto"/>
+              <w:ind w:firstLine="0"/>
+              <w:jc w:val="left"/>
+            </w:pPr>
+            <w:r>
+              <w:t>Rejected: licence, CI cost</w:t>
+            </w:r>
+          </w:p>
+        </w:tc>
+        <w:tc>
+          <w:tcPr>
+            <w:tcW w:w="1777" w:type="dxa"/>
+          </w:tcPr>
+          <w:p>
+            <w:pPr>
+              <w:keepNext/>
+              <w:spacing w:before="40" w:after="40" w:line="240" w:lineRule="auto"/>
+              <w:ind w:firstLine="0"/>
+              <w:jc w:val="left"/>
+            </w:pPr>
+            <w:r>
+              <w:t>Rejected: young ecosystem</w:t>
+            </w:r>
+          </w:p>
+        </w:tc>
+      </w:tr>
+    </w:tbl>
+    <w:p>
+      <w:r>
+        <w:br w:type="page"/>
+      </w:r>
+    </w:p>
+    <w:p>
+      <w:pPr>
+        <w:keepNext/>
+        <w:spacing w:before="120"/>
+        <w:ind w:firstLine="0"/>
+        <w:jc w:val="left"/>
+      </w:pPr>
+      <w:r>
+        <w:t>Table 6 – Alternatives considered for the other components</w:t>
+      </w:r>
+    </w:p>
+    <w:tbl>
+      <w:tblPr>
+        <w:tblStyle w:val="TableGrid"/>
+        <w:tblW w:w="0" w:type="auto"/>
+        <w:jc w:val="center"/>
+        <w:tblLayout w:type="fixed"/>
+        <w:tblLook w:val="04A0" w:firstRow="1" w:lastRow="0" w:firstColumn="1" w:lastColumn="0" w:noHBand="0" w:noVBand="1"/>
+      </w:tblPr>
+      <w:tblGrid>
+        <w:gridCol w:w="1700"/>
+        <w:gridCol w:w="2300"/>
+        <w:gridCol w:w="5354"/>
+      </w:tblGrid>
+      <w:tr>
+        <w:trPr>
+          <w:cantSplit/>
+          <w:tblHeader/>
+          <w:jc w:val="center"/>
+        </w:trPr>
+        <w:tc>
+          <w:tcPr>
+            <w:tcW w:w="1700" w:type="dxa"/>
+          </w:tcPr>
+          <w:p>
+            <w:pPr>
+              <w:keepNext/>
+              <w:spacing w:before="40" w:after="40" w:line="240" w:lineRule="auto"/>
+              <w:ind w:firstLine="0"/>
+              <w:jc w:val="left"/>
+            </w:pPr>
+            <w:r>
+              <w:rPr>
+                <w:b/>
+              </w:rPr>
+              <w:t>Component</w:t>
+            </w:r>
+          </w:p>
+        </w:tc>
+        <w:tc>
+          <w:tcPr>
+            <w:tcW w:w="2300" w:type="dxa"/>
+          </w:tcPr>
+          <w:p>
+            <w:pPr>
+              <w:keepNext/>
+              <w:spacing w:before="40" w:after="40" w:line="240" w:lineRule="auto"/>
+              <w:ind w:firstLine="0"/>
+              <w:jc w:val="left"/>
+            </w:pPr>
+            <w:r>
+              <w:rPr>
+                <w:b/>
+              </w:rPr>
+              <w:t>Option</w:t>
+            </w:r>
+          </w:p>
+        </w:tc>
+        <w:tc>
+          <w:tcPr>
+            <w:tcW w:w="5354" w:type="dxa"/>
+          </w:tcPr>
+          <w:p>
+            <w:pPr>
+              <w:keepNext/>
+              <w:spacing w:before="40" w:after="40" w:line="240" w:lineRule="auto"/>
+              <w:ind w:firstLine="0"/>
+              <w:jc w:val="left"/>
+            </w:pPr>
+            <w:r>
+              <w:rPr>
+                <w:b/>
+              </w:rPr>
+              <w:t>Assessment</w:t>
+            </w:r>
+          </w:p>
+        </w:tc>
+      </w:tr>
+      <w:tr>
+        <w:trPr>
+          <w:cantSplit/>
+          <w:jc w:val="center"/>
+        </w:trPr>
+        <w:tc>
+          <w:tcPr>
+            <w:tcW w:w="1700" w:type="dxa"/>
+          </w:tcPr>
+          <w:p>
+            <w:pPr>
+              <w:keepNext/>
+              <w:spacing w:before="40" w:after="40" w:line="240" w:lineRule="auto"/>
+              <w:ind w:firstLine="0"/>
+              <w:jc w:val="left"/>
+            </w:pPr>
+            <w:r>
+              <w:t>Web UI</w:t>
+            </w:r>
+          </w:p>
+        </w:tc>
+        <w:tc>
+          <w:tcPr>
+            <w:tcW w:w="2300" w:type="dxa"/>
+          </w:tcPr>
+          <w:p>
+            <w:pPr>
+              <w:keepNext/>
+              <w:spacing w:before="40" w:after="40" w:line="240" w:lineRule="auto"/>
+              <w:ind w:firstLine="0"/>
+              <w:jc w:val="left"/>
+            </w:pPr>
+            <w:r>
+              <w:t>Streamlit (chosen)</w:t>
+            </w:r>
+          </w:p>
+        </w:tc>
+        <w:tc>
+          <w:tcPr>
+            <w:tcW w:w="5354" w:type="dxa"/>
+          </w:tcPr>
+          <w:p>
+            <w:pPr>
+              <w:keepNext/>
+              <w:spacing w:before="40" w:after="40" w:line="240" w:lineRule="auto"/>
+              <w:ind w:firstLine="0"/>
+              <w:jc w:val="left"/>
+            </w:pPr>
+            <w:r>
+              <w:t>One Python script, no HTML or JavaScript, AppTest for automated UI tests</w:t>
+            </w:r>
+          </w:p>
+        </w:tc>
+      </w:tr>
+      <w:tr>
+        <w:trPr>
+          <w:cantSplit/>
+          <w:jc w:val="center"/>
+        </w:trPr>
+        <w:tc>
+          <w:tcPr>
+            <w:tcW w:w="1700" w:type="dxa"/>
+          </w:tcPr>
+          <w:p>
+            <w:pPr>
+              <w:keepNext/>
+              <w:spacing w:before="40" w:after="40" w:line="240" w:lineRule="auto"/>
+              <w:ind w:firstLine="0"/>
+              <w:jc w:val="left"/>
+            </w:pPr>
+            <w:r>
+              <w:t/>
+            </w:r>
+          </w:p>
+        </w:tc>
+        <w:tc>
+          <w:tcPr>
+            <w:tcW w:w="2300" w:type="dxa"/>
+          </w:tcPr>
+          <w:p>
+            <w:pPr>
+              <w:keepNext/>
+              <w:spacing w:before="40" w:after="40" w:line="240" w:lineRule="auto"/>
+              <w:ind w:firstLine="0"/>
+              <w:jc w:val="left"/>
+            </w:pPr>
+            <w:r>
+              <w:t>Dash, Panel</w:t>
+            </w:r>
+          </w:p>
+        </w:tc>
+        <w:tc>
+          <w:tcPr>
+            <w:tcW w:w="5354" w:type="dxa"/>
+          </w:tcPr>
+          <w:p>
+            <w:pPr>
+              <w:keepNext/>
+              <w:spacing w:before="40" w:after="40" w:line="240" w:lineRule="auto"/>
+              <w:ind w:firstLine="0"/>
+              <w:jc w:val="left"/>
+            </w:pPr>
+            <w:r>
+              <w:t>More boilerplate for the same result</w:t>
+            </w:r>
+          </w:p>
+        </w:tc>
+      </w:tr>
+      <w:tr>
+        <w:trPr>
+          <w:cantSplit/>
+          <w:jc w:val="center"/>
+        </w:trPr>
+        <w:tc>
+          <w:tcPr>
+            <w:tcW w:w="1700" w:type="dxa"/>
+          </w:tcPr>
+          <w:p>
+            <w:pPr>
+              <w:keepNext/>
+              <w:spacing w:before="40" w:after="40" w:line="240" w:lineRule="auto"/>
+              <w:ind w:firstLine="0"/>
+              <w:jc w:val="left"/>
+            </w:pPr>
+            <w:r>
+              <w:t/>
+            </w:r>
+          </w:p>
+        </w:tc>
+        <w:tc>
+          <w:tcPr>
+            <w:tcW w:w="2300" w:type="dxa"/>
+          </w:tcPr>
+          <w:p>
+            <w:pPr>
+              <w:keepNext/>
+              <w:spacing w:before="40" w:after="40" w:line="240" w:lineRule="auto"/>
+              <w:ind w:firstLine="0"/>
+              <w:jc w:val="left"/>
+            </w:pPr>
+            <w:r>
+              <w:t>Flask + JavaScript</w:t>
+            </w:r>
+          </w:p>
+        </w:tc>
+        <w:tc>
+          <w:tcPr>
+            <w:tcW w:w="5354" w:type="dxa"/>
+          </w:tcPr>
+          <w:p>
+            <w:pPr>
+              <w:keepNext/>
+              <w:spacing w:before="40" w:after="40" w:line="240" w:lineRule="auto"/>
+              <w:ind w:firstLine="0"/>
+              <w:jc w:val="left"/>
+            </w:pPr>
+            <w:r>
+              <w:t>A separate front end and much more code</w:t>
+            </w:r>
+          </w:p>
+        </w:tc>
+      </w:tr>
+      <w:tr>
+        <w:trPr>
+          <w:cantSplit/>
+          <w:jc w:val="center"/>
+        </w:trPr>
+        <w:tc>
+          <w:tcPr>
+            <w:tcW w:w="1700" w:type="dxa"/>
+          </w:tcPr>
+          <w:p>
+            <w:pPr>
+              <w:keepNext/>
+              <w:spacing w:before="40" w:after="40" w:line="240" w:lineRule="auto"/>
+              <w:ind w:firstLine="0"/>
+              <w:jc w:val="left"/>
+            </w:pPr>
+            <w:r>
+              <w:t>Charts in the UI</w:t>
+            </w:r>
+          </w:p>
+        </w:tc>
+        <w:tc>
+          <w:tcPr>
+            <w:tcW w:w="2300" w:type="dxa"/>
+          </w:tcPr>
+          <w:p>
+            <w:pPr>
+              <w:keepNext/>
+              <w:spacing w:before="40" w:after="40" w:line="240" w:lineRule="auto"/>
+              <w:ind w:firstLine="0"/>
+              <w:jc w:val="left"/>
+            </w:pPr>
+            <w:r>
+              <w:t>Plotly (chosen)</w:t>
+            </w:r>
+          </w:p>
+        </w:tc>
+        <w:tc>
+          <w:tcPr>
+            <w:tcW w:w="5354" w:type="dxa"/>
+          </w:tcPr>
+          <w:p>
+            <w:pPr>
+              <w:keepNext/>
+              <w:spacing w:before="40" w:after="40" w:line="240" w:lineRule="auto"/>
+              <w:ind w:firstLine="0"/>
+              <w:jc w:val="left"/>
+            </w:pPr>
+            <w:r>
+              <w:t>Hover, zoom and legend toggling work out of the box; optional extra</w:t>
+            </w:r>
+          </w:p>
+        </w:tc>
+      </w:tr>
+      <w:tr>
+        <w:trPr>
+          <w:cantSplit/>
+          <w:jc w:val="center"/>
+        </w:trPr>
+        <w:tc>
+          <w:tcPr>
+            <w:tcW w:w="1700" w:type="dxa"/>
+          </w:tcPr>
+          <w:p>
+            <w:pPr>
+              <w:keepNext/>
+              <w:spacing w:before="40" w:after="40" w:line="240" w:lineRule="auto"/>
+              <w:ind w:firstLine="0"/>
+              <w:jc w:val="left"/>
+            </w:pPr>
+            <w:r>
+              <w:t/>
+            </w:r>
+          </w:p>
+        </w:tc>
+        <w:tc>
+          <w:tcPr>
+            <w:tcW w:w="2300" w:type="dxa"/>
+          </w:tcPr>
+          <w:p>
+            <w:pPr>
+              <w:keepNext/>
+              <w:spacing w:before="40" w:after="40" w:line="240" w:lineRule="auto"/>
+              <w:ind w:firstLine="0"/>
+              <w:jc w:val="left"/>
+            </w:pPr>
+            <w:r>
+              <w:t>Altair</w:t>
+            </w:r>
+          </w:p>
+        </w:tc>
+        <w:tc>
+          <w:tcPr>
+            <w:tcW w:w="5354" w:type="dxa"/>
+          </w:tcPr>
+          <w:p>
+            <w:pPr>
+              <w:keepNext/>
+              <w:spacing w:before="40" w:after="40" w:line="240" w:lineRule="auto"/>
+              <w:ind w:firstLine="0"/>
+              <w:jc w:val="left"/>
+            </w:pPr>
+            <w:r>
+              <w:t>Hover and shaded intervals need extra selection code for each chart</w:t>
+            </w:r>
+          </w:p>
+        </w:tc>
+      </w:tr>
+      <w:tr>
+        <w:trPr>
+          <w:cantSplit/>
+          <w:jc w:val="center"/>
+        </w:trPr>
+        <w:tc>
+          <w:tcPr>
+            <w:tcW w:w="1700" w:type="dxa"/>
+          </w:tcPr>
+          <w:p>
+            <w:pPr>
+              <w:keepNext/>
+              <w:spacing w:before="40" w:after="40" w:line="240" w:lineRule="auto"/>
+              <w:ind w:firstLine="0"/>
+              <w:jc w:val="left"/>
+            </w:pPr>
+            <w:r>
+              <w:t/>
+            </w:r>
+          </w:p>
+        </w:tc>
+        <w:tc>
+          <w:tcPr>
+            <w:tcW w:w="2300" w:type="dxa"/>
+          </w:tcPr>
+          <w:p>
+            <w:pPr>
+              <w:keepNext/>
+              <w:spacing w:before="40" w:after="40" w:line="240" w:lineRule="auto"/>
+              <w:ind w:firstLine="0"/>
+              <w:jc w:val="left"/>
+            </w:pPr>
+            <w:r>
+              <w:t>Bokeh</w:t>
+            </w:r>
+          </w:p>
+        </w:tc>
+        <w:tc>
+          <w:tcPr>
+            <w:tcW w:w="5354" w:type="dxa"/>
+          </w:tcPr>
+          <w:p>
+            <w:pPr>
+              <w:keepNext/>
+              <w:spacing w:before="40" w:after="40" w:line="240" w:lineRule="auto"/>
+              <w:ind w:firstLine="0"/>
+              <w:jc w:val="left"/>
+            </w:pPr>
+            <w:r>
+              <w:t>Needs its own Streamlit component</w:t>
+            </w:r>
+          </w:p>
+        </w:tc>
+      </w:tr>
+      <w:tr>
+        <w:trPr>
+          <w:cantSplit/>
+          <w:jc w:val="center"/>
+        </w:trPr>
+        <w:tc>
+          <w:tcPr>
+            <w:tcW w:w="1700" w:type="dxa"/>
+          </w:tcPr>
+          <w:p>
+            <w:pPr>
+              <w:keepNext/>
+              <w:spacing w:before="40" w:after="40" w:line="240" w:lineRule="auto"/>
+              <w:ind w:firstLine="0"/>
+              <w:jc w:val="left"/>
+            </w:pPr>
+            <w:r>
+              <w:t/>
+            </w:r>
+          </w:p>
+        </w:tc>
+        <w:tc>
+          <w:tcPr>
+            <w:tcW w:w="2300" w:type="dxa"/>
+          </w:tcPr>
+          <w:p>
+            <w:pPr>
+              <w:keepNext/>
+              <w:spacing w:before="40" w:after="40" w:line="240" w:lineRule="auto"/>
+              <w:ind w:firstLine="0"/>
+              <w:jc w:val="left"/>
+            </w:pPr>
+            <w:r>
+              <w:t>Matplotlib</w:t>
+            </w:r>
+          </w:p>
+        </w:tc>
+        <w:tc>
+          <w:tcPr>
+            <w:tcW w:w="5354" w:type="dxa"/>
+          </w:tcPr>
+          <w:p>
+            <w:pPr>
+              <w:keepNext/>
+              <w:spacing w:before="40" w:after="40" w:line="240" w:lineRule="auto"/>
+              <w:ind w:firstLine="0"/>
+              <w:jc w:val="left"/>
+            </w:pPr>
+            <w:r>
+              <w:t>Static images only; kept for the command line</w:t>
+            </w:r>
+          </w:p>
+        </w:tc>
+      </w:tr>
+      <w:tr>
+        <w:trPr>
+          <w:cantSplit/>
+          <w:jc w:val="center"/>
+        </w:trPr>
+        <w:tc>
+          <w:tcPr>
+            <w:tcW w:w="1700" w:type="dxa"/>
+          </w:tcPr>
+          <w:p>
+            <w:pPr>
+              <w:keepNext/>
+              <w:spacing w:before="40" w:after="40" w:line="240" w:lineRule="auto"/>
+              <w:ind w:firstLine="0"/>
+              <w:jc w:val="left"/>
+            </w:pPr>
+            <w:r>
+              <w:t>Data source</w:t>
+            </w:r>
+          </w:p>
+        </w:tc>
+        <w:tc>
+          <w:tcPr>
+            <w:tcW w:w="2300" w:type="dxa"/>
+          </w:tcPr>
+          <w:p>
+            <w:pPr>
+              <w:keepNext/>
+              <w:spacing w:before="40" w:after="40" w:line="240" w:lineRule="auto"/>
+              <w:ind w:firstLine="0"/>
+              <w:jc w:val="left"/>
+            </w:pPr>
+            <w:r>
+              <w:t>Open-Meteo (chosen)</w:t>
+            </w:r>
+          </w:p>
+        </w:tc>
+        <w:tc>
+          <w:tcPr>
+            <w:tcW w:w="5354" w:type="dxa"/>
+          </w:tcPr>
+          <w:p>
+            <w:pPr>
+              <w:keepNext/>
+              <w:spacing w:before="40" w:after="40" w:line="240" w:lineRule="auto"/>
+              <w:ind w:firstLine="0"/>
+              <w:jc w:val="left"/>
+            </w:pPr>
+            <w:r>
+              <w:t>Free, no API key, any coordinates, continuous daily data; a model grid cell, not a station</w:t>
+            </w:r>
+          </w:p>
+        </w:tc>
+      </w:tr>
+      <w:tr>
+        <w:trPr>
+          <w:cantSplit/>
+          <w:jc w:val="center"/>
+        </w:trPr>
+        <w:tc>
+          <w:tcPr>
+            <w:tcW w:w="1700" w:type="dxa"/>
+          </w:tcPr>
+          <w:p>
+            <w:pPr>
+              <w:keepNext/>
+              <w:spacing w:before="40" w:after="40" w:line="240" w:lineRule="auto"/>
+              <w:ind w:firstLine="0"/>
+              <w:jc w:val="left"/>
+            </w:pPr>
+            <w:r>
+              <w:t/>
+            </w:r>
+          </w:p>
+        </w:tc>
+        <w:tc>
+          <w:tcPr>
+            <w:tcW w:w="2300" w:type="dxa"/>
+          </w:tcPr>
+          <w:p>
+            <w:pPr>
+              <w:keepNext/>
+              <w:spacing w:before="40" w:after="40" w:line="240" w:lineRule="auto"/>
+              <w:ind w:firstLine="0"/>
+              <w:jc w:val="left"/>
+            </w:pPr>
+            <w:r>
+              <w:t>Meteostat</w:t>
+            </w:r>
+          </w:p>
+        </w:tc>
+        <w:tc>
+          <w:tcPr>
+            <w:tcW w:w="5354" w:type="dxa"/>
+          </w:tcPr>
+          <w:p>
+            <w:pPr>
+              <w:keepNext/>
+              <w:spacing w:before="40" w:after="40" w:line="240" w:lineRule="auto"/>
+              <w:ind w:firstLine="0"/>
+              <w:jc w:val="left"/>
+            </w:pPr>
+            <w:r>
+              <w:t>Real station data, but with gaps</w:t>
+            </w:r>
+          </w:p>
+        </w:tc>
+      </w:tr>
+      <w:tr>
+        <w:trPr>
+          <w:cantSplit/>
+          <w:jc w:val="center"/>
+        </w:trPr>
+        <w:tc>
+          <w:tcPr>
+            <w:tcW w:w="1700" w:type="dxa"/>
+          </w:tcPr>
+          <w:p>
+            <w:pPr>
+              <w:keepNext/>
+              <w:spacing w:before="40" w:after="40" w:line="240" w:lineRule="auto"/>
+              <w:ind w:firstLine="0"/>
+              <w:jc w:val="left"/>
+            </w:pPr>
+            <w:r>
+              <w:t/>
+            </w:r>
+          </w:p>
+        </w:tc>
+        <w:tc>
+          <w:tcPr>
+            <w:tcW w:w="2300" w:type="dxa"/>
+          </w:tcPr>
+          <w:p>
+            <w:pPr>
+              <w:keepNext/>
+              <w:spacing w:before="40" w:after="40" w:line="240" w:lineRule="auto"/>
+              <w:ind w:firstLine="0"/>
+              <w:jc w:val="left"/>
+            </w:pPr>
+            <w:r>
+              <w:t>NOAA GHCN-Daily</w:t>
+            </w:r>
+          </w:p>
+        </w:tc>
+        <w:tc>
+          <w:tcPr>
+            <w:tcW w:w="5354" w:type="dxa"/>
+          </w:tcPr>
+          <w:p>
+            <w:pPr>
+              <w:keepNext/>
+              <w:spacing w:before="40" w:after="40" w:line="240" w:lineRule="auto"/>
+              <w:ind w:firstLine="0"/>
+              <w:jc w:val="left"/>
+            </w:pPr>
+            <w:r>
+              <w:t>Authoritative, but large station-specific files</w:t>
+            </w:r>
+          </w:p>
+        </w:tc>
+      </w:tr>
+      <w:tr>
+        <w:trPr>
+          <w:cantSplit/>
+          <w:jc w:val="center"/>
+        </w:trPr>
+        <w:tc>
+          <w:tcPr>
+            <w:tcW w:w="1700" w:type="dxa"/>
+          </w:tcPr>
+          <w:p>
+            <w:pPr>
+              <w:keepNext/>
+              <w:spacing w:before="40" w:after="40" w:line="240" w:lineRule="auto"/>
+              <w:ind w:firstLine="0"/>
+              <w:jc w:val="left"/>
+            </w:pPr>
+            <w:r>
+              <w:t/>
+            </w:r>
+          </w:p>
+        </w:tc>
+        <w:tc>
+          <w:tcPr>
+            <w:tcW w:w="2300" w:type="dxa"/>
+          </w:tcPr>
+          <w:p>
+            <w:pPr>
+              <w:keepNext/>
+              <w:spacing w:before="40" w:after="40" w:line="240" w:lineRule="auto"/>
+              <w:ind w:firstLine="0"/>
+              <w:jc w:val="left"/>
+            </w:pPr>
+            <w:r>
+              <w:t>Kazhydromet</w:t>
+            </w:r>
+          </w:p>
+        </w:tc>
+        <w:tc>
+          <w:tcPr>
+            <w:tcW w:w="5354" w:type="dxa"/>
+          </w:tcPr>
+          <w:p>
+            <w:pPr>
+              <w:keepNext/>
+              <w:spacing w:before="40" w:after="40" w:line="240" w:lineRule="auto"/>
+              <w:ind w:firstLine="0"/>
+              <w:jc w:val="left"/>
+            </w:pPr>
+            <w:r>
+              <w:t>Official source, but no open machine-readable API</w:t>
+            </w:r>
+          </w:p>
+        </w:tc>
+      </w:tr>
+      <w:tr>
+        <w:trPr>
+          <w:cantSplit/>
+          <w:jc w:val="center"/>
+        </w:trPr>
+        <w:tc>
+          <w:tcPr>
+            <w:tcW w:w="1700" w:type="dxa"/>
+          </w:tcPr>
+          <w:p>
+            <w:pPr>
+              <w:keepNext/>
+              <w:spacing w:before="40" w:after="40" w:line="240" w:lineRule="auto"/>
+              <w:ind w:firstLine="0"/>
+              <w:jc w:val="left"/>
+            </w:pPr>
+            <w:r>
+              <w:t>CI/CD</w:t>
+            </w:r>
+          </w:p>
+        </w:tc>
+        <w:tc>
+          <w:tcPr>
+            <w:tcW w:w="2300" w:type="dxa"/>
+          </w:tcPr>
+          <w:p>
+            <w:pPr>
+              <w:keepNext/>
+              <w:spacing w:before="40" w:after="40" w:line="240" w:lineRule="auto"/>
+              <w:ind w:firstLine="0"/>
+              <w:jc w:val="left"/>
+            </w:pPr>
+            <w:r>
+              <w:t>GitHub Actions (chosen)</w:t>
+            </w:r>
+          </w:p>
+        </w:tc>
+        <w:tc>
+          <w:tcPr>
+            <w:tcW w:w="5354" w:type="dxa"/>
+          </w:tcPr>
+          <w:p>
+            <w:pPr>
+              <w:keepNext/>
+              <w:spacing w:before="40" w:after="40" w:line="240" w:lineRule="auto"/>
+              <w:ind w:firstLine="0"/>
+              <w:jc w:val="left"/>
+            </w:pPr>
+            <w:r>
+              <w:t>Built into GitHub, free for public repositories, Linux, Windows and macOS</w:t>
+            </w:r>
+          </w:p>
+        </w:tc>
+      </w:tr>
+      <w:tr>
+        <w:trPr>
+          <w:cantSplit/>
+          <w:jc w:val="center"/>
+        </w:trPr>
+        <w:tc>
+          <w:tcPr>
+            <w:tcW w:w="1700" w:type="dxa"/>
+          </w:tcPr>
+          <w:p>
+            <w:pPr>
+              <w:keepNext/>
+              <w:spacing w:before="40" w:after="40" w:line="240" w:lineRule="auto"/>
+              <w:ind w:firstLine="0"/>
+              <w:jc w:val="left"/>
+            </w:pPr>
+            <w:r>
+              <w:t/>
+            </w:r>
+          </w:p>
+        </w:tc>
+        <w:tc>
+          <w:tcPr>
+            <w:tcW w:w="2300" w:type="dxa"/>
+          </w:tcPr>
+          <w:p>
+            <w:pPr>
+              <w:keepNext/>
+              <w:spacing w:before="40" w:after="40" w:line="240" w:lineRule="auto"/>
+              <w:ind w:firstLine="0"/>
+              <w:jc w:val="left"/>
+            </w:pPr>
+            <w:r>
+              <w:t>GitLab CI</w:t>
+            </w:r>
+          </w:p>
+        </w:tc>
+        <w:tc>
+          <w:tcPr>
+            <w:tcW w:w="5354" w:type="dxa"/>
+          </w:tcPr>
+          <w:p>
+            <w:pPr>
+              <w:keepNext/>
+              <w:spacing w:before="40" w:after="40" w:line="240" w:lineRule="auto"/>
+              <w:ind w:firstLine="0"/>
+              <w:jc w:val="left"/>
+            </w:pPr>
+            <w:r>
+              <w:t>Would need a GitLab mirror of the repository</w:t>
+            </w:r>
+          </w:p>
+        </w:tc>
+      </w:tr>
+      <w:tr>
+        <w:trPr>
+          <w:cantSplit/>
+          <w:jc w:val="center"/>
+        </w:trPr>
+        <w:tc>
+          <w:tcPr>
+            <w:tcW w:w="1700" w:type="dxa"/>
+          </w:tcPr>
+          <w:p>
+            <w:pPr>
+              <w:keepNext/>
+              <w:spacing w:before="40" w:after="40" w:line="240" w:lineRule="auto"/>
+              <w:ind w:firstLine="0"/>
+              <w:jc w:val="left"/>
+            </w:pPr>
+            <w:r>
+              <w:t/>
+            </w:r>
+          </w:p>
+        </w:tc>
+        <w:tc>
+          <w:tcPr>
+            <w:tcW w:w="2300" w:type="dxa"/>
+          </w:tcPr>
+          <w:p>
+            <w:pPr>
+              <w:keepNext/>
+              <w:spacing w:before="40" w:after="40" w:line="240" w:lineRule="auto"/>
+              <w:ind w:firstLine="0"/>
+              <w:jc w:val="left"/>
+            </w:pPr>
+            <w:r>
+              <w:t>Jenkins</w:t>
+            </w:r>
+          </w:p>
+        </w:tc>
+        <w:tc>
+          <w:tcPr>
+            <w:tcW w:w="5354" w:type="dxa"/>
+          </w:tcPr>
+          <w:p>
+            <w:pPr>
+              <w:keepNext/>
+              <w:spacing w:before="40" w:after="40" w:line="240" w:lineRule="auto"/>
+              <w:ind w:firstLine="0"/>
+              <w:jc w:val="left"/>
+            </w:pPr>
+            <w:r>
+              <w:t>Needs its own server to maintain</w:t>
+            </w:r>
+          </w:p>
+        </w:tc>
+      </w:tr>
+      <w:tr>
+        <w:trPr>
+          <w:cantSplit/>
+          <w:jc w:val="center"/>
+        </w:trPr>
+        <w:tc>
+          <w:tcPr>
+            <w:tcW w:w="1700" w:type="dxa"/>
+          </w:tcPr>
+          <w:p>
+            <w:pPr>
+              <w:keepNext/>
+              <w:spacing w:before="40" w:after="40" w:line="240" w:lineRule="auto"/>
+              <w:ind w:firstLine="0"/>
+              <w:jc w:val="left"/>
+            </w:pPr>
+            <w:r>
+              <w:t>Forecast model</w:t>
+            </w:r>
+          </w:p>
+        </w:tc>
+        <w:tc>
+          <w:tcPr>
+            <w:tcW w:w="2300" w:type="dxa"/>
+          </w:tcPr>
+          <w:p>
+            <w:pPr>
+              <w:keepNext/>
+              <w:spacing w:before="40" w:after="40" w:line="240" w:lineRule="auto"/>
+              <w:ind w:firstLine="0"/>
+              <w:jc w:val="left"/>
+            </w:pPr>
+            <w:r>
+              <w:t>Trend + harmonics + AR(1) (chosen)</w:t>
+            </w:r>
+          </w:p>
+        </w:tc>
+        <w:tc>
+          <w:tcPr>
+            <w:tcW w:w="5354" w:type="dxa"/>
+          </w:tcPr>
+          <w:p>
+            <w:pPr>
+              <w:keepNext/>
+              <w:spacing w:before="40" w:after="40" w:line="240" w:lineRule="auto"/>
+              <w:ind w:firstLine="0"/>
+              <w:jc w:val="left"/>
+            </w:pPr>
+            <w:r>
+              <w:t>Transparent, about 150 lines, validated against a baseline</w:t>
+            </w:r>
+          </w:p>
+        </w:tc>
+      </w:tr>
+      <w:tr>
+        <w:trPr>
+          <w:cantSplit/>
+          <w:jc w:val="center"/>
+        </w:trPr>
+        <w:tc>
+          <w:tcPr>
+            <w:tcW w:w="1700" w:type="dxa"/>
+          </w:tcPr>
+          <w:p>
+            <w:pPr>
+              <w:keepNext/>
+              <w:spacing w:before="40" w:after="40" w:line="240" w:lineRule="auto"/>
+              <w:ind w:firstLine="0"/>
+              <w:jc w:val="left"/>
+            </w:pPr>
+            <w:r>
+              <w:t/>
+            </w:r>
+          </w:p>
+        </w:tc>
+        <w:tc>
+          <w:tcPr>
+            <w:tcW w:w="2300" w:type="dxa"/>
+          </w:tcPr>
+          <w:p>
+            <w:pPr>
+              <w:keepNext/>
+              <w:spacing w:before="40" w:after="40" w:line="240" w:lineRule="auto"/>
+              <w:ind w:firstLine="0"/>
+              <w:jc w:val="left"/>
+            </w:pPr>
+            <w:r>
+              <w:t>statsmodels (ARIMA)</w:t>
+            </w:r>
+          </w:p>
+        </w:tc>
+        <w:tc>
+          <w:tcPr>
+            <w:tcW w:w="5354" w:type="dxa"/>
+          </w:tcPr>
+          <w:p>
+            <w:pPr>
+              <w:keepNext/>
+              <w:spacing w:before="40" w:after="40" w:line="240" w:lineRule="auto"/>
+              <w:ind w:firstLine="0"/>
+              <w:jc w:val="left"/>
+            </w:pPr>
+            <w:r>
+              <w:t>Heavy dependency for what a short tested model does</w:t>
+            </w:r>
+          </w:p>
+        </w:tc>
+      </w:tr>
+      <w:tr>
+        <w:trPr>
+          <w:cantSplit/>
+          <w:jc w:val="center"/>
+        </w:trPr>
+        <w:tc>
+          <w:tcPr>
+            <w:tcW w:w="1700" w:type="dxa"/>
+          </w:tcPr>
+          <w:p>
+            <w:pPr>
+              <w:keepNext/>
+              <w:spacing w:before="40" w:after="40" w:line="240" w:lineRule="auto"/>
+              <w:ind w:firstLine="0"/>
+              <w:jc w:val="left"/>
+            </w:pPr>
+            <w:r>
+              <w:t/>
+            </w:r>
+          </w:p>
+        </w:tc>
+        <w:tc>
+          <w:tcPr>
+            <w:tcW w:w="2300" w:type="dxa"/>
+          </w:tcPr>
+          <w:p>
+            <w:pPr>
+              <w:keepNext/>
+              <w:spacing w:before="40" w:after="40" w:line="240" w:lineRule="auto"/>
+              <w:ind w:firstLine="0"/>
+              <w:jc w:val="left"/>
+            </w:pPr>
+            <w:r>
+              <w:t>Neural network</w:t>
+            </w:r>
+          </w:p>
+        </w:tc>
+        <w:tc>
+          <w:tcPr>
+            <w:tcW w:w="5354" w:type="dxa"/>
+          </w:tcPr>
+          <w:p>
+            <w:pPr>
+              <w:keepNext/>
+              <w:spacing w:before="40" w:after="40" w:line="240" w:lineRule="auto"/>
+              <w:ind w:firstLine="0"/>
+              <w:jc w:val="left"/>
+            </w:pPr>
+            <w:r>
+              <w:t>About 360 monthly points are far too few</w:t>
+            </w:r>
+          </w:p>
+        </w:tc>
+      </w:tr>
+    </w:tbl>
+    <w:p>
+      <w:r>
+        <w:br w:type="page"/>
+      </w:r>
     </w:p>
     <w:p>
       <w:r>
@@ -2019,7 +5514,7 @@
         <w:t>distributed</w:t>
       </w:r>
       <w:r>
-        <w:t xml:space="preserve"> systems such as Git and Mercurial every clone contains the complete history; commits, branches and comparisons are local and fast, and any clone can restore the project [3]. Table 3 compares the three best-known open-source systems.</w:t>
+        <w:t xml:space="preserve"> systems such as Git and Mercurial every clone contains the complete history; commits, branches and comparisons are local and fast, and any clone can restore the project [3]. Table 7 compares the three best-known open-source systems.</w:t>
       </w:r>
     </w:p>
     <w:p>
@@ -2030,7 +5525,7 @@
         <w:jc w:val="left"/>
       </w:pPr>
       <w:r>
-        <w:t>Table 3 – Comparison of version control systems</w:t>
+        <w:t>Table 7 – Comparison of version control systems</w:t>
       </w:r>
     </w:p>
     <w:tbl>
@@ -2713,7 +6208,7 @@
         <w:t>runners</w:t>
       </w:r>
       <w:r>
-        <w:t>. Because the configuration lives in the repository, the pipeline is versioned and reviewed together with the code. The project has three workflows (Table 4).</w:t>
+        <w:t>. Because the configuration lives in the repository, the pipeline is versioned and reviewed together with the code. The project has three workflows (Table 8).</w:t>
       </w:r>
     </w:p>
     <w:p>
@@ -2724,7 +6219,7 @@
         <w:jc w:val="left"/>
       </w:pPr>
       <w:r>
-        <w:t>Table 4 – GitHub Actions workflows of the project</w:t>
+        <w:t>Table 8 – GitHub Actions workflows of the project</w:t>
       </w:r>
     </w:p>
     <w:tbl>
@@ -3012,7 +6507,7 @@
         <w:t>least-privilege permissions</w:t>
       </w:r>
       <w:r>
-        <w:t xml:space="preserve"> give the CI token read-only access. Figure 1 shows run #11 on the main branch (commit dcbbb30): all nine jobs finished successfully in 2 minutes 57 seconds.</w:t>
+        <w:t xml:space="preserve"> give the CI token read-only access. Figure 3 shows run #11 on the main branch (commit dcbbb30): all nine jobs finished successfully in 2 minutes 57 seconds.</w:t>
       </w:r>
     </w:p>
     <w:p>
@@ -3070,7 +6565,7 @@
         <w:jc w:val="center"/>
       </w:pPr>
       <w:r>
-        <w:t>Figure 1 – Successful run #11 of the CI workflow on the main branch</w:t>
+        <w:t>Figure 3 – Successful run #11 of the CI workflow on the main branch</w:t>
       </w:r>
     </w:p>
     <w:p>
@@ -3167,7 +6662,7 @@
     </w:p>
     <w:p>
       <w:r>
-        <w:t>The tool was run on 11 688 daily values for 1 January 1994 – 31 December 2025, downloaded without gaps from the Open-Meteo archive [10]. By default the archive combines the ERA5 and ERA5-Land reanalyses [11] (used here up to 2016) with the operational ECMWF IFS model (from 2017), and it describes a model grid cell near 51.1° N, 71.4° E rather than one weather station. The whole-record means — −14.4 °C in January, +20.6 °C in July — agree with the published 1991–2020 station normals of −14.5 and +20.6 °C [13]. Table 5 gives the main results.</w:t>
+        <w:t>The tool was run on 11 688 daily values for 1 January 1994 – 31 December 2025, downloaded without gaps from the Open-Meteo archive [10]. By default the archive combines the ERA5 and ERA5-Land reanalyses [11] (used here up to 2016) with the operational ECMWF IFS model (from 2017), and it describes a model grid cell near 51.1° N, 71.4° E rather than one weather station. The whole-record means — −14.4 °C in January, +20.6 °C in July — agree with the published 1991–2020 station normals of −14.5 and +20.6 °C [13]. Table 9 gives the main results.</w:t>
       </w:r>
     </w:p>
     <w:p>
@@ -3178,7 +6673,7 @@
         <w:jc w:val="left"/>
       </w:pPr>
       <w:r>
-        <w:t>Table 5 – Analysis of Astana air temperature, 1994–2025</w:t>
+        <w:t>Table 9 – Analysis of Astana air temperature, 1994–2025</w:t>
       </w:r>
     </w:p>
     <w:tbl>
@@ -3569,7 +7064,7 @@
     </w:p>
     <w:p>
       <w:r>
-        <w:t xml:space="preserve">The annual mean temperature rose by +0.35 °C per decade (Figure 2). This is of the same order as the 0.33 °C per decade that Kazhydromet reports for the Akmola region over the longer period 1976–2023 [14] (the equal value built into the synthetic sample is a coincidence). The result shows why two tests are reported. Least squares gives p = 0.040, formally below 0.05, but the more cautious Mann–Kendall test gives p = 0.089: the least-squares slope is pulled up by the very cold 1996 at the start of the record, and without that single year it falls to +0.23 °C per decade (p = 0.14). The tool therefore reports the trend as </w:t>
+        <w:t xml:space="preserve">The annual mean temperature rose by +0.35 °C per decade (Figure 4). This is of the same order as the 0.33 °C per decade that Kazhydromet reports for the Akmola region over the longer period 1976–2023 [14] (the equal value built into the synthetic sample is a coincidence). The result shows why two tests are reported. Least squares gives p = 0.040, formally below 0.05, but the more cautious Mann–Kendall test gives p = 0.089: the least-squares slope is pulled up by the very cold 1996 at the start of the record, and without that single year it falls to +0.23 °C per decade (p = 0.14). The tool therefore reports the trend as </w:t>
       </w:r>
       <w:r>
         <w:rPr>
@@ -3583,7 +7078,7 @@
     </w:p>
     <w:p>
       <w:r>
-        <w:t>The forecast model — a linear trend, two annual harmonics and first-order autoregressive residuals — explains 96 % of the variance of monthly temperature. In the backtest it was fitted on data up to December 2022 and compared with the next 36 months: its mean absolute error was 1.80 °C against 1.91 °C for climatology, and 97 % of the observations fell inside the 95 % interval (Figure 3). The gain of 6 % is modest, and the README states the reason: a statistical model cannot predict individual weather events months ahead. An out-of-sample check is already possible: against Open-Meteo values for January–September 2026, retrieved separately on 6 October 2026, all nine months fell inside the forecast interval, with a mean absolute error of 2.05 °C against 2.28 °C for climatology. For precipitation the same model explains only 25 % of the variance. The apparent increase of annual totals is not significant (Mann–Kendall p = 0.19) and is inflated by the 2017 change of the underlying model, so it is not interpreted as a climate signal. For temperature the change matters little: ERA5-Land alone gives +0.34 °C per decade (Mann–Kendall p = 0.10), so the cautious verdict does not depend on it.</w:t>
+        <w:t>The forecast model — a linear trend, two annual harmonics and first-order autoregressive residuals — explains 96 % of the variance of monthly temperature. In the backtest it was fitted on data up to December 2022 and compared with the next 36 months: its mean absolute error was 1.80 °C against 1.91 °C for climatology, and 97 % of the observations fell inside the 95 % interval (Figure 5). The gain of 6 % is modest, and the README states the reason: a statistical model cannot predict individual weather events months ahead. An out-of-sample check is already possible: against Open-Meteo values for January–September 2026, retrieved separately on 6 October 2026, all nine months fell inside the forecast interval, with a mean absolute error of 2.05 °C against 2.28 °C for climatology. For precipitation the same model explains only 25 % of the variance. The apparent increase of annual totals is not significant (Mann–Kendall p = 0.19) and is inflated by the 2017 change of the underlying model, so it is not interpreted as a climate signal. For temperature the change matters little: ERA5-Land alone gives +0.34 °C per decade (Mann–Kendall p = 0.10), so the cautious verdict does not depend on it.</w:t>
       </w:r>
     </w:p>
     <w:p>
@@ -3641,7 +7136,7 @@
         <w:jc w:val="center"/>
       </w:pPr>
       <w:r>
-        <w:t>Figure 2 – Daily temperature of Astana and the trend of annual means (real data, 1994–2025)</w:t>
+        <w:t>Figure 4 – Daily temperature of Astana and the trend of annual means (real data, 1994–2025)</w:t>
       </w:r>
     </w:p>
     <w:p>
@@ -3704,7 +7199,7 @@
         <w:jc w:val="center"/>
       </w:pPr>
       <w:r>
-        <w:t>Figure 3 – Backtest and 24-month forecast of monthly mean temperature with the 95 % prediction interval</w:t>
+        <w:t>Figure 5 – Backtest and 24-month forecast of monthly mean temperature with the 95 % prediction interval</w:t>
       </w:r>
     </w:p>
     <w:p>
@@ -3719,7 +7214,7 @@
     </w:p>
     <w:p>
       <w:r>
-        <w:t>All materials of the project are public (Table 6). In the PDF every entry is a link; file paths are relative to the main branch of the repository.</w:t>
+        <w:t>All materials of the project are public (Table 10). In the PDF every entry is a link; file paths are relative to the main branch of the repository.</w:t>
       </w:r>
     </w:p>
     <w:p>
@@ -3730,7 +7225,7 @@
         <w:jc w:val="left"/>
       </w:pPr>
       <w:r>
-        <w:t>Table 6 – Project links</w:t>
+        <w:t>Table 10 – Project links</w:t>
       </w:r>
     </w:p>
     <w:tbl>

</xml_diff>